<commit_message>
Refactor input fields in historico.js to use text inputs for grades and replace series/ano input with a dropdown selection
</commit_message>
<xml_diff>
--- a/modelos/HISTÓRICO ESCOLAR.docx
+++ b/modelos/HISTÓRICO ESCOLAR.docx
@@ -696,25 +696,7 @@
                 <w:sz w:val="24"/>
                 <w:szCs w:val="24"/>
               </w:rPr>
-              <w:t>{</w:t>
-            </w:r>
-            <w:proofErr w:type="spellStart"/>
-            <w:r>
-              <w:rPr>
-                <w:rFonts w:ascii="Arial" w:hAnsi="Arial" w:cs="Arial"/>
-                <w:sz w:val="24"/>
-                <w:szCs w:val="24"/>
-              </w:rPr>
-              <w:t>nomeAluno</w:t>
-            </w:r>
-            <w:proofErr w:type="spellEnd"/>
-            <w:r>
-              <w:rPr>
-                <w:rFonts w:ascii="Arial" w:hAnsi="Arial" w:cs="Arial"/>
-                <w:sz w:val="24"/>
-                <w:szCs w:val="24"/>
-              </w:rPr>
-              <w:t>}</w:t>
+              <w:t>{nomeAluno}</w:t>
             </w:r>
           </w:p>
         </w:tc>
@@ -765,25 +747,7 @@
                 <w:sz w:val="24"/>
                 <w:szCs w:val="24"/>
               </w:rPr>
-              <w:t>{</w:t>
-            </w:r>
-            <w:proofErr w:type="spellStart"/>
-            <w:r>
-              <w:rPr>
-                <w:rFonts w:ascii="Arial" w:hAnsi="Arial" w:cs="Arial"/>
-                <w:sz w:val="24"/>
-                <w:szCs w:val="24"/>
-              </w:rPr>
-              <w:t>raAluno</w:t>
-            </w:r>
-            <w:proofErr w:type="spellEnd"/>
-            <w:r>
-              <w:rPr>
-                <w:rFonts w:ascii="Arial" w:hAnsi="Arial" w:cs="Arial"/>
-                <w:sz w:val="24"/>
-                <w:szCs w:val="24"/>
-              </w:rPr>
-              <w:t>}</w:t>
+              <w:t>{raAluno}</w:t>
             </w:r>
           </w:p>
         </w:tc>
@@ -868,25 +832,7 @@
                 <w:sz w:val="24"/>
                 <w:szCs w:val="24"/>
               </w:rPr>
-              <w:t>{</w:t>
-            </w:r>
-            <w:proofErr w:type="spellStart"/>
-            <w:r>
-              <w:rPr>
-                <w:rFonts w:ascii="Arial" w:hAnsi="Arial" w:cs="Arial"/>
-                <w:sz w:val="24"/>
-                <w:szCs w:val="24"/>
-              </w:rPr>
-              <w:t>municipioNascimento</w:t>
-            </w:r>
-            <w:proofErr w:type="spellEnd"/>
-            <w:r>
-              <w:rPr>
-                <w:rFonts w:ascii="Arial" w:hAnsi="Arial" w:cs="Arial"/>
-                <w:sz w:val="24"/>
-                <w:szCs w:val="24"/>
-              </w:rPr>
-              <w:t>}</w:t>
+              <w:t>{municipioNascimento}</w:t>
             </w:r>
           </w:p>
         </w:tc>
@@ -937,25 +883,7 @@
                 <w:sz w:val="24"/>
                 <w:szCs w:val="24"/>
               </w:rPr>
-              <w:t>{</w:t>
-            </w:r>
-            <w:proofErr w:type="spellStart"/>
-            <w:r>
-              <w:rPr>
-                <w:rFonts w:ascii="Arial" w:hAnsi="Arial" w:cs="Arial"/>
-                <w:sz w:val="24"/>
-                <w:szCs w:val="24"/>
-              </w:rPr>
-              <w:t>ufNascimento</w:t>
-            </w:r>
-            <w:proofErr w:type="spellEnd"/>
-            <w:r>
-              <w:rPr>
-                <w:rFonts w:ascii="Arial" w:hAnsi="Arial" w:cs="Arial"/>
-                <w:sz w:val="24"/>
-                <w:szCs w:val="24"/>
-              </w:rPr>
-              <w:t>}</w:t>
+              <w:t>{ufNascimento}</w:t>
             </w:r>
           </w:p>
         </w:tc>
@@ -1033,25 +961,7 @@
                 <w:sz w:val="24"/>
                 <w:szCs w:val="24"/>
               </w:rPr>
-              <w:t>{</w:t>
-            </w:r>
-            <w:proofErr w:type="spellStart"/>
-            <w:r>
-              <w:rPr>
-                <w:rFonts w:ascii="Arial" w:hAnsi="Arial" w:cs="Arial"/>
-                <w:sz w:val="24"/>
-                <w:szCs w:val="24"/>
-              </w:rPr>
-              <w:t>dataNascimento</w:t>
-            </w:r>
-            <w:proofErr w:type="spellEnd"/>
-            <w:r>
-              <w:rPr>
-                <w:rFonts w:ascii="Arial" w:hAnsi="Arial" w:cs="Arial"/>
-                <w:sz w:val="24"/>
-                <w:szCs w:val="24"/>
-              </w:rPr>
-              <w:t>}</w:t>
+              <w:t>{dataNascimento}</w:t>
             </w:r>
           </w:p>
         </w:tc>
@@ -1641,29 +1551,7 @@
                 <w:szCs w:val="24"/>
                 <w:u w:val="single"/>
               </w:rPr>
-              <w:t>{al</w:t>
-            </w:r>
-            <w:r>
-              <w:rPr>
-                <w:rFonts w:ascii="Arial" w:hAnsi="Arial" w:cs="Arial"/>
-                <w:b/>
-                <w:bCs/>
-                <w:sz w:val="24"/>
-                <w:szCs w:val="24"/>
-                <w:u w:val="single"/>
-              </w:rPr>
-              <w:t>2</w:t>
-            </w:r>
-            <w:r>
-              <w:rPr>
-                <w:rFonts w:ascii="Arial" w:hAnsi="Arial" w:cs="Arial"/>
-                <w:b/>
-                <w:bCs/>
-                <w:sz w:val="24"/>
-                <w:szCs w:val="24"/>
-                <w:u w:val="single"/>
-              </w:rPr>
-              <w:t>}</w:t>
+              <w:t>{al2}</w:t>
             </w:r>
           </w:p>
         </w:tc>
@@ -2140,29 +2028,7 @@
                 <w:szCs w:val="24"/>
                 <w:u w:val="single"/>
               </w:rPr>
-              <w:t>{lpAl</w:t>
-            </w:r>
-            <w:r>
-              <w:rPr>
-                <w:rFonts w:ascii="Arial" w:hAnsi="Arial" w:cs="Arial"/>
-                <w:b/>
-                <w:bCs/>
-                <w:sz w:val="24"/>
-                <w:szCs w:val="24"/>
-                <w:u w:val="single"/>
-              </w:rPr>
-              <w:t>2</w:t>
-            </w:r>
-            <w:r>
-              <w:rPr>
-                <w:rFonts w:ascii="Arial" w:hAnsi="Arial" w:cs="Arial"/>
-                <w:b/>
-                <w:bCs/>
-                <w:sz w:val="24"/>
-                <w:szCs w:val="24"/>
-                <w:u w:val="single"/>
-              </w:rPr>
-              <w:t>}</w:t>
+              <w:t>{lpAl2}</w:t>
             </w:r>
           </w:p>
         </w:tc>
@@ -2192,29 +2058,7 @@
                 <w:szCs w:val="24"/>
                 <w:u w:val="single"/>
               </w:rPr>
-              <w:t>{lpAl</w:t>
-            </w:r>
-            <w:r>
-              <w:rPr>
-                <w:rFonts w:ascii="Arial" w:hAnsi="Arial" w:cs="Arial"/>
-                <w:b/>
-                <w:bCs/>
-                <w:sz w:val="24"/>
-                <w:szCs w:val="24"/>
-                <w:u w:val="single"/>
-              </w:rPr>
-              <w:t>2</w:t>
-            </w:r>
-            <w:r>
-              <w:rPr>
-                <w:rFonts w:ascii="Arial" w:hAnsi="Arial" w:cs="Arial"/>
-                <w:b/>
-                <w:bCs/>
-                <w:sz w:val="24"/>
-                <w:szCs w:val="24"/>
-                <w:u w:val="single"/>
-              </w:rPr>
-              <w:t>}</w:t>
+              <w:t>{lpAl2}</w:t>
             </w:r>
           </w:p>
         </w:tc>
@@ -2244,29 +2088,7 @@
                 <w:szCs w:val="24"/>
                 <w:u w:val="single"/>
               </w:rPr>
-              <w:t>{lpAl</w:t>
-            </w:r>
-            <w:r>
-              <w:rPr>
-                <w:rFonts w:ascii="Arial" w:hAnsi="Arial" w:cs="Arial"/>
-                <w:b/>
-                <w:bCs/>
-                <w:sz w:val="24"/>
-                <w:szCs w:val="24"/>
-                <w:u w:val="single"/>
-              </w:rPr>
-              <w:t>2</w:t>
-            </w:r>
-            <w:r>
-              <w:rPr>
-                <w:rFonts w:ascii="Arial" w:hAnsi="Arial" w:cs="Arial"/>
-                <w:b/>
-                <w:bCs/>
-                <w:sz w:val="24"/>
-                <w:szCs w:val="24"/>
-                <w:u w:val="single"/>
-              </w:rPr>
-              <w:t>}</w:t>
+              <w:t>{lpAl2}</w:t>
             </w:r>
           </w:p>
         </w:tc>
@@ -2296,29 +2118,7 @@
                 <w:szCs w:val="24"/>
                 <w:u w:val="single"/>
               </w:rPr>
-              <w:t>{lpAl</w:t>
-            </w:r>
-            <w:r>
-              <w:rPr>
-                <w:rFonts w:ascii="Arial" w:hAnsi="Arial" w:cs="Arial"/>
-                <w:b/>
-                <w:bCs/>
-                <w:sz w:val="24"/>
-                <w:szCs w:val="24"/>
-                <w:u w:val="single"/>
-              </w:rPr>
-              <w:t>2</w:t>
-            </w:r>
-            <w:r>
-              <w:rPr>
-                <w:rFonts w:ascii="Arial" w:hAnsi="Arial" w:cs="Arial"/>
-                <w:b/>
-                <w:bCs/>
-                <w:sz w:val="24"/>
-                <w:szCs w:val="24"/>
-                <w:u w:val="single"/>
-              </w:rPr>
-              <w:t>}</w:t>
+              <w:t>{lpAl2}</w:t>
             </w:r>
           </w:p>
         </w:tc>
@@ -2461,29 +2261,7 @@
                 <w:szCs w:val="24"/>
                 <w:u w:val="single"/>
               </w:rPr>
-              <w:t>{aAl</w:t>
-            </w:r>
-            <w:r>
-              <w:rPr>
-                <w:rFonts w:ascii="Arial" w:hAnsi="Arial" w:cs="Arial"/>
-                <w:b/>
-                <w:bCs/>
-                <w:sz w:val="24"/>
-                <w:szCs w:val="24"/>
-                <w:u w:val="single"/>
-              </w:rPr>
-              <w:t>2</w:t>
-            </w:r>
-            <w:r>
-              <w:rPr>
-                <w:rFonts w:ascii="Arial" w:hAnsi="Arial" w:cs="Arial"/>
-                <w:b/>
-                <w:bCs/>
-                <w:sz w:val="24"/>
-                <w:szCs w:val="24"/>
-                <w:u w:val="single"/>
-              </w:rPr>
-              <w:t>}</w:t>
+              <w:t>{aAl2}</w:t>
             </w:r>
           </w:p>
         </w:tc>
@@ -2513,29 +2291,7 @@
                 <w:szCs w:val="24"/>
                 <w:u w:val="single"/>
               </w:rPr>
-              <w:t>{aAl</w:t>
-            </w:r>
-            <w:r>
-              <w:rPr>
-                <w:rFonts w:ascii="Arial" w:hAnsi="Arial" w:cs="Arial"/>
-                <w:b/>
-                <w:bCs/>
-                <w:sz w:val="24"/>
-                <w:szCs w:val="24"/>
-                <w:u w:val="single"/>
-              </w:rPr>
-              <w:t>3</w:t>
-            </w:r>
-            <w:r>
-              <w:rPr>
-                <w:rFonts w:ascii="Arial" w:hAnsi="Arial" w:cs="Arial"/>
-                <w:b/>
-                <w:bCs/>
-                <w:sz w:val="24"/>
-                <w:szCs w:val="24"/>
-                <w:u w:val="single"/>
-              </w:rPr>
-              <w:t>}</w:t>
+              <w:t>{aAl3}</w:t>
             </w:r>
           </w:p>
         </w:tc>
@@ -2565,29 +2321,7 @@
                 <w:szCs w:val="24"/>
                 <w:u w:val="single"/>
               </w:rPr>
-              <w:t>{aAl</w:t>
-            </w:r>
-            <w:r>
-              <w:rPr>
-                <w:rFonts w:ascii="Arial" w:hAnsi="Arial" w:cs="Arial"/>
-                <w:b/>
-                <w:bCs/>
-                <w:sz w:val="24"/>
-                <w:szCs w:val="24"/>
-                <w:u w:val="single"/>
-              </w:rPr>
-              <w:t>4</w:t>
-            </w:r>
-            <w:r>
-              <w:rPr>
-                <w:rFonts w:ascii="Arial" w:hAnsi="Arial" w:cs="Arial"/>
-                <w:b/>
-                <w:bCs/>
-                <w:sz w:val="24"/>
-                <w:szCs w:val="24"/>
-                <w:u w:val="single"/>
-              </w:rPr>
-              <w:t>}</w:t>
+              <w:t>{aAl4}</w:t>
             </w:r>
           </w:p>
         </w:tc>
@@ -2617,29 +2351,7 @@
                 <w:szCs w:val="24"/>
                 <w:u w:val="single"/>
               </w:rPr>
-              <w:t>{aAl</w:t>
-            </w:r>
-            <w:r>
-              <w:rPr>
-                <w:rFonts w:ascii="Arial" w:hAnsi="Arial" w:cs="Arial"/>
-                <w:b/>
-                <w:bCs/>
-                <w:sz w:val="24"/>
-                <w:szCs w:val="24"/>
-                <w:u w:val="single"/>
-              </w:rPr>
-              <w:t>5</w:t>
-            </w:r>
-            <w:r>
-              <w:rPr>
-                <w:rFonts w:ascii="Arial" w:hAnsi="Arial" w:cs="Arial"/>
-                <w:b/>
-                <w:bCs/>
-                <w:sz w:val="24"/>
-                <w:szCs w:val="24"/>
-                <w:u w:val="single"/>
-              </w:rPr>
-              <w:t>}</w:t>
+              <w:t>{aAl5}</w:t>
             </w:r>
           </w:p>
         </w:tc>
@@ -2782,29 +2494,7 @@
                 <w:szCs w:val="24"/>
                 <w:u w:val="single"/>
               </w:rPr>
-              <w:t>{efAl</w:t>
-            </w:r>
-            <w:r>
-              <w:rPr>
-                <w:rFonts w:ascii="Arial" w:hAnsi="Arial" w:cs="Arial"/>
-                <w:b/>
-                <w:bCs/>
-                <w:sz w:val="24"/>
-                <w:szCs w:val="24"/>
-                <w:u w:val="single"/>
-              </w:rPr>
-              <w:t>2</w:t>
-            </w:r>
-            <w:r>
-              <w:rPr>
-                <w:rFonts w:ascii="Arial" w:hAnsi="Arial" w:cs="Arial"/>
-                <w:b/>
-                <w:bCs/>
-                <w:sz w:val="24"/>
-                <w:szCs w:val="24"/>
-                <w:u w:val="single"/>
-              </w:rPr>
-              <w:t>}</w:t>
+              <w:t>{efAl2}</w:t>
             </w:r>
           </w:p>
         </w:tc>
@@ -2834,29 +2524,7 @@
                 <w:szCs w:val="24"/>
                 <w:u w:val="single"/>
               </w:rPr>
-              <w:t>{efAl</w:t>
-            </w:r>
-            <w:r>
-              <w:rPr>
-                <w:rFonts w:ascii="Arial" w:hAnsi="Arial" w:cs="Arial"/>
-                <w:b/>
-                <w:bCs/>
-                <w:sz w:val="24"/>
-                <w:szCs w:val="24"/>
-                <w:u w:val="single"/>
-              </w:rPr>
-              <w:t>3</w:t>
-            </w:r>
-            <w:r>
-              <w:rPr>
-                <w:rFonts w:ascii="Arial" w:hAnsi="Arial" w:cs="Arial"/>
-                <w:b/>
-                <w:bCs/>
-                <w:sz w:val="24"/>
-                <w:szCs w:val="24"/>
-                <w:u w:val="single"/>
-              </w:rPr>
-              <w:t>}</w:t>
+              <w:t>{efAl3}</w:t>
             </w:r>
           </w:p>
         </w:tc>
@@ -2886,29 +2554,7 @@
                 <w:szCs w:val="24"/>
                 <w:u w:val="single"/>
               </w:rPr>
-              <w:t>{efAl</w:t>
-            </w:r>
-            <w:r>
-              <w:rPr>
-                <w:rFonts w:ascii="Arial" w:hAnsi="Arial" w:cs="Arial"/>
-                <w:b/>
-                <w:bCs/>
-                <w:sz w:val="24"/>
-                <w:szCs w:val="24"/>
-                <w:u w:val="single"/>
-              </w:rPr>
-              <w:t>4</w:t>
-            </w:r>
-            <w:r>
-              <w:rPr>
-                <w:rFonts w:ascii="Arial" w:hAnsi="Arial" w:cs="Arial"/>
-                <w:b/>
-                <w:bCs/>
-                <w:sz w:val="24"/>
-                <w:szCs w:val="24"/>
-                <w:u w:val="single"/>
-              </w:rPr>
-              <w:t>}</w:t>
+              <w:t>{efAl4}</w:t>
             </w:r>
           </w:p>
         </w:tc>
@@ -2938,29 +2584,7 @@
                 <w:szCs w:val="24"/>
                 <w:u w:val="single"/>
               </w:rPr>
-              <w:t>{efAl</w:t>
-            </w:r>
-            <w:r>
-              <w:rPr>
-                <w:rFonts w:ascii="Arial" w:hAnsi="Arial" w:cs="Arial"/>
-                <w:b/>
-                <w:bCs/>
-                <w:sz w:val="24"/>
-                <w:szCs w:val="24"/>
-                <w:u w:val="single"/>
-              </w:rPr>
-              <w:t>5</w:t>
-            </w:r>
-            <w:r>
-              <w:rPr>
-                <w:rFonts w:ascii="Arial" w:hAnsi="Arial" w:cs="Arial"/>
-                <w:b/>
-                <w:bCs/>
-                <w:sz w:val="24"/>
-                <w:szCs w:val="24"/>
-                <w:u w:val="single"/>
-              </w:rPr>
-              <w:t>}</w:t>
+              <w:t>{efAl5}</w:t>
             </w:r>
           </w:p>
         </w:tc>
@@ -3103,29 +2727,7 @@
                 <w:szCs w:val="24"/>
                 <w:u w:val="single"/>
               </w:rPr>
-              <w:t>{hAl</w:t>
-            </w:r>
-            <w:r>
-              <w:rPr>
-                <w:rFonts w:ascii="Arial" w:hAnsi="Arial" w:cs="Arial"/>
-                <w:b/>
-                <w:bCs/>
-                <w:sz w:val="24"/>
-                <w:szCs w:val="24"/>
-                <w:u w:val="single"/>
-              </w:rPr>
-              <w:t>2</w:t>
-            </w:r>
-            <w:r>
-              <w:rPr>
-                <w:rFonts w:ascii="Arial" w:hAnsi="Arial" w:cs="Arial"/>
-                <w:b/>
-                <w:bCs/>
-                <w:sz w:val="24"/>
-                <w:szCs w:val="24"/>
-                <w:u w:val="single"/>
-              </w:rPr>
-              <w:t>}</w:t>
+              <w:t>{hAl2}</w:t>
             </w:r>
           </w:p>
         </w:tc>
@@ -3155,29 +2757,7 @@
                 <w:szCs w:val="24"/>
                 <w:u w:val="single"/>
               </w:rPr>
-              <w:t>{hAl</w:t>
-            </w:r>
-            <w:r>
-              <w:rPr>
-                <w:rFonts w:ascii="Arial" w:hAnsi="Arial" w:cs="Arial"/>
-                <w:b/>
-                <w:bCs/>
-                <w:sz w:val="24"/>
-                <w:szCs w:val="24"/>
-                <w:u w:val="single"/>
-              </w:rPr>
-              <w:t>3</w:t>
-            </w:r>
-            <w:r>
-              <w:rPr>
-                <w:rFonts w:ascii="Arial" w:hAnsi="Arial" w:cs="Arial"/>
-                <w:b/>
-                <w:bCs/>
-                <w:sz w:val="24"/>
-                <w:szCs w:val="24"/>
-                <w:u w:val="single"/>
-              </w:rPr>
-              <w:t>}</w:t>
+              <w:t>{hAl3}</w:t>
             </w:r>
           </w:p>
         </w:tc>
@@ -3207,29 +2787,7 @@
                 <w:szCs w:val="24"/>
                 <w:u w:val="single"/>
               </w:rPr>
-              <w:t>{hAl</w:t>
-            </w:r>
-            <w:r>
-              <w:rPr>
-                <w:rFonts w:ascii="Arial" w:hAnsi="Arial" w:cs="Arial"/>
-                <w:b/>
-                <w:bCs/>
-                <w:sz w:val="24"/>
-                <w:szCs w:val="24"/>
-                <w:u w:val="single"/>
-              </w:rPr>
-              <w:t>4</w:t>
-            </w:r>
-            <w:r>
-              <w:rPr>
-                <w:rFonts w:ascii="Arial" w:hAnsi="Arial" w:cs="Arial"/>
-                <w:b/>
-                <w:bCs/>
-                <w:sz w:val="24"/>
-                <w:szCs w:val="24"/>
-                <w:u w:val="single"/>
-              </w:rPr>
-              <w:t>}</w:t>
+              <w:t>{hAl4}</w:t>
             </w:r>
           </w:p>
         </w:tc>
@@ -3259,29 +2817,7 @@
                 <w:szCs w:val="24"/>
                 <w:u w:val="single"/>
               </w:rPr>
-              <w:t>{hAl</w:t>
-            </w:r>
-            <w:r>
-              <w:rPr>
-                <w:rFonts w:ascii="Arial" w:hAnsi="Arial" w:cs="Arial"/>
-                <w:b/>
-                <w:bCs/>
-                <w:sz w:val="24"/>
-                <w:szCs w:val="24"/>
-                <w:u w:val="single"/>
-              </w:rPr>
-              <w:t>5</w:t>
-            </w:r>
-            <w:r>
-              <w:rPr>
-                <w:rFonts w:ascii="Arial" w:hAnsi="Arial" w:cs="Arial"/>
-                <w:b/>
-                <w:bCs/>
-                <w:sz w:val="24"/>
-                <w:szCs w:val="24"/>
-                <w:u w:val="single"/>
-              </w:rPr>
-              <w:t>}</w:t>
+              <w:t>{hAl5}</w:t>
             </w:r>
           </w:p>
         </w:tc>
@@ -3424,29 +2960,7 @@
                 <w:szCs w:val="24"/>
                 <w:u w:val="single"/>
               </w:rPr>
-              <w:t>{gAl</w:t>
-            </w:r>
-            <w:r>
-              <w:rPr>
-                <w:rFonts w:ascii="Arial" w:hAnsi="Arial" w:cs="Arial"/>
-                <w:b/>
-                <w:bCs/>
-                <w:sz w:val="24"/>
-                <w:szCs w:val="24"/>
-                <w:u w:val="single"/>
-              </w:rPr>
-              <w:t>2</w:t>
-            </w:r>
-            <w:r>
-              <w:rPr>
-                <w:rFonts w:ascii="Arial" w:hAnsi="Arial" w:cs="Arial"/>
-                <w:b/>
-                <w:bCs/>
-                <w:sz w:val="24"/>
-                <w:szCs w:val="24"/>
-                <w:u w:val="single"/>
-              </w:rPr>
-              <w:t>}</w:t>
+              <w:t>{gAl2}</w:t>
             </w:r>
           </w:p>
         </w:tc>
@@ -3476,29 +2990,7 @@
                 <w:szCs w:val="24"/>
                 <w:u w:val="single"/>
               </w:rPr>
-              <w:t>{gAl</w:t>
-            </w:r>
-            <w:r>
-              <w:rPr>
-                <w:rFonts w:ascii="Arial" w:hAnsi="Arial" w:cs="Arial"/>
-                <w:b/>
-                <w:bCs/>
-                <w:sz w:val="24"/>
-                <w:szCs w:val="24"/>
-                <w:u w:val="single"/>
-              </w:rPr>
-              <w:t>3</w:t>
-            </w:r>
-            <w:r>
-              <w:rPr>
-                <w:rFonts w:ascii="Arial" w:hAnsi="Arial" w:cs="Arial"/>
-                <w:b/>
-                <w:bCs/>
-                <w:sz w:val="24"/>
-                <w:szCs w:val="24"/>
-                <w:u w:val="single"/>
-              </w:rPr>
-              <w:t>}</w:t>
+              <w:t>{gAl3}</w:t>
             </w:r>
           </w:p>
         </w:tc>
@@ -3528,29 +3020,7 @@
                 <w:szCs w:val="24"/>
                 <w:u w:val="single"/>
               </w:rPr>
-              <w:t>{gAl</w:t>
-            </w:r>
-            <w:r>
-              <w:rPr>
-                <w:rFonts w:ascii="Arial" w:hAnsi="Arial" w:cs="Arial"/>
-                <w:b/>
-                <w:bCs/>
-                <w:sz w:val="24"/>
-                <w:szCs w:val="24"/>
-                <w:u w:val="single"/>
-              </w:rPr>
-              <w:t>4</w:t>
-            </w:r>
-            <w:r>
-              <w:rPr>
-                <w:rFonts w:ascii="Arial" w:hAnsi="Arial" w:cs="Arial"/>
-                <w:b/>
-                <w:bCs/>
-                <w:sz w:val="24"/>
-                <w:szCs w:val="24"/>
-                <w:u w:val="single"/>
-              </w:rPr>
-              <w:t>}</w:t>
+              <w:t>{gAl4}</w:t>
             </w:r>
           </w:p>
         </w:tc>
@@ -3580,29 +3050,7 @@
                 <w:szCs w:val="24"/>
                 <w:u w:val="single"/>
               </w:rPr>
-              <w:t>{gAl</w:t>
-            </w:r>
-            <w:r>
-              <w:rPr>
-                <w:rFonts w:ascii="Arial" w:hAnsi="Arial" w:cs="Arial"/>
-                <w:b/>
-                <w:bCs/>
-                <w:sz w:val="24"/>
-                <w:szCs w:val="24"/>
-                <w:u w:val="single"/>
-              </w:rPr>
-              <w:t>5</w:t>
-            </w:r>
-            <w:r>
-              <w:rPr>
-                <w:rFonts w:ascii="Arial" w:hAnsi="Arial" w:cs="Arial"/>
-                <w:b/>
-                <w:bCs/>
-                <w:sz w:val="24"/>
-                <w:szCs w:val="24"/>
-                <w:u w:val="single"/>
-              </w:rPr>
-              <w:t>}</w:t>
+              <w:t>{gAl5}</w:t>
             </w:r>
           </w:p>
         </w:tc>
@@ -4315,6 +3763,17 @@
                 <w:u w:val="single"/>
               </w:rPr>
             </w:pPr>
+            <w:r>
+              <w:rPr>
+                <w:rFonts w:ascii="Arial" w:hAnsi="Arial" w:cs="Arial"/>
+                <w:b/>
+                <w:bCs/>
+                <w:sz w:val="24"/>
+                <w:szCs w:val="24"/>
+                <w:u w:val="single"/>
+              </w:rPr>
+              <w:t>{bc1}</w:t>
+            </w:r>
           </w:p>
         </w:tc>
         <w:tc>
@@ -4334,6 +3793,17 @@
                 <w:u w:val="single"/>
               </w:rPr>
             </w:pPr>
+            <w:r>
+              <w:rPr>
+                <w:rFonts w:ascii="Arial" w:hAnsi="Arial" w:cs="Arial"/>
+                <w:b/>
+                <w:bCs/>
+                <w:sz w:val="24"/>
+                <w:szCs w:val="24"/>
+                <w:u w:val="single"/>
+              </w:rPr>
+              <w:t>{bc2}</w:t>
+            </w:r>
           </w:p>
         </w:tc>
         <w:tc>
@@ -4353,6 +3823,17 @@
                 <w:u w:val="single"/>
               </w:rPr>
             </w:pPr>
+            <w:r>
+              <w:rPr>
+                <w:rFonts w:ascii="Arial" w:hAnsi="Arial" w:cs="Arial"/>
+                <w:b/>
+                <w:bCs/>
+                <w:sz w:val="24"/>
+                <w:szCs w:val="24"/>
+                <w:u w:val="single"/>
+              </w:rPr>
+              <w:t>{bc3}</w:t>
+            </w:r>
           </w:p>
         </w:tc>
         <w:tc>
@@ -4372,6 +3853,17 @@
                 <w:u w:val="single"/>
               </w:rPr>
             </w:pPr>
+            <w:r>
+              <w:rPr>
+                <w:rFonts w:ascii="Arial" w:hAnsi="Arial" w:cs="Arial"/>
+                <w:b/>
+                <w:bCs/>
+                <w:sz w:val="24"/>
+                <w:szCs w:val="24"/>
+                <w:u w:val="single"/>
+              </w:rPr>
+              <w:t>{bc4}</w:t>
+            </w:r>
           </w:p>
         </w:tc>
         <w:tc>
@@ -4391,6 +3883,17 @@
                 <w:u w:val="single"/>
               </w:rPr>
             </w:pPr>
+            <w:r>
+              <w:rPr>
+                <w:rFonts w:ascii="Arial" w:hAnsi="Arial" w:cs="Arial"/>
+                <w:b/>
+                <w:bCs/>
+                <w:sz w:val="24"/>
+                <w:szCs w:val="24"/>
+                <w:u w:val="single"/>
+              </w:rPr>
+              <w:t>{bc5}</w:t>
+            </w:r>
           </w:p>
         </w:tc>
       </w:tr>
@@ -7047,29 +6550,7 @@
                 <w:szCs w:val="24"/>
                 <w:u w:val="single"/>
               </w:rPr>
-              <w:t>{ass</w:t>
-            </w:r>
-            <w:r>
-              <w:rPr>
-                <w:rFonts w:ascii="Arial" w:hAnsi="Arial" w:cs="Arial"/>
-                <w:b/>
-                <w:bCs/>
-                <w:sz w:val="24"/>
-                <w:szCs w:val="24"/>
-                <w:u w:val="single"/>
-              </w:rPr>
-              <w:t>2</w:t>
-            </w:r>
-            <w:r>
-              <w:rPr>
-                <w:rFonts w:ascii="Arial" w:hAnsi="Arial" w:cs="Arial"/>
-                <w:b/>
-                <w:bCs/>
-                <w:sz w:val="24"/>
-                <w:szCs w:val="24"/>
-                <w:u w:val="single"/>
-              </w:rPr>
-              <w:t>}</w:t>
+              <w:t>{ass2}</w:t>
             </w:r>
           </w:p>
         </w:tc>
@@ -7099,29 +6580,7 @@
                 <w:szCs w:val="24"/>
                 <w:u w:val="single"/>
               </w:rPr>
-              <w:t>{ass</w:t>
-            </w:r>
-            <w:r>
-              <w:rPr>
-                <w:rFonts w:ascii="Arial" w:hAnsi="Arial" w:cs="Arial"/>
-                <w:b/>
-                <w:bCs/>
-                <w:sz w:val="24"/>
-                <w:szCs w:val="24"/>
-                <w:u w:val="single"/>
-              </w:rPr>
-              <w:t>3</w:t>
-            </w:r>
-            <w:r>
-              <w:rPr>
-                <w:rFonts w:ascii="Arial" w:hAnsi="Arial" w:cs="Arial"/>
-                <w:b/>
-                <w:bCs/>
-                <w:sz w:val="24"/>
-                <w:szCs w:val="24"/>
-                <w:u w:val="single"/>
-              </w:rPr>
-              <w:t>}</w:t>
+              <w:t>{ass3}</w:t>
             </w:r>
           </w:p>
         </w:tc>
@@ -7151,29 +6610,7 @@
                 <w:szCs w:val="24"/>
                 <w:u w:val="single"/>
               </w:rPr>
-              <w:t>{ass</w:t>
-            </w:r>
-            <w:r>
-              <w:rPr>
-                <w:rFonts w:ascii="Arial" w:hAnsi="Arial" w:cs="Arial"/>
-                <w:b/>
-                <w:bCs/>
-                <w:sz w:val="24"/>
-                <w:szCs w:val="24"/>
-                <w:u w:val="single"/>
-              </w:rPr>
-              <w:t>4</w:t>
-            </w:r>
-            <w:r>
-              <w:rPr>
-                <w:rFonts w:ascii="Arial" w:hAnsi="Arial" w:cs="Arial"/>
-                <w:b/>
-                <w:bCs/>
-                <w:sz w:val="24"/>
-                <w:szCs w:val="24"/>
-                <w:u w:val="single"/>
-              </w:rPr>
-              <w:t>}</w:t>
+              <w:t>{ass4}</w:t>
             </w:r>
           </w:p>
         </w:tc>
@@ -7203,29 +6640,7 @@
                 <w:szCs w:val="24"/>
                 <w:u w:val="single"/>
               </w:rPr>
-              <w:t>{ass</w:t>
-            </w:r>
-            <w:r>
-              <w:rPr>
-                <w:rFonts w:ascii="Arial" w:hAnsi="Arial" w:cs="Arial"/>
-                <w:b/>
-                <w:bCs/>
-                <w:sz w:val="24"/>
-                <w:szCs w:val="24"/>
-                <w:u w:val="single"/>
-              </w:rPr>
-              <w:t>5</w:t>
-            </w:r>
-            <w:r>
-              <w:rPr>
-                <w:rFonts w:ascii="Arial" w:hAnsi="Arial" w:cs="Arial"/>
-                <w:b/>
-                <w:bCs/>
-                <w:sz w:val="24"/>
-                <w:szCs w:val="24"/>
-                <w:u w:val="single"/>
-              </w:rPr>
-              <w:t>}</w:t>
+              <w:t>{ass5}</w:t>
             </w:r>
           </w:p>
         </w:tc>
@@ -7360,29 +6775,7 @@
                 <w:szCs w:val="24"/>
                 <w:u w:val="single"/>
               </w:rPr>
-              <w:t>{ti</w:t>
-            </w:r>
-            <w:r>
-              <w:rPr>
-                <w:rFonts w:ascii="Arial" w:hAnsi="Arial" w:cs="Arial"/>
-                <w:b/>
-                <w:bCs/>
-                <w:sz w:val="24"/>
-                <w:szCs w:val="24"/>
-                <w:u w:val="single"/>
-              </w:rPr>
-              <w:t>2</w:t>
-            </w:r>
-            <w:r>
-              <w:rPr>
-                <w:rFonts w:ascii="Arial" w:hAnsi="Arial" w:cs="Arial"/>
-                <w:b/>
-                <w:bCs/>
-                <w:sz w:val="24"/>
-                <w:szCs w:val="24"/>
-                <w:u w:val="single"/>
-              </w:rPr>
-              <w:t>}</w:t>
+              <w:t>{ti2}</w:t>
             </w:r>
           </w:p>
         </w:tc>
@@ -7412,29 +6805,7 @@
                 <w:szCs w:val="24"/>
                 <w:u w:val="single"/>
               </w:rPr>
-              <w:t>{ti</w:t>
-            </w:r>
-            <w:r>
-              <w:rPr>
-                <w:rFonts w:ascii="Arial" w:hAnsi="Arial" w:cs="Arial"/>
-                <w:b/>
-                <w:bCs/>
-                <w:sz w:val="24"/>
-                <w:szCs w:val="24"/>
-                <w:u w:val="single"/>
-              </w:rPr>
-              <w:t>3</w:t>
-            </w:r>
-            <w:r>
-              <w:rPr>
-                <w:rFonts w:ascii="Arial" w:hAnsi="Arial" w:cs="Arial"/>
-                <w:b/>
-                <w:bCs/>
-                <w:sz w:val="24"/>
-                <w:szCs w:val="24"/>
-                <w:u w:val="single"/>
-              </w:rPr>
-              <w:t>}</w:t>
+              <w:t>{ti3}</w:t>
             </w:r>
           </w:p>
         </w:tc>
@@ -7464,29 +6835,7 @@
                 <w:szCs w:val="24"/>
                 <w:u w:val="single"/>
               </w:rPr>
-              <w:t>{ti</w:t>
-            </w:r>
-            <w:r>
-              <w:rPr>
-                <w:rFonts w:ascii="Arial" w:hAnsi="Arial" w:cs="Arial"/>
-                <w:b/>
-                <w:bCs/>
-                <w:sz w:val="24"/>
-                <w:szCs w:val="24"/>
-                <w:u w:val="single"/>
-              </w:rPr>
-              <w:t>4</w:t>
-            </w:r>
-            <w:r>
-              <w:rPr>
-                <w:rFonts w:ascii="Arial" w:hAnsi="Arial" w:cs="Arial"/>
-                <w:b/>
-                <w:bCs/>
-                <w:sz w:val="24"/>
-                <w:szCs w:val="24"/>
-                <w:u w:val="single"/>
-              </w:rPr>
-              <w:t>}</w:t>
+              <w:t>{ti4}</w:t>
             </w:r>
           </w:p>
         </w:tc>
@@ -7516,29 +6865,7 @@
                 <w:szCs w:val="24"/>
                 <w:u w:val="single"/>
               </w:rPr>
-              <w:t>{ti</w:t>
-            </w:r>
-            <w:r>
-              <w:rPr>
-                <w:rFonts w:ascii="Arial" w:hAnsi="Arial" w:cs="Arial"/>
-                <w:b/>
-                <w:bCs/>
-                <w:sz w:val="24"/>
-                <w:szCs w:val="24"/>
-                <w:u w:val="single"/>
-              </w:rPr>
-              <w:t>5</w:t>
-            </w:r>
-            <w:r>
-              <w:rPr>
-                <w:rFonts w:ascii="Arial" w:hAnsi="Arial" w:cs="Arial"/>
-                <w:b/>
-                <w:bCs/>
-                <w:sz w:val="24"/>
-                <w:szCs w:val="24"/>
-                <w:u w:val="single"/>
-              </w:rPr>
-              <w:t>}</w:t>
+              <w:t>{ti5}</w:t>
             </w:r>
           </w:p>
         </w:tc>
@@ -7678,29 +7005,7 @@
                 <w:szCs w:val="24"/>
                 <w:u w:val="single"/>
               </w:rPr>
-              <w:t>{es</w:t>
-            </w:r>
-            <w:r>
-              <w:rPr>
-                <w:rFonts w:ascii="Arial" w:hAnsi="Arial" w:cs="Arial"/>
-                <w:b/>
-                <w:bCs/>
-                <w:sz w:val="24"/>
-                <w:szCs w:val="24"/>
-                <w:u w:val="single"/>
-              </w:rPr>
-              <w:t>2</w:t>
-            </w:r>
-            <w:r>
-              <w:rPr>
-                <w:rFonts w:ascii="Arial" w:hAnsi="Arial" w:cs="Arial"/>
-                <w:b/>
-                <w:bCs/>
-                <w:sz w:val="24"/>
-                <w:szCs w:val="24"/>
-                <w:u w:val="single"/>
-              </w:rPr>
-              <w:t>}</w:t>
+              <w:t>{es2}</w:t>
             </w:r>
           </w:p>
         </w:tc>
@@ -7730,29 +7035,7 @@
                 <w:szCs w:val="24"/>
                 <w:u w:val="single"/>
               </w:rPr>
-              <w:t>{es</w:t>
-            </w:r>
-            <w:r>
-              <w:rPr>
-                <w:rFonts w:ascii="Arial" w:hAnsi="Arial" w:cs="Arial"/>
-                <w:b/>
-                <w:bCs/>
-                <w:sz w:val="24"/>
-                <w:szCs w:val="24"/>
-                <w:u w:val="single"/>
-              </w:rPr>
-              <w:t>3</w:t>
-            </w:r>
-            <w:r>
-              <w:rPr>
-                <w:rFonts w:ascii="Arial" w:hAnsi="Arial" w:cs="Arial"/>
-                <w:b/>
-                <w:bCs/>
-                <w:sz w:val="24"/>
-                <w:szCs w:val="24"/>
-                <w:u w:val="single"/>
-              </w:rPr>
-              <w:t>}</w:t>
+              <w:t>{es3}</w:t>
             </w:r>
           </w:p>
         </w:tc>
@@ -7782,29 +7065,7 @@
                 <w:szCs w:val="24"/>
                 <w:u w:val="single"/>
               </w:rPr>
-              <w:t>{es</w:t>
-            </w:r>
-            <w:r>
-              <w:rPr>
-                <w:rFonts w:ascii="Arial" w:hAnsi="Arial" w:cs="Arial"/>
-                <w:b/>
-                <w:bCs/>
-                <w:sz w:val="24"/>
-                <w:szCs w:val="24"/>
-                <w:u w:val="single"/>
-              </w:rPr>
-              <w:t>4</w:t>
-            </w:r>
-            <w:r>
-              <w:rPr>
-                <w:rFonts w:ascii="Arial" w:hAnsi="Arial" w:cs="Arial"/>
-                <w:b/>
-                <w:bCs/>
-                <w:sz w:val="24"/>
-                <w:szCs w:val="24"/>
-                <w:u w:val="single"/>
-              </w:rPr>
-              <w:t>}</w:t>
+              <w:t>{es4}</w:t>
             </w:r>
           </w:p>
         </w:tc>
@@ -7834,29 +7095,7 @@
                 <w:szCs w:val="24"/>
                 <w:u w:val="single"/>
               </w:rPr>
-              <w:t>{es</w:t>
-            </w:r>
-            <w:r>
-              <w:rPr>
-                <w:rFonts w:ascii="Arial" w:hAnsi="Arial" w:cs="Arial"/>
-                <w:b/>
-                <w:bCs/>
-                <w:sz w:val="24"/>
-                <w:szCs w:val="24"/>
-                <w:u w:val="single"/>
-              </w:rPr>
-              <w:t>5</w:t>
-            </w:r>
-            <w:r>
-              <w:rPr>
-                <w:rFonts w:ascii="Arial" w:hAnsi="Arial" w:cs="Arial"/>
-                <w:b/>
-                <w:bCs/>
-                <w:sz w:val="24"/>
-                <w:szCs w:val="24"/>
-                <w:u w:val="single"/>
-              </w:rPr>
-              <w:t>}</w:t>
+              <w:t>{es5}</w:t>
             </w:r>
           </w:p>
         </w:tc>
@@ -7991,29 +7230,7 @@
                 <w:szCs w:val="24"/>
                 <w:u w:val="single"/>
               </w:rPr>
-              <w:t>{em</w:t>
-            </w:r>
-            <w:r>
-              <w:rPr>
-                <w:rFonts w:ascii="Arial" w:hAnsi="Arial" w:cs="Arial"/>
-                <w:b/>
-                <w:bCs/>
-                <w:sz w:val="24"/>
-                <w:szCs w:val="24"/>
-                <w:u w:val="single"/>
-              </w:rPr>
-              <w:t>2</w:t>
-            </w:r>
-            <w:r>
-              <w:rPr>
-                <w:rFonts w:ascii="Arial" w:hAnsi="Arial" w:cs="Arial"/>
-                <w:b/>
-                <w:bCs/>
-                <w:sz w:val="24"/>
-                <w:szCs w:val="24"/>
-                <w:u w:val="single"/>
-              </w:rPr>
-              <w:t>}</w:t>
+              <w:t>{em2}</w:t>
             </w:r>
           </w:p>
         </w:tc>
@@ -8043,29 +7260,7 @@
                 <w:szCs w:val="24"/>
                 <w:u w:val="single"/>
               </w:rPr>
-              <w:t>{em</w:t>
-            </w:r>
-            <w:r>
-              <w:rPr>
-                <w:rFonts w:ascii="Arial" w:hAnsi="Arial" w:cs="Arial"/>
-                <w:b/>
-                <w:bCs/>
-                <w:sz w:val="24"/>
-                <w:szCs w:val="24"/>
-                <w:u w:val="single"/>
-              </w:rPr>
-              <w:t>3</w:t>
-            </w:r>
-            <w:r>
-              <w:rPr>
-                <w:rFonts w:ascii="Arial" w:hAnsi="Arial" w:cs="Arial"/>
-                <w:b/>
-                <w:bCs/>
-                <w:sz w:val="24"/>
-                <w:szCs w:val="24"/>
-                <w:u w:val="single"/>
-              </w:rPr>
-              <w:t>}</w:t>
+              <w:t>{em3}</w:t>
             </w:r>
           </w:p>
         </w:tc>
@@ -8095,29 +7290,7 @@
                 <w:szCs w:val="24"/>
                 <w:u w:val="single"/>
               </w:rPr>
-              <w:t>{em</w:t>
-            </w:r>
-            <w:r>
-              <w:rPr>
-                <w:rFonts w:ascii="Arial" w:hAnsi="Arial" w:cs="Arial"/>
-                <w:b/>
-                <w:bCs/>
-                <w:sz w:val="24"/>
-                <w:szCs w:val="24"/>
-                <w:u w:val="single"/>
-              </w:rPr>
-              <w:t>4</w:t>
-            </w:r>
-            <w:r>
-              <w:rPr>
-                <w:rFonts w:ascii="Arial" w:hAnsi="Arial" w:cs="Arial"/>
-                <w:b/>
-                <w:bCs/>
-                <w:sz w:val="24"/>
-                <w:szCs w:val="24"/>
-                <w:u w:val="single"/>
-              </w:rPr>
-              <w:t>}</w:t>
+              <w:t>{em4}</w:t>
             </w:r>
           </w:p>
         </w:tc>
@@ -8147,29 +7320,7 @@
                 <w:szCs w:val="24"/>
                 <w:u w:val="single"/>
               </w:rPr>
-              <w:t>{em</w:t>
-            </w:r>
-            <w:r>
-              <w:rPr>
-                <w:rFonts w:ascii="Arial" w:hAnsi="Arial" w:cs="Arial"/>
-                <w:b/>
-                <w:bCs/>
-                <w:sz w:val="24"/>
-                <w:szCs w:val="24"/>
-                <w:u w:val="single"/>
-              </w:rPr>
-              <w:t>5</w:t>
-            </w:r>
-            <w:r>
-              <w:rPr>
-                <w:rFonts w:ascii="Arial" w:hAnsi="Arial" w:cs="Arial"/>
-                <w:b/>
-                <w:bCs/>
-                <w:sz w:val="24"/>
-                <w:szCs w:val="24"/>
-                <w:u w:val="single"/>
-              </w:rPr>
-              <w:t>}</w:t>
+              <w:t>{em5}</w:t>
             </w:r>
           </w:p>
         </w:tc>
@@ -8234,12 +7385,22 @@
                 <w:rFonts w:ascii="Arial" w:hAnsi="Arial" w:cs="Arial"/>
                 <w:b/>
                 <w:bCs/>
-                <w:color w:val="63A4F7"/>
-                <w:sz w:val="24"/>
-                <w:szCs w:val="24"/>
-                <w:u w:val="single"/>
-              </w:rPr>
-            </w:pPr>
+                <w:sz w:val="24"/>
+                <w:szCs w:val="24"/>
+                <w:u w:val="single"/>
+              </w:rPr>
+            </w:pPr>
+            <w:r>
+              <w:rPr>
+                <w:rFonts w:ascii="Arial" w:hAnsi="Arial" w:cs="Arial"/>
+                <w:b/>
+                <w:bCs/>
+                <w:sz w:val="24"/>
+                <w:szCs w:val="24"/>
+                <w:u w:val="single"/>
+              </w:rPr>
+              <w:t>{dv1}</w:t>
+            </w:r>
           </w:p>
         </w:tc>
         <w:tc>
@@ -8254,12 +7415,22 @@
                 <w:rFonts w:ascii="Arial" w:hAnsi="Arial" w:cs="Arial"/>
                 <w:b/>
                 <w:bCs/>
-                <w:color w:val="63A4F7"/>
-                <w:sz w:val="24"/>
-                <w:szCs w:val="24"/>
-                <w:u w:val="single"/>
-              </w:rPr>
-            </w:pPr>
+                <w:sz w:val="24"/>
+                <w:szCs w:val="24"/>
+                <w:u w:val="single"/>
+              </w:rPr>
+            </w:pPr>
+            <w:r>
+              <w:rPr>
+                <w:rFonts w:ascii="Arial" w:hAnsi="Arial" w:cs="Arial"/>
+                <w:b/>
+                <w:bCs/>
+                <w:sz w:val="24"/>
+                <w:szCs w:val="24"/>
+                <w:u w:val="single"/>
+              </w:rPr>
+              <w:t>{dv2}</w:t>
+            </w:r>
           </w:p>
         </w:tc>
         <w:tc>
@@ -8274,12 +7445,22 @@
                 <w:rFonts w:ascii="Arial" w:hAnsi="Arial" w:cs="Arial"/>
                 <w:b/>
                 <w:bCs/>
-                <w:color w:val="63A4F7"/>
-                <w:sz w:val="24"/>
-                <w:szCs w:val="24"/>
-                <w:u w:val="single"/>
-              </w:rPr>
-            </w:pPr>
+                <w:sz w:val="24"/>
+                <w:szCs w:val="24"/>
+                <w:u w:val="single"/>
+              </w:rPr>
+            </w:pPr>
+            <w:r>
+              <w:rPr>
+                <w:rFonts w:ascii="Arial" w:hAnsi="Arial" w:cs="Arial"/>
+                <w:b/>
+                <w:bCs/>
+                <w:sz w:val="24"/>
+                <w:szCs w:val="24"/>
+                <w:u w:val="single"/>
+              </w:rPr>
+              <w:t>{dv3}</w:t>
+            </w:r>
           </w:p>
         </w:tc>
         <w:tc>
@@ -8294,12 +7475,22 @@
                 <w:rFonts w:ascii="Arial" w:hAnsi="Arial" w:cs="Arial"/>
                 <w:b/>
                 <w:bCs/>
-                <w:color w:val="63A4F7"/>
-                <w:sz w:val="24"/>
-                <w:szCs w:val="24"/>
-                <w:u w:val="single"/>
-              </w:rPr>
-            </w:pPr>
+                <w:sz w:val="24"/>
+                <w:szCs w:val="24"/>
+                <w:u w:val="single"/>
+              </w:rPr>
+            </w:pPr>
+            <w:r>
+              <w:rPr>
+                <w:rFonts w:ascii="Arial" w:hAnsi="Arial" w:cs="Arial"/>
+                <w:b/>
+                <w:bCs/>
+                <w:sz w:val="24"/>
+                <w:szCs w:val="24"/>
+                <w:u w:val="single"/>
+              </w:rPr>
+              <w:t>{dv4}</w:t>
+            </w:r>
           </w:p>
         </w:tc>
         <w:tc>
@@ -8314,12 +7505,22 @@
                 <w:rFonts w:ascii="Arial" w:hAnsi="Arial" w:cs="Arial"/>
                 <w:b/>
                 <w:bCs/>
-                <w:color w:val="63A4F7"/>
-                <w:sz w:val="24"/>
-                <w:szCs w:val="24"/>
-                <w:u w:val="single"/>
-              </w:rPr>
-            </w:pPr>
+                <w:sz w:val="24"/>
+                <w:szCs w:val="24"/>
+                <w:u w:val="single"/>
+              </w:rPr>
+            </w:pPr>
+            <w:r>
+              <w:rPr>
+                <w:rFonts w:ascii="Arial" w:hAnsi="Arial" w:cs="Arial"/>
+                <w:b/>
+                <w:bCs/>
+                <w:sz w:val="24"/>
+                <w:szCs w:val="24"/>
+                <w:u w:val="single"/>
+              </w:rPr>
+              <w:t>{dv5}</w:t>
+            </w:r>
           </w:p>
         </w:tc>
       </w:tr>
@@ -8383,12 +7584,22 @@
                 <w:rFonts w:ascii="Arial" w:hAnsi="Arial" w:cs="Arial"/>
                 <w:b/>
                 <w:bCs/>
-                <w:color w:val="63A4F7"/>
-                <w:sz w:val="24"/>
-                <w:szCs w:val="24"/>
-                <w:u w:val="single"/>
-              </w:rPr>
-            </w:pPr>
+                <w:sz w:val="24"/>
+                <w:szCs w:val="24"/>
+                <w:u w:val="single"/>
+              </w:rPr>
+            </w:pPr>
+            <w:r>
+              <w:rPr>
+                <w:rFonts w:ascii="Arial" w:hAnsi="Arial" w:cs="Arial"/>
+                <w:b/>
+                <w:bCs/>
+                <w:sz w:val="24"/>
+                <w:szCs w:val="24"/>
+                <w:u w:val="single"/>
+              </w:rPr>
+              <w:t>{as1}</w:t>
+            </w:r>
           </w:p>
         </w:tc>
         <w:tc>
@@ -8403,12 +7614,22 @@
                 <w:rFonts w:ascii="Arial" w:hAnsi="Arial" w:cs="Arial"/>
                 <w:b/>
                 <w:bCs/>
-                <w:color w:val="63A4F7"/>
-                <w:sz w:val="24"/>
-                <w:szCs w:val="24"/>
-                <w:u w:val="single"/>
-              </w:rPr>
-            </w:pPr>
+                <w:sz w:val="24"/>
+                <w:szCs w:val="24"/>
+                <w:u w:val="single"/>
+              </w:rPr>
+            </w:pPr>
+            <w:r>
+              <w:rPr>
+                <w:rFonts w:ascii="Arial" w:hAnsi="Arial" w:cs="Arial"/>
+                <w:b/>
+                <w:bCs/>
+                <w:sz w:val="24"/>
+                <w:szCs w:val="24"/>
+                <w:u w:val="single"/>
+              </w:rPr>
+              <w:t>{as2}</w:t>
+            </w:r>
           </w:p>
         </w:tc>
         <w:tc>
@@ -8423,12 +7644,22 @@
                 <w:rFonts w:ascii="Arial" w:hAnsi="Arial" w:cs="Arial"/>
                 <w:b/>
                 <w:bCs/>
-                <w:color w:val="63A4F7"/>
-                <w:sz w:val="24"/>
-                <w:szCs w:val="24"/>
-                <w:u w:val="single"/>
-              </w:rPr>
-            </w:pPr>
+                <w:sz w:val="24"/>
+                <w:szCs w:val="24"/>
+                <w:u w:val="single"/>
+              </w:rPr>
+            </w:pPr>
+            <w:r>
+              <w:rPr>
+                <w:rFonts w:ascii="Arial" w:hAnsi="Arial" w:cs="Arial"/>
+                <w:b/>
+                <w:bCs/>
+                <w:sz w:val="24"/>
+                <w:szCs w:val="24"/>
+                <w:u w:val="single"/>
+              </w:rPr>
+              <w:t>{as3}</w:t>
+            </w:r>
           </w:p>
         </w:tc>
         <w:tc>
@@ -8443,12 +7674,22 @@
                 <w:rFonts w:ascii="Arial" w:hAnsi="Arial" w:cs="Arial"/>
                 <w:b/>
                 <w:bCs/>
-                <w:color w:val="63A4F7"/>
-                <w:sz w:val="24"/>
-                <w:szCs w:val="24"/>
-                <w:u w:val="single"/>
-              </w:rPr>
-            </w:pPr>
+                <w:sz w:val="24"/>
+                <w:szCs w:val="24"/>
+                <w:u w:val="single"/>
+              </w:rPr>
+            </w:pPr>
+            <w:r>
+              <w:rPr>
+                <w:rFonts w:ascii="Arial" w:hAnsi="Arial" w:cs="Arial"/>
+                <w:b/>
+                <w:bCs/>
+                <w:sz w:val="24"/>
+                <w:szCs w:val="24"/>
+                <w:u w:val="single"/>
+              </w:rPr>
+              <w:t>{as4}</w:t>
+            </w:r>
           </w:p>
         </w:tc>
         <w:tc>
@@ -8463,12 +7704,22 @@
                 <w:rFonts w:ascii="Arial" w:hAnsi="Arial" w:cs="Arial"/>
                 <w:b/>
                 <w:bCs/>
-                <w:color w:val="63A4F7"/>
-                <w:sz w:val="24"/>
-                <w:szCs w:val="24"/>
-                <w:u w:val="single"/>
-              </w:rPr>
-            </w:pPr>
+                <w:sz w:val="24"/>
+                <w:szCs w:val="24"/>
+                <w:u w:val="single"/>
+              </w:rPr>
+            </w:pPr>
+            <w:r>
+              <w:rPr>
+                <w:rFonts w:ascii="Arial" w:hAnsi="Arial" w:cs="Arial"/>
+                <w:b/>
+                <w:bCs/>
+                <w:sz w:val="24"/>
+                <w:szCs w:val="24"/>
+                <w:u w:val="single"/>
+              </w:rPr>
+              <w:t>{as5}</w:t>
+            </w:r>
           </w:p>
         </w:tc>
       </w:tr>
@@ -8532,12 +7783,22 @@
                 <w:rFonts w:ascii="Arial" w:hAnsi="Arial" w:cs="Arial"/>
                 <w:b/>
                 <w:bCs/>
-                <w:color w:val="63A4F7"/>
-                <w:sz w:val="24"/>
-                <w:szCs w:val="24"/>
-                <w:u w:val="single"/>
-              </w:rPr>
-            </w:pPr>
+                <w:sz w:val="24"/>
+                <w:szCs w:val="24"/>
+                <w:u w:val="single"/>
+              </w:rPr>
+            </w:pPr>
+            <w:r>
+              <w:rPr>
+                <w:rFonts w:ascii="Arial" w:hAnsi="Arial" w:cs="Arial"/>
+                <w:b/>
+                <w:bCs/>
+                <w:sz w:val="24"/>
+                <w:szCs w:val="24"/>
+                <w:u w:val="single"/>
+              </w:rPr>
+              <w:t>{an1}</w:t>
+            </w:r>
           </w:p>
         </w:tc>
         <w:tc>
@@ -8552,12 +7813,44 @@
                 <w:rFonts w:ascii="Arial" w:hAnsi="Arial" w:cs="Arial"/>
                 <w:b/>
                 <w:bCs/>
-                <w:color w:val="63A4F7"/>
-                <w:sz w:val="24"/>
-                <w:szCs w:val="24"/>
-                <w:u w:val="single"/>
-              </w:rPr>
-            </w:pPr>
+                <w:sz w:val="24"/>
+                <w:szCs w:val="24"/>
+                <w:u w:val="single"/>
+              </w:rPr>
+            </w:pPr>
+            <w:r>
+              <w:rPr>
+                <w:rFonts w:ascii="Arial" w:hAnsi="Arial" w:cs="Arial"/>
+                <w:b/>
+                <w:bCs/>
+                <w:sz w:val="24"/>
+                <w:szCs w:val="24"/>
+                <w:u w:val="single"/>
+              </w:rPr>
+              <w:t>{an</w:t>
+            </w:r>
+            <w:r>
+              <w:rPr>
+                <w:rFonts w:ascii="Arial" w:hAnsi="Arial" w:cs="Arial"/>
+                <w:b/>
+                <w:bCs/>
+                <w:sz w:val="24"/>
+                <w:szCs w:val="24"/>
+                <w:u w:val="single"/>
+              </w:rPr>
+              <w:t>2</w:t>
+            </w:r>
+            <w:r>
+              <w:rPr>
+                <w:rFonts w:ascii="Arial" w:hAnsi="Arial" w:cs="Arial"/>
+                <w:b/>
+                <w:bCs/>
+                <w:sz w:val="24"/>
+                <w:szCs w:val="24"/>
+                <w:u w:val="single"/>
+              </w:rPr>
+              <w:t>}</w:t>
+            </w:r>
           </w:p>
         </w:tc>
         <w:tc>
@@ -8572,12 +7865,44 @@
                 <w:rFonts w:ascii="Arial" w:hAnsi="Arial" w:cs="Arial"/>
                 <w:b/>
                 <w:bCs/>
-                <w:color w:val="63A4F7"/>
-                <w:sz w:val="24"/>
-                <w:szCs w:val="24"/>
-                <w:u w:val="single"/>
-              </w:rPr>
-            </w:pPr>
+                <w:sz w:val="24"/>
+                <w:szCs w:val="24"/>
+                <w:u w:val="single"/>
+              </w:rPr>
+            </w:pPr>
+            <w:r>
+              <w:rPr>
+                <w:rFonts w:ascii="Arial" w:hAnsi="Arial" w:cs="Arial"/>
+                <w:b/>
+                <w:bCs/>
+                <w:sz w:val="24"/>
+                <w:szCs w:val="24"/>
+                <w:u w:val="single"/>
+              </w:rPr>
+              <w:t>{an</w:t>
+            </w:r>
+            <w:r>
+              <w:rPr>
+                <w:rFonts w:ascii="Arial" w:hAnsi="Arial" w:cs="Arial"/>
+                <w:b/>
+                <w:bCs/>
+                <w:sz w:val="24"/>
+                <w:szCs w:val="24"/>
+                <w:u w:val="single"/>
+              </w:rPr>
+              <w:t>3</w:t>
+            </w:r>
+            <w:r>
+              <w:rPr>
+                <w:rFonts w:ascii="Arial" w:hAnsi="Arial" w:cs="Arial"/>
+                <w:b/>
+                <w:bCs/>
+                <w:sz w:val="24"/>
+                <w:szCs w:val="24"/>
+                <w:u w:val="single"/>
+              </w:rPr>
+              <w:t>}</w:t>
+            </w:r>
           </w:p>
         </w:tc>
         <w:tc>
@@ -8592,12 +7917,44 @@
                 <w:rFonts w:ascii="Arial" w:hAnsi="Arial" w:cs="Arial"/>
                 <w:b/>
                 <w:bCs/>
-                <w:color w:val="63A4F7"/>
-                <w:sz w:val="24"/>
-                <w:szCs w:val="24"/>
-                <w:u w:val="single"/>
-              </w:rPr>
-            </w:pPr>
+                <w:sz w:val="24"/>
+                <w:szCs w:val="24"/>
+                <w:u w:val="single"/>
+              </w:rPr>
+            </w:pPr>
+            <w:r>
+              <w:rPr>
+                <w:rFonts w:ascii="Arial" w:hAnsi="Arial" w:cs="Arial"/>
+                <w:b/>
+                <w:bCs/>
+                <w:sz w:val="24"/>
+                <w:szCs w:val="24"/>
+                <w:u w:val="single"/>
+              </w:rPr>
+              <w:t>{an</w:t>
+            </w:r>
+            <w:r>
+              <w:rPr>
+                <w:rFonts w:ascii="Arial" w:hAnsi="Arial" w:cs="Arial"/>
+                <w:b/>
+                <w:bCs/>
+                <w:sz w:val="24"/>
+                <w:szCs w:val="24"/>
+                <w:u w:val="single"/>
+              </w:rPr>
+              <w:t>4</w:t>
+            </w:r>
+            <w:r>
+              <w:rPr>
+                <w:rFonts w:ascii="Arial" w:hAnsi="Arial" w:cs="Arial"/>
+                <w:b/>
+                <w:bCs/>
+                <w:sz w:val="24"/>
+                <w:szCs w:val="24"/>
+                <w:u w:val="single"/>
+              </w:rPr>
+              <w:t>}</w:t>
+            </w:r>
           </w:p>
         </w:tc>
         <w:tc>
@@ -8612,12 +7969,44 @@
                 <w:rFonts w:ascii="Arial" w:hAnsi="Arial" w:cs="Arial"/>
                 <w:b/>
                 <w:bCs/>
-                <w:color w:val="63A4F7"/>
-                <w:sz w:val="24"/>
-                <w:szCs w:val="24"/>
-                <w:u w:val="single"/>
-              </w:rPr>
-            </w:pPr>
+                <w:sz w:val="24"/>
+                <w:szCs w:val="24"/>
+                <w:u w:val="single"/>
+              </w:rPr>
+            </w:pPr>
+            <w:r>
+              <w:rPr>
+                <w:rFonts w:ascii="Arial" w:hAnsi="Arial" w:cs="Arial"/>
+                <w:b/>
+                <w:bCs/>
+                <w:sz w:val="24"/>
+                <w:szCs w:val="24"/>
+                <w:u w:val="single"/>
+              </w:rPr>
+              <w:t>{an</w:t>
+            </w:r>
+            <w:r>
+              <w:rPr>
+                <w:rFonts w:ascii="Arial" w:hAnsi="Arial" w:cs="Arial"/>
+                <w:b/>
+                <w:bCs/>
+                <w:sz w:val="24"/>
+                <w:szCs w:val="24"/>
+                <w:u w:val="single"/>
+              </w:rPr>
+              <w:t>5</w:t>
+            </w:r>
+            <w:r>
+              <w:rPr>
+                <w:rFonts w:ascii="Arial" w:hAnsi="Arial" w:cs="Arial"/>
+                <w:b/>
+                <w:bCs/>
+                <w:sz w:val="24"/>
+                <w:szCs w:val="24"/>
+                <w:u w:val="single"/>
+              </w:rPr>
+              <w:t>}</w:t>
+            </w:r>
           </w:p>
         </w:tc>
       </w:tr>
@@ -8681,12 +8070,22 @@
                 <w:rFonts w:ascii="Arial" w:hAnsi="Arial" w:cs="Arial"/>
                 <w:b/>
                 <w:bCs/>
-                <w:color w:val="63A4F7"/>
-                <w:sz w:val="24"/>
-                <w:szCs w:val="24"/>
-                <w:u w:val="single"/>
-              </w:rPr>
-            </w:pPr>
+                <w:sz w:val="24"/>
+                <w:szCs w:val="24"/>
+                <w:u w:val="single"/>
+              </w:rPr>
+            </w:pPr>
+            <w:r>
+              <w:rPr>
+                <w:rFonts w:ascii="Arial" w:hAnsi="Arial" w:cs="Arial"/>
+                <w:b/>
+                <w:bCs/>
+                <w:sz w:val="24"/>
+                <w:szCs w:val="24"/>
+                <w:u w:val="single"/>
+              </w:rPr>
+              <w:t>{ha1}</w:t>
+            </w:r>
           </w:p>
         </w:tc>
         <w:tc>
@@ -8701,12 +8100,44 @@
                 <w:rFonts w:ascii="Arial" w:hAnsi="Arial" w:cs="Arial"/>
                 <w:b/>
                 <w:bCs/>
-                <w:color w:val="63A4F7"/>
-                <w:sz w:val="24"/>
-                <w:szCs w:val="24"/>
-                <w:u w:val="single"/>
-              </w:rPr>
-            </w:pPr>
+                <w:sz w:val="24"/>
+                <w:szCs w:val="24"/>
+                <w:u w:val="single"/>
+              </w:rPr>
+            </w:pPr>
+            <w:r>
+              <w:rPr>
+                <w:rFonts w:ascii="Arial" w:hAnsi="Arial" w:cs="Arial"/>
+                <w:b/>
+                <w:bCs/>
+                <w:sz w:val="24"/>
+                <w:szCs w:val="24"/>
+                <w:u w:val="single"/>
+              </w:rPr>
+              <w:t>{ha</w:t>
+            </w:r>
+            <w:r>
+              <w:rPr>
+                <w:rFonts w:ascii="Arial" w:hAnsi="Arial" w:cs="Arial"/>
+                <w:b/>
+                <w:bCs/>
+                <w:sz w:val="24"/>
+                <w:szCs w:val="24"/>
+                <w:u w:val="single"/>
+              </w:rPr>
+              <w:t>2</w:t>
+            </w:r>
+            <w:r>
+              <w:rPr>
+                <w:rFonts w:ascii="Arial" w:hAnsi="Arial" w:cs="Arial"/>
+                <w:b/>
+                <w:bCs/>
+                <w:sz w:val="24"/>
+                <w:szCs w:val="24"/>
+                <w:u w:val="single"/>
+              </w:rPr>
+              <w:t>}</w:t>
+            </w:r>
           </w:p>
         </w:tc>
         <w:tc>
@@ -8721,12 +8152,44 @@
                 <w:rFonts w:ascii="Arial" w:hAnsi="Arial" w:cs="Arial"/>
                 <w:b/>
                 <w:bCs/>
-                <w:color w:val="63A4F7"/>
-                <w:sz w:val="24"/>
-                <w:szCs w:val="24"/>
-                <w:u w:val="single"/>
-              </w:rPr>
-            </w:pPr>
+                <w:sz w:val="24"/>
+                <w:szCs w:val="24"/>
+                <w:u w:val="single"/>
+              </w:rPr>
+            </w:pPr>
+            <w:r>
+              <w:rPr>
+                <w:rFonts w:ascii="Arial" w:hAnsi="Arial" w:cs="Arial"/>
+                <w:b/>
+                <w:bCs/>
+                <w:sz w:val="24"/>
+                <w:szCs w:val="24"/>
+                <w:u w:val="single"/>
+              </w:rPr>
+              <w:t>{ha</w:t>
+            </w:r>
+            <w:r>
+              <w:rPr>
+                <w:rFonts w:ascii="Arial" w:hAnsi="Arial" w:cs="Arial"/>
+                <w:b/>
+                <w:bCs/>
+                <w:sz w:val="24"/>
+                <w:szCs w:val="24"/>
+                <w:u w:val="single"/>
+              </w:rPr>
+              <w:t>3</w:t>
+            </w:r>
+            <w:r>
+              <w:rPr>
+                <w:rFonts w:ascii="Arial" w:hAnsi="Arial" w:cs="Arial"/>
+                <w:b/>
+                <w:bCs/>
+                <w:sz w:val="24"/>
+                <w:szCs w:val="24"/>
+                <w:u w:val="single"/>
+              </w:rPr>
+              <w:t>}</w:t>
+            </w:r>
           </w:p>
         </w:tc>
         <w:tc>
@@ -8741,12 +8204,44 @@
                 <w:rFonts w:ascii="Arial" w:hAnsi="Arial" w:cs="Arial"/>
                 <w:b/>
                 <w:bCs/>
-                <w:color w:val="63A4F7"/>
-                <w:sz w:val="24"/>
-                <w:szCs w:val="24"/>
-                <w:u w:val="single"/>
-              </w:rPr>
-            </w:pPr>
+                <w:sz w:val="24"/>
+                <w:szCs w:val="24"/>
+                <w:u w:val="single"/>
+              </w:rPr>
+            </w:pPr>
+            <w:r>
+              <w:rPr>
+                <w:rFonts w:ascii="Arial" w:hAnsi="Arial" w:cs="Arial"/>
+                <w:b/>
+                <w:bCs/>
+                <w:sz w:val="24"/>
+                <w:szCs w:val="24"/>
+                <w:u w:val="single"/>
+              </w:rPr>
+              <w:t>{ha</w:t>
+            </w:r>
+            <w:r>
+              <w:rPr>
+                <w:rFonts w:ascii="Arial" w:hAnsi="Arial" w:cs="Arial"/>
+                <w:b/>
+                <w:bCs/>
+                <w:sz w:val="24"/>
+                <w:szCs w:val="24"/>
+                <w:u w:val="single"/>
+              </w:rPr>
+              <w:t>4</w:t>
+            </w:r>
+            <w:r>
+              <w:rPr>
+                <w:rFonts w:ascii="Arial" w:hAnsi="Arial" w:cs="Arial"/>
+                <w:b/>
+                <w:bCs/>
+                <w:sz w:val="24"/>
+                <w:szCs w:val="24"/>
+                <w:u w:val="single"/>
+              </w:rPr>
+              <w:t>}</w:t>
+            </w:r>
           </w:p>
         </w:tc>
         <w:tc>
@@ -8761,12 +8256,44 @@
                 <w:rFonts w:ascii="Arial" w:hAnsi="Arial" w:cs="Arial"/>
                 <w:b/>
                 <w:bCs/>
-                <w:color w:val="63A4F7"/>
-                <w:sz w:val="24"/>
-                <w:szCs w:val="24"/>
-                <w:u w:val="single"/>
-              </w:rPr>
-            </w:pPr>
+                <w:sz w:val="24"/>
+                <w:szCs w:val="24"/>
+                <w:u w:val="single"/>
+              </w:rPr>
+            </w:pPr>
+            <w:r>
+              <w:rPr>
+                <w:rFonts w:ascii="Arial" w:hAnsi="Arial" w:cs="Arial"/>
+                <w:b/>
+                <w:bCs/>
+                <w:sz w:val="24"/>
+                <w:szCs w:val="24"/>
+                <w:u w:val="single"/>
+              </w:rPr>
+              <w:t>{ha</w:t>
+            </w:r>
+            <w:r>
+              <w:rPr>
+                <w:rFonts w:ascii="Arial" w:hAnsi="Arial" w:cs="Arial"/>
+                <w:b/>
+                <w:bCs/>
+                <w:sz w:val="24"/>
+                <w:szCs w:val="24"/>
+                <w:u w:val="single"/>
+              </w:rPr>
+              <w:t>5</w:t>
+            </w:r>
+            <w:r>
+              <w:rPr>
+                <w:rFonts w:ascii="Arial" w:hAnsi="Arial" w:cs="Arial"/>
+                <w:b/>
+                <w:bCs/>
+                <w:sz w:val="24"/>
+                <w:szCs w:val="24"/>
+                <w:u w:val="single"/>
+              </w:rPr>
+              <w:t>}</w:t>
+            </w:r>
           </w:p>
         </w:tc>
       </w:tr>
@@ -9214,21 +8741,7 @@
                 <w:rFonts w:ascii="Arial" w:hAnsi="Arial" w:cs="Arial"/>
                 <w:color w:val="000000" w:themeColor="text1"/>
               </w:rPr>
-              <w:t>{estabelecimentoAL</w:t>
-            </w:r>
-            <w:r>
-              <w:rPr>
-                <w:rFonts w:ascii="Arial" w:hAnsi="Arial" w:cs="Arial"/>
-                <w:color w:val="000000" w:themeColor="text1"/>
-              </w:rPr>
-              <w:t>2</w:t>
-            </w:r>
-            <w:r>
-              <w:rPr>
-                <w:rFonts w:ascii="Arial" w:hAnsi="Arial" w:cs="Arial"/>
-                <w:color w:val="000000" w:themeColor="text1"/>
-              </w:rPr>
-              <w:t>}</w:t>
+              <w:t>{estabelecimentoAL2}</w:t>
             </w:r>
           </w:p>
         </w:tc>
@@ -9251,57 +8764,29 @@
                 <w:rFonts w:ascii="Arial" w:hAnsi="Arial" w:cs="Arial"/>
                 <w:color w:val="000000" w:themeColor="text1"/>
               </w:rPr>
-              <w:t>{municipioAL</w:t>
-            </w:r>
-            <w:r>
+              <w:t>{municipioAL2}</w:t>
+            </w:r>
+          </w:p>
+        </w:tc>
+        <w:tc>
+          <w:tcPr>
+            <w:tcW w:w="993" w:type="dxa"/>
+            <w:vAlign w:val="center"/>
+          </w:tcPr>
+          <w:p>
+            <w:pPr>
+              <w:jc w:val="center"/>
               <w:rPr>
                 <w:rFonts w:ascii="Arial" w:hAnsi="Arial" w:cs="Arial"/>
                 <w:color w:val="000000" w:themeColor="text1"/>
               </w:rPr>
-              <w:t>2</w:t>
-            </w:r>
+            </w:pPr>
             <w:r>
               <w:rPr>
                 <w:rFonts w:ascii="Arial" w:hAnsi="Arial" w:cs="Arial"/>
                 <w:color w:val="000000" w:themeColor="text1"/>
               </w:rPr>
-              <w:t>}</w:t>
-            </w:r>
-          </w:p>
-        </w:tc>
-        <w:tc>
-          <w:tcPr>
-            <w:tcW w:w="993" w:type="dxa"/>
-            <w:vAlign w:val="center"/>
-          </w:tcPr>
-          <w:p>
-            <w:pPr>
-              <w:jc w:val="center"/>
-              <w:rPr>
-                <w:rFonts w:ascii="Arial" w:hAnsi="Arial" w:cs="Arial"/>
-                <w:color w:val="000000" w:themeColor="text1"/>
-              </w:rPr>
-            </w:pPr>
-            <w:r>
-              <w:rPr>
-                <w:rFonts w:ascii="Arial" w:hAnsi="Arial" w:cs="Arial"/>
-                <w:color w:val="000000" w:themeColor="text1"/>
-              </w:rPr>
-              <w:t>{ufAL</w:t>
-            </w:r>
-            <w:r>
-              <w:rPr>
-                <w:rFonts w:ascii="Arial" w:hAnsi="Arial" w:cs="Arial"/>
-                <w:color w:val="000000" w:themeColor="text1"/>
-              </w:rPr>
-              <w:t>2</w:t>
-            </w:r>
-            <w:r>
-              <w:rPr>
-                <w:rFonts w:ascii="Arial" w:hAnsi="Arial" w:cs="Arial"/>
-                <w:color w:val="000000" w:themeColor="text1"/>
-              </w:rPr>
-              <w:t>}</w:t>
+              <w:t>{ufAL2}</w:t>
             </w:r>
           </w:p>
         </w:tc>
@@ -9416,21 +8901,7 @@
                 <w:rFonts w:ascii="Arial" w:hAnsi="Arial" w:cs="Arial"/>
                 <w:color w:val="000000" w:themeColor="text1"/>
               </w:rPr>
-              <w:t>{estabelecimentoAL</w:t>
-            </w:r>
-            <w:r>
-              <w:rPr>
-                <w:rFonts w:ascii="Arial" w:hAnsi="Arial" w:cs="Arial"/>
-                <w:color w:val="000000" w:themeColor="text1"/>
-              </w:rPr>
-              <w:t>3</w:t>
-            </w:r>
-            <w:r>
-              <w:rPr>
-                <w:rFonts w:ascii="Arial" w:hAnsi="Arial" w:cs="Arial"/>
-                <w:color w:val="000000" w:themeColor="text1"/>
-              </w:rPr>
-              <w:t>}</w:t>
+              <w:t>{estabelecimentoAL3}</w:t>
             </w:r>
           </w:p>
         </w:tc>
@@ -9453,57 +8924,29 @@
                 <w:rFonts w:ascii="Arial" w:hAnsi="Arial" w:cs="Arial"/>
                 <w:color w:val="000000" w:themeColor="text1"/>
               </w:rPr>
-              <w:t>{municipioAL</w:t>
-            </w:r>
-            <w:r>
+              <w:t>{municipioAL3}</w:t>
+            </w:r>
+          </w:p>
+        </w:tc>
+        <w:tc>
+          <w:tcPr>
+            <w:tcW w:w="993" w:type="dxa"/>
+            <w:vAlign w:val="center"/>
+          </w:tcPr>
+          <w:p>
+            <w:pPr>
+              <w:jc w:val="center"/>
               <w:rPr>
                 <w:rFonts w:ascii="Arial" w:hAnsi="Arial" w:cs="Arial"/>
                 <w:color w:val="000000" w:themeColor="text1"/>
               </w:rPr>
-              <w:t>3</w:t>
-            </w:r>
+            </w:pPr>
             <w:r>
               <w:rPr>
                 <w:rFonts w:ascii="Arial" w:hAnsi="Arial" w:cs="Arial"/>
                 <w:color w:val="000000" w:themeColor="text1"/>
               </w:rPr>
-              <w:t>}</w:t>
-            </w:r>
-          </w:p>
-        </w:tc>
-        <w:tc>
-          <w:tcPr>
-            <w:tcW w:w="993" w:type="dxa"/>
-            <w:vAlign w:val="center"/>
-          </w:tcPr>
-          <w:p>
-            <w:pPr>
-              <w:jc w:val="center"/>
-              <w:rPr>
-                <w:rFonts w:ascii="Arial" w:hAnsi="Arial" w:cs="Arial"/>
-                <w:color w:val="000000" w:themeColor="text1"/>
-              </w:rPr>
-            </w:pPr>
-            <w:r>
-              <w:rPr>
-                <w:rFonts w:ascii="Arial" w:hAnsi="Arial" w:cs="Arial"/>
-                <w:color w:val="000000" w:themeColor="text1"/>
-              </w:rPr>
-              <w:t>{ufAL</w:t>
-            </w:r>
-            <w:r>
-              <w:rPr>
-                <w:rFonts w:ascii="Arial" w:hAnsi="Arial" w:cs="Arial"/>
-                <w:color w:val="000000" w:themeColor="text1"/>
-              </w:rPr>
-              <w:t>3</w:t>
-            </w:r>
-            <w:r>
-              <w:rPr>
-                <w:rFonts w:ascii="Arial" w:hAnsi="Arial" w:cs="Arial"/>
-                <w:color w:val="000000" w:themeColor="text1"/>
-              </w:rPr>
-              <w:t>}</w:t>
+              <w:t>{ufAL3}</w:t>
             </w:r>
           </w:p>
         </w:tc>
@@ -9618,21 +9061,7 @@
                 <w:rFonts w:ascii="Arial" w:hAnsi="Arial" w:cs="Arial"/>
                 <w:color w:val="000000" w:themeColor="text1"/>
               </w:rPr>
-              <w:t>{estabelecimentoAL</w:t>
-            </w:r>
-            <w:r>
-              <w:rPr>
-                <w:rFonts w:ascii="Arial" w:hAnsi="Arial" w:cs="Arial"/>
-                <w:color w:val="000000" w:themeColor="text1"/>
-              </w:rPr>
-              <w:t>4</w:t>
-            </w:r>
-            <w:r>
-              <w:rPr>
-                <w:rFonts w:ascii="Arial" w:hAnsi="Arial" w:cs="Arial"/>
-                <w:color w:val="000000" w:themeColor="text1"/>
-              </w:rPr>
-              <w:t>}</w:t>
+              <w:t>{estabelecimentoAL4}</w:t>
             </w:r>
           </w:p>
         </w:tc>
@@ -9655,57 +9084,29 @@
                 <w:rFonts w:ascii="Arial" w:hAnsi="Arial" w:cs="Arial"/>
                 <w:color w:val="000000" w:themeColor="text1"/>
               </w:rPr>
-              <w:t>{municipioAL</w:t>
-            </w:r>
-            <w:r>
+              <w:t>{municipioAL4}</w:t>
+            </w:r>
+          </w:p>
+        </w:tc>
+        <w:tc>
+          <w:tcPr>
+            <w:tcW w:w="993" w:type="dxa"/>
+            <w:vAlign w:val="center"/>
+          </w:tcPr>
+          <w:p>
+            <w:pPr>
+              <w:jc w:val="center"/>
               <w:rPr>
                 <w:rFonts w:ascii="Arial" w:hAnsi="Arial" w:cs="Arial"/>
                 <w:color w:val="000000" w:themeColor="text1"/>
               </w:rPr>
-              <w:t>4</w:t>
-            </w:r>
+            </w:pPr>
             <w:r>
               <w:rPr>
                 <w:rFonts w:ascii="Arial" w:hAnsi="Arial" w:cs="Arial"/>
                 <w:color w:val="000000" w:themeColor="text1"/>
               </w:rPr>
-              <w:t>}</w:t>
-            </w:r>
-          </w:p>
-        </w:tc>
-        <w:tc>
-          <w:tcPr>
-            <w:tcW w:w="993" w:type="dxa"/>
-            <w:vAlign w:val="center"/>
-          </w:tcPr>
-          <w:p>
-            <w:pPr>
-              <w:jc w:val="center"/>
-              <w:rPr>
-                <w:rFonts w:ascii="Arial" w:hAnsi="Arial" w:cs="Arial"/>
-                <w:color w:val="000000" w:themeColor="text1"/>
-              </w:rPr>
-            </w:pPr>
-            <w:r>
-              <w:rPr>
-                <w:rFonts w:ascii="Arial" w:hAnsi="Arial" w:cs="Arial"/>
-                <w:color w:val="000000" w:themeColor="text1"/>
-              </w:rPr>
-              <w:t>{ufAL</w:t>
-            </w:r>
-            <w:r>
-              <w:rPr>
-                <w:rFonts w:ascii="Arial" w:hAnsi="Arial" w:cs="Arial"/>
-                <w:color w:val="000000" w:themeColor="text1"/>
-              </w:rPr>
-              <w:t>4</w:t>
-            </w:r>
-            <w:r>
-              <w:rPr>
-                <w:rFonts w:ascii="Arial" w:hAnsi="Arial" w:cs="Arial"/>
-                <w:color w:val="000000" w:themeColor="text1"/>
-              </w:rPr>
-              <w:t>}</w:t>
+              <w:t>{ufAL4}</w:t>
             </w:r>
           </w:p>
         </w:tc>
@@ -9820,21 +9221,7 @@
                 <w:rFonts w:ascii="Arial" w:hAnsi="Arial" w:cs="Arial"/>
                 <w:color w:val="000000" w:themeColor="text1"/>
               </w:rPr>
-              <w:t>{estabelecimentoAL</w:t>
-            </w:r>
-            <w:r>
-              <w:rPr>
-                <w:rFonts w:ascii="Arial" w:hAnsi="Arial" w:cs="Arial"/>
-                <w:color w:val="000000" w:themeColor="text1"/>
-              </w:rPr>
-              <w:t>5</w:t>
-            </w:r>
-            <w:r>
-              <w:rPr>
-                <w:rFonts w:ascii="Arial" w:hAnsi="Arial" w:cs="Arial"/>
-                <w:color w:val="000000" w:themeColor="text1"/>
-              </w:rPr>
-              <w:t>}</w:t>
+              <w:t>{estabelecimentoAL5}</w:t>
             </w:r>
           </w:p>
         </w:tc>
@@ -9857,57 +9244,29 @@
                 <w:rFonts w:ascii="Arial" w:hAnsi="Arial" w:cs="Arial"/>
                 <w:color w:val="000000" w:themeColor="text1"/>
               </w:rPr>
-              <w:t>{municipioAL</w:t>
-            </w:r>
-            <w:r>
+              <w:t>{municipioAL5}</w:t>
+            </w:r>
+          </w:p>
+        </w:tc>
+        <w:tc>
+          <w:tcPr>
+            <w:tcW w:w="993" w:type="dxa"/>
+            <w:vAlign w:val="center"/>
+          </w:tcPr>
+          <w:p>
+            <w:pPr>
+              <w:jc w:val="center"/>
               <w:rPr>
                 <w:rFonts w:ascii="Arial" w:hAnsi="Arial" w:cs="Arial"/>
                 <w:color w:val="000000" w:themeColor="text1"/>
               </w:rPr>
-              <w:t>5</w:t>
-            </w:r>
+            </w:pPr>
             <w:r>
               <w:rPr>
                 <w:rFonts w:ascii="Arial" w:hAnsi="Arial" w:cs="Arial"/>
                 <w:color w:val="000000" w:themeColor="text1"/>
               </w:rPr>
-              <w:t>}</w:t>
-            </w:r>
-          </w:p>
-        </w:tc>
-        <w:tc>
-          <w:tcPr>
-            <w:tcW w:w="993" w:type="dxa"/>
-            <w:vAlign w:val="center"/>
-          </w:tcPr>
-          <w:p>
-            <w:pPr>
-              <w:jc w:val="center"/>
-              <w:rPr>
-                <w:rFonts w:ascii="Arial" w:hAnsi="Arial" w:cs="Arial"/>
-                <w:color w:val="000000" w:themeColor="text1"/>
-              </w:rPr>
-            </w:pPr>
-            <w:r>
-              <w:rPr>
-                <w:rFonts w:ascii="Arial" w:hAnsi="Arial" w:cs="Arial"/>
-                <w:color w:val="000000" w:themeColor="text1"/>
-              </w:rPr>
-              <w:t>{ufAL</w:t>
-            </w:r>
-            <w:r>
-              <w:rPr>
-                <w:rFonts w:ascii="Arial" w:hAnsi="Arial" w:cs="Arial"/>
-                <w:color w:val="000000" w:themeColor="text1"/>
-              </w:rPr>
-              <w:t>5</w:t>
-            </w:r>
-            <w:r>
-              <w:rPr>
-                <w:rFonts w:ascii="Arial" w:hAnsi="Arial" w:cs="Arial"/>
-                <w:color w:val="000000" w:themeColor="text1"/>
-              </w:rPr>
-              <w:t>}</w:t>
+              <w:t>{ufAL5}</w:t>
             </w:r>
           </w:p>
         </w:tc>
@@ -10081,27 +9440,7 @@
                 <w:sz w:val="18"/>
                 <w:szCs w:val="18"/>
               </w:rPr>
-              <w:t xml:space="preserve">Nome: Marlei de Lima </w:t>
-            </w:r>
-            <w:proofErr w:type="spellStart"/>
-            <w:r>
-              <w:rPr>
-                <w:rFonts w:ascii="Arial" w:hAnsi="Arial" w:cs="Arial"/>
-                <w:color w:val="000000" w:themeColor="text1"/>
-                <w:sz w:val="18"/>
-                <w:szCs w:val="18"/>
-              </w:rPr>
-              <w:t>Nanya</w:t>
-            </w:r>
-            <w:proofErr w:type="spellEnd"/>
-            <w:r>
-              <w:rPr>
-                <w:rFonts w:ascii="Arial" w:hAnsi="Arial" w:cs="Arial"/>
-                <w:color w:val="000000" w:themeColor="text1"/>
-                <w:sz w:val="18"/>
-                <w:szCs w:val="18"/>
-              </w:rPr>
-              <w:t xml:space="preserve"> Felipe</w:t>
+              <w:t>Nome: Marlei de Lima Nanya Felipe</w:t>
             </w:r>
           </w:p>
           <w:p>

</xml_diff>

<commit_message>
Update historico.js to rename 'data' to 'dataAtual' and modify the document to include 'dataAtual' in the certificate section
</commit_message>
<xml_diff>
--- a/modelos/HISTÓRICO ESCOLAR.docx
+++ b/modelos/HISTÓRICO ESCOLAR.docx
@@ -9352,14 +9352,20 @@
               <w:jc w:val="center"/>
               <w:rPr>
                 <w:rFonts w:ascii="Arial" w:hAnsi="Arial" w:cs="Arial"/>
-                <w:b/>
-                <w:bCs/>
                 <w:color w:val="000000" w:themeColor="text1"/>
                 <w:sz w:val="24"/>
                 <w:szCs w:val="24"/>
-                <w:u w:val="single"/>
-              </w:rPr>
-            </w:pPr>
+              </w:rPr>
+            </w:pPr>
+            <w:r>
+              <w:rPr>
+                <w:rFonts w:ascii="Arial" w:hAnsi="Arial" w:cs="Arial"/>
+                <w:color w:val="000000" w:themeColor="text1"/>
+                <w:sz w:val="24"/>
+                <w:szCs w:val="24"/>
+              </w:rPr>
+              <w:t>{dataAtual}</w:t>
+            </w:r>
           </w:p>
           <w:p>
             <w:pPr>

</xml_diff>

<commit_message>
changes: adicao de otimizacao para o total de aulas e adicao de documentos extras
</commit_message>
<xml_diff>
--- a/modelos/HISTÓRICO ESCOLAR.docx
+++ b/modelos/HISTÓRICO ESCOLAR.docx
@@ -696,7 +696,25 @@
                 <w:sz w:val="24"/>
                 <w:szCs w:val="24"/>
               </w:rPr>
-              <w:t>{nomeAluno}</w:t>
+              <w:t>{</w:t>
+            </w:r>
+            <w:proofErr w:type="spellStart"/>
+            <w:r>
+              <w:rPr>
+                <w:rFonts w:ascii="Arial" w:hAnsi="Arial" w:cs="Arial"/>
+                <w:sz w:val="24"/>
+                <w:szCs w:val="24"/>
+              </w:rPr>
+              <w:t>nomeAluno</w:t>
+            </w:r>
+            <w:proofErr w:type="spellEnd"/>
+            <w:r>
+              <w:rPr>
+                <w:rFonts w:ascii="Arial" w:hAnsi="Arial" w:cs="Arial"/>
+                <w:sz w:val="24"/>
+                <w:szCs w:val="24"/>
+              </w:rPr>
+              <w:t>}</w:t>
             </w:r>
           </w:p>
         </w:tc>
@@ -747,7 +765,25 @@
                 <w:sz w:val="24"/>
                 <w:szCs w:val="24"/>
               </w:rPr>
-              <w:t>{raAluno}</w:t>
+              <w:t>{</w:t>
+            </w:r>
+            <w:proofErr w:type="spellStart"/>
+            <w:r>
+              <w:rPr>
+                <w:rFonts w:ascii="Arial" w:hAnsi="Arial" w:cs="Arial"/>
+                <w:sz w:val="24"/>
+                <w:szCs w:val="24"/>
+              </w:rPr>
+              <w:t>raAluno</w:t>
+            </w:r>
+            <w:proofErr w:type="spellEnd"/>
+            <w:r>
+              <w:rPr>
+                <w:rFonts w:ascii="Arial" w:hAnsi="Arial" w:cs="Arial"/>
+                <w:sz w:val="24"/>
+                <w:szCs w:val="24"/>
+              </w:rPr>
+              <w:t>}</w:t>
             </w:r>
           </w:p>
         </w:tc>
@@ -832,7 +868,25 @@
                 <w:sz w:val="24"/>
                 <w:szCs w:val="24"/>
               </w:rPr>
-              <w:t>{municipioNascimento}</w:t>
+              <w:t>{</w:t>
+            </w:r>
+            <w:proofErr w:type="spellStart"/>
+            <w:r>
+              <w:rPr>
+                <w:rFonts w:ascii="Arial" w:hAnsi="Arial" w:cs="Arial"/>
+                <w:sz w:val="24"/>
+                <w:szCs w:val="24"/>
+              </w:rPr>
+              <w:t>municipioNascimento</w:t>
+            </w:r>
+            <w:proofErr w:type="spellEnd"/>
+            <w:r>
+              <w:rPr>
+                <w:rFonts w:ascii="Arial" w:hAnsi="Arial" w:cs="Arial"/>
+                <w:sz w:val="24"/>
+                <w:szCs w:val="24"/>
+              </w:rPr>
+              <w:t>}</w:t>
             </w:r>
           </w:p>
         </w:tc>
@@ -883,7 +937,25 @@
                 <w:sz w:val="24"/>
                 <w:szCs w:val="24"/>
               </w:rPr>
-              <w:t>{ufNascimento}</w:t>
+              <w:t>{</w:t>
+            </w:r>
+            <w:proofErr w:type="spellStart"/>
+            <w:r>
+              <w:rPr>
+                <w:rFonts w:ascii="Arial" w:hAnsi="Arial" w:cs="Arial"/>
+                <w:sz w:val="24"/>
+                <w:szCs w:val="24"/>
+              </w:rPr>
+              <w:t>ufNascimento</w:t>
+            </w:r>
+            <w:proofErr w:type="spellEnd"/>
+            <w:r>
+              <w:rPr>
+                <w:rFonts w:ascii="Arial" w:hAnsi="Arial" w:cs="Arial"/>
+                <w:sz w:val="24"/>
+                <w:szCs w:val="24"/>
+              </w:rPr>
+              <w:t>}</w:t>
             </w:r>
           </w:p>
         </w:tc>
@@ -961,7 +1033,25 @@
                 <w:sz w:val="24"/>
                 <w:szCs w:val="24"/>
               </w:rPr>
-              <w:t>{dataNascimento}</w:t>
+              <w:t>{</w:t>
+            </w:r>
+            <w:proofErr w:type="spellStart"/>
+            <w:r>
+              <w:rPr>
+                <w:rFonts w:ascii="Arial" w:hAnsi="Arial" w:cs="Arial"/>
+                <w:sz w:val="24"/>
+                <w:szCs w:val="24"/>
+              </w:rPr>
+              <w:t>dataNascimento</w:t>
+            </w:r>
+            <w:proofErr w:type="spellEnd"/>
+            <w:r>
+              <w:rPr>
+                <w:rFonts w:ascii="Arial" w:hAnsi="Arial" w:cs="Arial"/>
+                <w:sz w:val="24"/>
+                <w:szCs w:val="24"/>
+              </w:rPr>
+              <w:t>}</w:t>
             </w:r>
           </w:p>
         </w:tc>
@@ -1509,17 +1599,15 @@
                 <w:bCs/>
                 <w:sz w:val="24"/>
                 <w:szCs w:val="24"/>
-                <w:u w:val="single"/>
-              </w:rPr>
-            </w:pPr>
-            <w:r>
-              <w:rPr>
-                <w:rFonts w:ascii="Arial" w:hAnsi="Arial" w:cs="Arial"/>
-                <w:b/>
-                <w:bCs/>
-                <w:sz w:val="24"/>
-                <w:szCs w:val="24"/>
-                <w:u w:val="single"/>
+              </w:rPr>
+            </w:pPr>
+            <w:r>
+              <w:rPr>
+                <w:rFonts w:ascii="Arial" w:hAnsi="Arial" w:cs="Arial"/>
+                <w:b/>
+                <w:bCs/>
+                <w:sz w:val="24"/>
+                <w:szCs w:val="24"/>
               </w:rPr>
               <w:t>{al1}</w:t>
             </w:r>
@@ -1539,17 +1627,15 @@
                 <w:bCs/>
                 <w:sz w:val="24"/>
                 <w:szCs w:val="24"/>
-                <w:u w:val="single"/>
-              </w:rPr>
-            </w:pPr>
-            <w:r>
-              <w:rPr>
-                <w:rFonts w:ascii="Arial" w:hAnsi="Arial" w:cs="Arial"/>
-                <w:b/>
-                <w:bCs/>
-                <w:sz w:val="24"/>
-                <w:szCs w:val="24"/>
-                <w:u w:val="single"/>
+              </w:rPr>
+            </w:pPr>
+            <w:r>
+              <w:rPr>
+                <w:rFonts w:ascii="Arial" w:hAnsi="Arial" w:cs="Arial"/>
+                <w:b/>
+                <w:bCs/>
+                <w:sz w:val="24"/>
+                <w:szCs w:val="24"/>
               </w:rPr>
               <w:t>{al2}</w:t>
             </w:r>
@@ -1569,41 +1655,17 @@
                 <w:bCs/>
                 <w:sz w:val="24"/>
                 <w:szCs w:val="24"/>
-                <w:u w:val="single"/>
-              </w:rPr>
-            </w:pPr>
-            <w:r>
-              <w:rPr>
-                <w:rFonts w:ascii="Arial" w:hAnsi="Arial" w:cs="Arial"/>
-                <w:b/>
-                <w:bCs/>
-                <w:sz w:val="24"/>
-                <w:szCs w:val="24"/>
-                <w:u w:val="single"/>
-              </w:rPr>
-              <w:t>{al</w:t>
-            </w:r>
-            <w:r>
-              <w:rPr>
-                <w:rFonts w:ascii="Arial" w:hAnsi="Arial" w:cs="Arial"/>
-                <w:b/>
-                <w:bCs/>
-                <w:sz w:val="24"/>
-                <w:szCs w:val="24"/>
-                <w:u w:val="single"/>
-              </w:rPr>
-              <w:t>3</w:t>
-            </w:r>
-            <w:r>
-              <w:rPr>
-                <w:rFonts w:ascii="Arial" w:hAnsi="Arial" w:cs="Arial"/>
-                <w:b/>
-                <w:bCs/>
-                <w:sz w:val="24"/>
-                <w:szCs w:val="24"/>
-                <w:u w:val="single"/>
-              </w:rPr>
-              <w:t>}</w:t>
+              </w:rPr>
+            </w:pPr>
+            <w:r>
+              <w:rPr>
+                <w:rFonts w:ascii="Arial" w:hAnsi="Arial" w:cs="Arial"/>
+                <w:b/>
+                <w:bCs/>
+                <w:sz w:val="24"/>
+                <w:szCs w:val="24"/>
+              </w:rPr>
+              <w:t>{al3}</w:t>
             </w:r>
           </w:p>
         </w:tc>
@@ -1621,41 +1683,17 @@
                 <w:bCs/>
                 <w:sz w:val="24"/>
                 <w:szCs w:val="24"/>
-                <w:u w:val="single"/>
-              </w:rPr>
-            </w:pPr>
-            <w:r>
-              <w:rPr>
-                <w:rFonts w:ascii="Arial" w:hAnsi="Arial" w:cs="Arial"/>
-                <w:b/>
-                <w:bCs/>
-                <w:sz w:val="24"/>
-                <w:szCs w:val="24"/>
-                <w:u w:val="single"/>
-              </w:rPr>
-              <w:t>{al</w:t>
-            </w:r>
-            <w:r>
-              <w:rPr>
-                <w:rFonts w:ascii="Arial" w:hAnsi="Arial" w:cs="Arial"/>
-                <w:b/>
-                <w:bCs/>
-                <w:sz w:val="24"/>
-                <w:szCs w:val="24"/>
-                <w:u w:val="single"/>
-              </w:rPr>
-              <w:t>4</w:t>
-            </w:r>
-            <w:r>
-              <w:rPr>
-                <w:rFonts w:ascii="Arial" w:hAnsi="Arial" w:cs="Arial"/>
-                <w:b/>
-                <w:bCs/>
-                <w:sz w:val="24"/>
-                <w:szCs w:val="24"/>
-                <w:u w:val="single"/>
-              </w:rPr>
-              <w:t>}</w:t>
+              </w:rPr>
+            </w:pPr>
+            <w:r>
+              <w:rPr>
+                <w:rFonts w:ascii="Arial" w:hAnsi="Arial" w:cs="Arial"/>
+                <w:b/>
+                <w:bCs/>
+                <w:sz w:val="24"/>
+                <w:szCs w:val="24"/>
+              </w:rPr>
+              <w:t>{al4}</w:t>
             </w:r>
           </w:p>
         </w:tc>
@@ -1673,41 +1711,17 @@
                 <w:bCs/>
                 <w:sz w:val="24"/>
                 <w:szCs w:val="24"/>
-                <w:u w:val="single"/>
-              </w:rPr>
-            </w:pPr>
-            <w:r>
-              <w:rPr>
-                <w:rFonts w:ascii="Arial" w:hAnsi="Arial" w:cs="Arial"/>
-                <w:b/>
-                <w:bCs/>
-                <w:sz w:val="24"/>
-                <w:szCs w:val="24"/>
-                <w:u w:val="single"/>
-              </w:rPr>
-              <w:t>{al</w:t>
-            </w:r>
-            <w:r>
-              <w:rPr>
-                <w:rFonts w:ascii="Arial" w:hAnsi="Arial" w:cs="Arial"/>
-                <w:b/>
-                <w:bCs/>
-                <w:sz w:val="24"/>
-                <w:szCs w:val="24"/>
-                <w:u w:val="single"/>
-              </w:rPr>
-              <w:t>5</w:t>
-            </w:r>
-            <w:r>
-              <w:rPr>
-                <w:rFonts w:ascii="Arial" w:hAnsi="Arial" w:cs="Arial"/>
-                <w:b/>
-                <w:bCs/>
-                <w:sz w:val="24"/>
-                <w:szCs w:val="24"/>
-                <w:u w:val="single"/>
-              </w:rPr>
-              <w:t>}</w:t>
+              </w:rPr>
+            </w:pPr>
+            <w:r>
+              <w:rPr>
+                <w:rFonts w:ascii="Arial" w:hAnsi="Arial" w:cs="Arial"/>
+                <w:b/>
+                <w:bCs/>
+                <w:sz w:val="24"/>
+                <w:szCs w:val="24"/>
+              </w:rPr>
+              <w:t>{al5}</w:t>
             </w:r>
           </w:p>
         </w:tc>
@@ -1986,17 +2000,15 @@
                 <w:bCs/>
                 <w:sz w:val="24"/>
                 <w:szCs w:val="24"/>
-                <w:u w:val="single"/>
-              </w:rPr>
-            </w:pPr>
-            <w:r>
-              <w:rPr>
-                <w:rFonts w:ascii="Arial" w:hAnsi="Arial" w:cs="Arial"/>
-                <w:b/>
-                <w:bCs/>
-                <w:sz w:val="24"/>
-                <w:szCs w:val="24"/>
-                <w:u w:val="single"/>
+              </w:rPr>
+            </w:pPr>
+            <w:r>
+              <w:rPr>
+                <w:rFonts w:ascii="Arial" w:hAnsi="Arial" w:cs="Arial"/>
+                <w:b/>
+                <w:bCs/>
+                <w:sz w:val="24"/>
+                <w:szCs w:val="24"/>
               </w:rPr>
               <w:t>{lpAl1}</w:t>
             </w:r>
@@ -2016,17 +2028,15 @@
                 <w:bCs/>
                 <w:sz w:val="24"/>
                 <w:szCs w:val="24"/>
-                <w:u w:val="single"/>
-              </w:rPr>
-            </w:pPr>
-            <w:r>
-              <w:rPr>
-                <w:rFonts w:ascii="Arial" w:hAnsi="Arial" w:cs="Arial"/>
-                <w:b/>
-                <w:bCs/>
-                <w:sz w:val="24"/>
-                <w:szCs w:val="24"/>
-                <w:u w:val="single"/>
+              </w:rPr>
+            </w:pPr>
+            <w:r>
+              <w:rPr>
+                <w:rFonts w:ascii="Arial" w:hAnsi="Arial" w:cs="Arial"/>
+                <w:b/>
+                <w:bCs/>
+                <w:sz w:val="24"/>
+                <w:szCs w:val="24"/>
               </w:rPr>
               <w:t>{lpAl2}</w:t>
             </w:r>
@@ -2046,17 +2056,15 @@
                 <w:bCs/>
                 <w:sz w:val="24"/>
                 <w:szCs w:val="24"/>
-                <w:u w:val="single"/>
-              </w:rPr>
-            </w:pPr>
-            <w:r>
-              <w:rPr>
-                <w:rFonts w:ascii="Arial" w:hAnsi="Arial" w:cs="Arial"/>
-                <w:b/>
-                <w:bCs/>
-                <w:sz w:val="24"/>
-                <w:szCs w:val="24"/>
-                <w:u w:val="single"/>
+              </w:rPr>
+            </w:pPr>
+            <w:r>
+              <w:rPr>
+                <w:rFonts w:ascii="Arial" w:hAnsi="Arial" w:cs="Arial"/>
+                <w:b/>
+                <w:bCs/>
+                <w:sz w:val="24"/>
+                <w:szCs w:val="24"/>
               </w:rPr>
               <w:t>{lpAl2}</w:t>
             </w:r>
@@ -2076,17 +2084,15 @@
                 <w:bCs/>
                 <w:sz w:val="24"/>
                 <w:szCs w:val="24"/>
-                <w:u w:val="single"/>
-              </w:rPr>
-            </w:pPr>
-            <w:r>
-              <w:rPr>
-                <w:rFonts w:ascii="Arial" w:hAnsi="Arial" w:cs="Arial"/>
-                <w:b/>
-                <w:bCs/>
-                <w:sz w:val="24"/>
-                <w:szCs w:val="24"/>
-                <w:u w:val="single"/>
+              </w:rPr>
+            </w:pPr>
+            <w:r>
+              <w:rPr>
+                <w:rFonts w:ascii="Arial" w:hAnsi="Arial" w:cs="Arial"/>
+                <w:b/>
+                <w:bCs/>
+                <w:sz w:val="24"/>
+                <w:szCs w:val="24"/>
               </w:rPr>
               <w:t>{lpAl2}</w:t>
             </w:r>
@@ -2106,17 +2112,15 @@
                 <w:bCs/>
                 <w:sz w:val="24"/>
                 <w:szCs w:val="24"/>
-                <w:u w:val="single"/>
-              </w:rPr>
-            </w:pPr>
-            <w:r>
-              <w:rPr>
-                <w:rFonts w:ascii="Arial" w:hAnsi="Arial" w:cs="Arial"/>
-                <w:b/>
-                <w:bCs/>
-                <w:sz w:val="24"/>
-                <w:szCs w:val="24"/>
-                <w:u w:val="single"/>
+              </w:rPr>
+            </w:pPr>
+            <w:r>
+              <w:rPr>
+                <w:rFonts w:ascii="Arial" w:hAnsi="Arial" w:cs="Arial"/>
+                <w:b/>
+                <w:bCs/>
+                <w:sz w:val="24"/>
+                <w:szCs w:val="24"/>
               </w:rPr>
               <w:t>{lpAl2}</w:t>
             </w:r>
@@ -2219,17 +2223,15 @@
                 <w:bCs/>
                 <w:sz w:val="24"/>
                 <w:szCs w:val="24"/>
-                <w:u w:val="single"/>
-              </w:rPr>
-            </w:pPr>
-            <w:r>
-              <w:rPr>
-                <w:rFonts w:ascii="Arial" w:hAnsi="Arial" w:cs="Arial"/>
-                <w:b/>
-                <w:bCs/>
-                <w:sz w:val="24"/>
-                <w:szCs w:val="24"/>
-                <w:u w:val="single"/>
+              </w:rPr>
+            </w:pPr>
+            <w:r>
+              <w:rPr>
+                <w:rFonts w:ascii="Arial" w:hAnsi="Arial" w:cs="Arial"/>
+                <w:b/>
+                <w:bCs/>
+                <w:sz w:val="24"/>
+                <w:szCs w:val="24"/>
               </w:rPr>
               <w:t>{aAl1}</w:t>
             </w:r>
@@ -2249,17 +2251,15 @@
                 <w:bCs/>
                 <w:sz w:val="24"/>
                 <w:szCs w:val="24"/>
-                <w:u w:val="single"/>
-              </w:rPr>
-            </w:pPr>
-            <w:r>
-              <w:rPr>
-                <w:rFonts w:ascii="Arial" w:hAnsi="Arial" w:cs="Arial"/>
-                <w:b/>
-                <w:bCs/>
-                <w:sz w:val="24"/>
-                <w:szCs w:val="24"/>
-                <w:u w:val="single"/>
+              </w:rPr>
+            </w:pPr>
+            <w:r>
+              <w:rPr>
+                <w:rFonts w:ascii="Arial" w:hAnsi="Arial" w:cs="Arial"/>
+                <w:b/>
+                <w:bCs/>
+                <w:sz w:val="24"/>
+                <w:szCs w:val="24"/>
               </w:rPr>
               <w:t>{aAl2}</w:t>
             </w:r>
@@ -2279,17 +2279,15 @@
                 <w:bCs/>
                 <w:sz w:val="24"/>
                 <w:szCs w:val="24"/>
-                <w:u w:val="single"/>
-              </w:rPr>
-            </w:pPr>
-            <w:r>
-              <w:rPr>
-                <w:rFonts w:ascii="Arial" w:hAnsi="Arial" w:cs="Arial"/>
-                <w:b/>
-                <w:bCs/>
-                <w:sz w:val="24"/>
-                <w:szCs w:val="24"/>
-                <w:u w:val="single"/>
+              </w:rPr>
+            </w:pPr>
+            <w:r>
+              <w:rPr>
+                <w:rFonts w:ascii="Arial" w:hAnsi="Arial" w:cs="Arial"/>
+                <w:b/>
+                <w:bCs/>
+                <w:sz w:val="24"/>
+                <w:szCs w:val="24"/>
               </w:rPr>
               <w:t>{aAl3}</w:t>
             </w:r>
@@ -2309,17 +2307,15 @@
                 <w:bCs/>
                 <w:sz w:val="24"/>
                 <w:szCs w:val="24"/>
-                <w:u w:val="single"/>
-              </w:rPr>
-            </w:pPr>
-            <w:r>
-              <w:rPr>
-                <w:rFonts w:ascii="Arial" w:hAnsi="Arial" w:cs="Arial"/>
-                <w:b/>
-                <w:bCs/>
-                <w:sz w:val="24"/>
-                <w:szCs w:val="24"/>
-                <w:u w:val="single"/>
+              </w:rPr>
+            </w:pPr>
+            <w:r>
+              <w:rPr>
+                <w:rFonts w:ascii="Arial" w:hAnsi="Arial" w:cs="Arial"/>
+                <w:b/>
+                <w:bCs/>
+                <w:sz w:val="24"/>
+                <w:szCs w:val="24"/>
               </w:rPr>
               <w:t>{aAl4}</w:t>
             </w:r>
@@ -2339,17 +2335,15 @@
                 <w:bCs/>
                 <w:sz w:val="24"/>
                 <w:szCs w:val="24"/>
-                <w:u w:val="single"/>
-              </w:rPr>
-            </w:pPr>
-            <w:r>
-              <w:rPr>
-                <w:rFonts w:ascii="Arial" w:hAnsi="Arial" w:cs="Arial"/>
-                <w:b/>
-                <w:bCs/>
-                <w:sz w:val="24"/>
-                <w:szCs w:val="24"/>
-                <w:u w:val="single"/>
+              </w:rPr>
+            </w:pPr>
+            <w:r>
+              <w:rPr>
+                <w:rFonts w:ascii="Arial" w:hAnsi="Arial" w:cs="Arial"/>
+                <w:b/>
+                <w:bCs/>
+                <w:sz w:val="24"/>
+                <w:szCs w:val="24"/>
               </w:rPr>
               <w:t>{aAl5}</w:t>
             </w:r>
@@ -2452,17 +2446,15 @@
                 <w:bCs/>
                 <w:sz w:val="24"/>
                 <w:szCs w:val="24"/>
-                <w:u w:val="single"/>
-              </w:rPr>
-            </w:pPr>
-            <w:r>
-              <w:rPr>
-                <w:rFonts w:ascii="Arial" w:hAnsi="Arial" w:cs="Arial"/>
-                <w:b/>
-                <w:bCs/>
-                <w:sz w:val="24"/>
-                <w:szCs w:val="24"/>
-                <w:u w:val="single"/>
+              </w:rPr>
+            </w:pPr>
+            <w:r>
+              <w:rPr>
+                <w:rFonts w:ascii="Arial" w:hAnsi="Arial" w:cs="Arial"/>
+                <w:b/>
+                <w:bCs/>
+                <w:sz w:val="24"/>
+                <w:szCs w:val="24"/>
               </w:rPr>
               <w:t>{efAl1}</w:t>
             </w:r>
@@ -2482,17 +2474,15 @@
                 <w:bCs/>
                 <w:sz w:val="24"/>
                 <w:szCs w:val="24"/>
-                <w:u w:val="single"/>
-              </w:rPr>
-            </w:pPr>
-            <w:r>
-              <w:rPr>
-                <w:rFonts w:ascii="Arial" w:hAnsi="Arial" w:cs="Arial"/>
-                <w:b/>
-                <w:bCs/>
-                <w:sz w:val="24"/>
-                <w:szCs w:val="24"/>
-                <w:u w:val="single"/>
+              </w:rPr>
+            </w:pPr>
+            <w:r>
+              <w:rPr>
+                <w:rFonts w:ascii="Arial" w:hAnsi="Arial" w:cs="Arial"/>
+                <w:b/>
+                <w:bCs/>
+                <w:sz w:val="24"/>
+                <w:szCs w:val="24"/>
               </w:rPr>
               <w:t>{efAl2}</w:t>
             </w:r>
@@ -2512,17 +2502,15 @@
                 <w:bCs/>
                 <w:sz w:val="24"/>
                 <w:szCs w:val="24"/>
-                <w:u w:val="single"/>
-              </w:rPr>
-            </w:pPr>
-            <w:r>
-              <w:rPr>
-                <w:rFonts w:ascii="Arial" w:hAnsi="Arial" w:cs="Arial"/>
-                <w:b/>
-                <w:bCs/>
-                <w:sz w:val="24"/>
-                <w:szCs w:val="24"/>
-                <w:u w:val="single"/>
+              </w:rPr>
+            </w:pPr>
+            <w:r>
+              <w:rPr>
+                <w:rFonts w:ascii="Arial" w:hAnsi="Arial" w:cs="Arial"/>
+                <w:b/>
+                <w:bCs/>
+                <w:sz w:val="24"/>
+                <w:szCs w:val="24"/>
               </w:rPr>
               <w:t>{efAl3}</w:t>
             </w:r>
@@ -2542,17 +2530,15 @@
                 <w:bCs/>
                 <w:sz w:val="24"/>
                 <w:szCs w:val="24"/>
-                <w:u w:val="single"/>
-              </w:rPr>
-            </w:pPr>
-            <w:r>
-              <w:rPr>
-                <w:rFonts w:ascii="Arial" w:hAnsi="Arial" w:cs="Arial"/>
-                <w:b/>
-                <w:bCs/>
-                <w:sz w:val="24"/>
-                <w:szCs w:val="24"/>
-                <w:u w:val="single"/>
+              </w:rPr>
+            </w:pPr>
+            <w:r>
+              <w:rPr>
+                <w:rFonts w:ascii="Arial" w:hAnsi="Arial" w:cs="Arial"/>
+                <w:b/>
+                <w:bCs/>
+                <w:sz w:val="24"/>
+                <w:szCs w:val="24"/>
               </w:rPr>
               <w:t>{efAl4}</w:t>
             </w:r>
@@ -2572,17 +2558,15 @@
                 <w:bCs/>
                 <w:sz w:val="24"/>
                 <w:szCs w:val="24"/>
-                <w:u w:val="single"/>
-              </w:rPr>
-            </w:pPr>
-            <w:r>
-              <w:rPr>
-                <w:rFonts w:ascii="Arial" w:hAnsi="Arial" w:cs="Arial"/>
-                <w:b/>
-                <w:bCs/>
-                <w:sz w:val="24"/>
-                <w:szCs w:val="24"/>
-                <w:u w:val="single"/>
+              </w:rPr>
+            </w:pPr>
+            <w:r>
+              <w:rPr>
+                <w:rFonts w:ascii="Arial" w:hAnsi="Arial" w:cs="Arial"/>
+                <w:b/>
+                <w:bCs/>
+                <w:sz w:val="24"/>
+                <w:szCs w:val="24"/>
               </w:rPr>
               <w:t>{efAl5}</w:t>
             </w:r>
@@ -2685,17 +2669,15 @@
                 <w:bCs/>
                 <w:sz w:val="24"/>
                 <w:szCs w:val="24"/>
-                <w:u w:val="single"/>
-              </w:rPr>
-            </w:pPr>
-            <w:r>
-              <w:rPr>
-                <w:rFonts w:ascii="Arial" w:hAnsi="Arial" w:cs="Arial"/>
-                <w:b/>
-                <w:bCs/>
-                <w:sz w:val="24"/>
-                <w:szCs w:val="24"/>
-                <w:u w:val="single"/>
+              </w:rPr>
+            </w:pPr>
+            <w:r>
+              <w:rPr>
+                <w:rFonts w:ascii="Arial" w:hAnsi="Arial" w:cs="Arial"/>
+                <w:b/>
+                <w:bCs/>
+                <w:sz w:val="24"/>
+                <w:szCs w:val="24"/>
               </w:rPr>
               <w:t>{hAl1}</w:t>
             </w:r>
@@ -2715,17 +2697,15 @@
                 <w:bCs/>
                 <w:sz w:val="24"/>
                 <w:szCs w:val="24"/>
-                <w:u w:val="single"/>
-              </w:rPr>
-            </w:pPr>
-            <w:r>
-              <w:rPr>
-                <w:rFonts w:ascii="Arial" w:hAnsi="Arial" w:cs="Arial"/>
-                <w:b/>
-                <w:bCs/>
-                <w:sz w:val="24"/>
-                <w:szCs w:val="24"/>
-                <w:u w:val="single"/>
+              </w:rPr>
+            </w:pPr>
+            <w:r>
+              <w:rPr>
+                <w:rFonts w:ascii="Arial" w:hAnsi="Arial" w:cs="Arial"/>
+                <w:b/>
+                <w:bCs/>
+                <w:sz w:val="24"/>
+                <w:szCs w:val="24"/>
               </w:rPr>
               <w:t>{hAl2}</w:t>
             </w:r>
@@ -2745,17 +2725,15 @@
                 <w:bCs/>
                 <w:sz w:val="24"/>
                 <w:szCs w:val="24"/>
-                <w:u w:val="single"/>
-              </w:rPr>
-            </w:pPr>
-            <w:r>
-              <w:rPr>
-                <w:rFonts w:ascii="Arial" w:hAnsi="Arial" w:cs="Arial"/>
-                <w:b/>
-                <w:bCs/>
-                <w:sz w:val="24"/>
-                <w:szCs w:val="24"/>
-                <w:u w:val="single"/>
+              </w:rPr>
+            </w:pPr>
+            <w:r>
+              <w:rPr>
+                <w:rFonts w:ascii="Arial" w:hAnsi="Arial" w:cs="Arial"/>
+                <w:b/>
+                <w:bCs/>
+                <w:sz w:val="24"/>
+                <w:szCs w:val="24"/>
               </w:rPr>
               <w:t>{hAl3}</w:t>
             </w:r>
@@ -2775,17 +2753,15 @@
                 <w:bCs/>
                 <w:sz w:val="24"/>
                 <w:szCs w:val="24"/>
-                <w:u w:val="single"/>
-              </w:rPr>
-            </w:pPr>
-            <w:r>
-              <w:rPr>
-                <w:rFonts w:ascii="Arial" w:hAnsi="Arial" w:cs="Arial"/>
-                <w:b/>
-                <w:bCs/>
-                <w:sz w:val="24"/>
-                <w:szCs w:val="24"/>
-                <w:u w:val="single"/>
+              </w:rPr>
+            </w:pPr>
+            <w:r>
+              <w:rPr>
+                <w:rFonts w:ascii="Arial" w:hAnsi="Arial" w:cs="Arial"/>
+                <w:b/>
+                <w:bCs/>
+                <w:sz w:val="24"/>
+                <w:szCs w:val="24"/>
               </w:rPr>
               <w:t>{hAl4}</w:t>
             </w:r>
@@ -2805,17 +2781,15 @@
                 <w:bCs/>
                 <w:sz w:val="24"/>
                 <w:szCs w:val="24"/>
-                <w:u w:val="single"/>
-              </w:rPr>
-            </w:pPr>
-            <w:r>
-              <w:rPr>
-                <w:rFonts w:ascii="Arial" w:hAnsi="Arial" w:cs="Arial"/>
-                <w:b/>
-                <w:bCs/>
-                <w:sz w:val="24"/>
-                <w:szCs w:val="24"/>
-                <w:u w:val="single"/>
+              </w:rPr>
+            </w:pPr>
+            <w:r>
+              <w:rPr>
+                <w:rFonts w:ascii="Arial" w:hAnsi="Arial" w:cs="Arial"/>
+                <w:b/>
+                <w:bCs/>
+                <w:sz w:val="24"/>
+                <w:szCs w:val="24"/>
               </w:rPr>
               <w:t>{hAl5}</w:t>
             </w:r>
@@ -2918,17 +2892,15 @@
                 <w:bCs/>
                 <w:sz w:val="24"/>
                 <w:szCs w:val="24"/>
-                <w:u w:val="single"/>
-              </w:rPr>
-            </w:pPr>
-            <w:r>
-              <w:rPr>
-                <w:rFonts w:ascii="Arial" w:hAnsi="Arial" w:cs="Arial"/>
-                <w:b/>
-                <w:bCs/>
-                <w:sz w:val="24"/>
-                <w:szCs w:val="24"/>
-                <w:u w:val="single"/>
+              </w:rPr>
+            </w:pPr>
+            <w:r>
+              <w:rPr>
+                <w:rFonts w:ascii="Arial" w:hAnsi="Arial" w:cs="Arial"/>
+                <w:b/>
+                <w:bCs/>
+                <w:sz w:val="24"/>
+                <w:szCs w:val="24"/>
               </w:rPr>
               <w:t>{gAl1}</w:t>
             </w:r>
@@ -2948,17 +2920,15 @@
                 <w:bCs/>
                 <w:sz w:val="24"/>
                 <w:szCs w:val="24"/>
-                <w:u w:val="single"/>
-              </w:rPr>
-            </w:pPr>
-            <w:r>
-              <w:rPr>
-                <w:rFonts w:ascii="Arial" w:hAnsi="Arial" w:cs="Arial"/>
-                <w:b/>
-                <w:bCs/>
-                <w:sz w:val="24"/>
-                <w:szCs w:val="24"/>
-                <w:u w:val="single"/>
+              </w:rPr>
+            </w:pPr>
+            <w:r>
+              <w:rPr>
+                <w:rFonts w:ascii="Arial" w:hAnsi="Arial" w:cs="Arial"/>
+                <w:b/>
+                <w:bCs/>
+                <w:sz w:val="24"/>
+                <w:szCs w:val="24"/>
               </w:rPr>
               <w:t>{gAl2}</w:t>
             </w:r>
@@ -2978,17 +2948,15 @@
                 <w:bCs/>
                 <w:sz w:val="24"/>
                 <w:szCs w:val="24"/>
-                <w:u w:val="single"/>
-              </w:rPr>
-            </w:pPr>
-            <w:r>
-              <w:rPr>
-                <w:rFonts w:ascii="Arial" w:hAnsi="Arial" w:cs="Arial"/>
-                <w:b/>
-                <w:bCs/>
-                <w:sz w:val="24"/>
-                <w:szCs w:val="24"/>
-                <w:u w:val="single"/>
+              </w:rPr>
+            </w:pPr>
+            <w:r>
+              <w:rPr>
+                <w:rFonts w:ascii="Arial" w:hAnsi="Arial" w:cs="Arial"/>
+                <w:b/>
+                <w:bCs/>
+                <w:sz w:val="24"/>
+                <w:szCs w:val="24"/>
               </w:rPr>
               <w:t>{gAl3}</w:t>
             </w:r>
@@ -3008,17 +2976,15 @@
                 <w:bCs/>
                 <w:sz w:val="24"/>
                 <w:szCs w:val="24"/>
-                <w:u w:val="single"/>
-              </w:rPr>
-            </w:pPr>
-            <w:r>
-              <w:rPr>
-                <w:rFonts w:ascii="Arial" w:hAnsi="Arial" w:cs="Arial"/>
-                <w:b/>
-                <w:bCs/>
-                <w:sz w:val="24"/>
-                <w:szCs w:val="24"/>
-                <w:u w:val="single"/>
+              </w:rPr>
+            </w:pPr>
+            <w:r>
+              <w:rPr>
+                <w:rFonts w:ascii="Arial" w:hAnsi="Arial" w:cs="Arial"/>
+                <w:b/>
+                <w:bCs/>
+                <w:sz w:val="24"/>
+                <w:szCs w:val="24"/>
               </w:rPr>
               <w:t>{gAl4}</w:t>
             </w:r>
@@ -3038,17 +3004,15 @@
                 <w:bCs/>
                 <w:sz w:val="24"/>
                 <w:szCs w:val="24"/>
-                <w:u w:val="single"/>
-              </w:rPr>
-            </w:pPr>
-            <w:r>
-              <w:rPr>
-                <w:rFonts w:ascii="Arial" w:hAnsi="Arial" w:cs="Arial"/>
-                <w:b/>
-                <w:bCs/>
-                <w:sz w:val="24"/>
-                <w:szCs w:val="24"/>
-                <w:u w:val="single"/>
+              </w:rPr>
+            </w:pPr>
+            <w:r>
+              <w:rPr>
+                <w:rFonts w:ascii="Arial" w:hAnsi="Arial" w:cs="Arial"/>
+                <w:b/>
+                <w:bCs/>
+                <w:sz w:val="24"/>
+                <w:szCs w:val="24"/>
               </w:rPr>
               <w:t>{gAl5}</w:t>
             </w:r>
@@ -3151,17 +3115,15 @@
                 <w:bCs/>
                 <w:sz w:val="24"/>
                 <w:szCs w:val="24"/>
-                <w:u w:val="single"/>
-              </w:rPr>
-            </w:pPr>
-            <w:r>
-              <w:rPr>
-                <w:rFonts w:ascii="Arial" w:hAnsi="Arial" w:cs="Arial"/>
-                <w:b/>
-                <w:bCs/>
-                <w:sz w:val="24"/>
-                <w:szCs w:val="24"/>
-                <w:u w:val="single"/>
+              </w:rPr>
+            </w:pPr>
+            <w:r>
+              <w:rPr>
+                <w:rFonts w:ascii="Arial" w:hAnsi="Arial" w:cs="Arial"/>
+                <w:b/>
+                <w:bCs/>
+                <w:sz w:val="24"/>
+                <w:szCs w:val="24"/>
               </w:rPr>
               <w:t>{mAl1}</w:t>
             </w:r>
@@ -3181,17 +3143,15 @@
                 <w:bCs/>
                 <w:sz w:val="24"/>
                 <w:szCs w:val="24"/>
-                <w:u w:val="single"/>
-              </w:rPr>
-            </w:pPr>
-            <w:r>
-              <w:rPr>
-                <w:rFonts w:ascii="Arial" w:hAnsi="Arial" w:cs="Arial"/>
-                <w:b/>
-                <w:bCs/>
-                <w:sz w:val="24"/>
-                <w:szCs w:val="24"/>
-                <w:u w:val="single"/>
+              </w:rPr>
+            </w:pPr>
+            <w:r>
+              <w:rPr>
+                <w:rFonts w:ascii="Arial" w:hAnsi="Arial" w:cs="Arial"/>
+                <w:b/>
+                <w:bCs/>
+                <w:sz w:val="24"/>
+                <w:szCs w:val="24"/>
               </w:rPr>
               <w:t>{mAl</w:t>
             </w:r>
@@ -3202,7 +3162,6 @@
                 <w:bCs/>
                 <w:sz w:val="24"/>
                 <w:szCs w:val="24"/>
-                <w:u w:val="single"/>
               </w:rPr>
               <w:t>2</w:t>
             </w:r>
@@ -3213,7 +3172,6 @@
                 <w:bCs/>
                 <w:sz w:val="24"/>
                 <w:szCs w:val="24"/>
-                <w:u w:val="single"/>
               </w:rPr>
               <w:t>}</w:t>
             </w:r>
@@ -3233,17 +3191,15 @@
                 <w:bCs/>
                 <w:sz w:val="24"/>
                 <w:szCs w:val="24"/>
-                <w:u w:val="single"/>
-              </w:rPr>
-            </w:pPr>
-            <w:r>
-              <w:rPr>
-                <w:rFonts w:ascii="Arial" w:hAnsi="Arial" w:cs="Arial"/>
-                <w:b/>
-                <w:bCs/>
-                <w:sz w:val="24"/>
-                <w:szCs w:val="24"/>
-                <w:u w:val="single"/>
+              </w:rPr>
+            </w:pPr>
+            <w:r>
+              <w:rPr>
+                <w:rFonts w:ascii="Arial" w:hAnsi="Arial" w:cs="Arial"/>
+                <w:b/>
+                <w:bCs/>
+                <w:sz w:val="24"/>
+                <w:szCs w:val="24"/>
               </w:rPr>
               <w:t>{mAl</w:t>
             </w:r>
@@ -3254,7 +3210,6 @@
                 <w:bCs/>
                 <w:sz w:val="24"/>
                 <w:szCs w:val="24"/>
-                <w:u w:val="single"/>
               </w:rPr>
               <w:t>3</w:t>
             </w:r>
@@ -3265,7 +3220,6 @@
                 <w:bCs/>
                 <w:sz w:val="24"/>
                 <w:szCs w:val="24"/>
-                <w:u w:val="single"/>
               </w:rPr>
               <w:t>}</w:t>
             </w:r>
@@ -3285,17 +3239,15 @@
                 <w:bCs/>
                 <w:sz w:val="24"/>
                 <w:szCs w:val="24"/>
-                <w:u w:val="single"/>
-              </w:rPr>
-            </w:pPr>
-            <w:r>
-              <w:rPr>
-                <w:rFonts w:ascii="Arial" w:hAnsi="Arial" w:cs="Arial"/>
-                <w:b/>
-                <w:bCs/>
-                <w:sz w:val="24"/>
-                <w:szCs w:val="24"/>
-                <w:u w:val="single"/>
+              </w:rPr>
+            </w:pPr>
+            <w:r>
+              <w:rPr>
+                <w:rFonts w:ascii="Arial" w:hAnsi="Arial" w:cs="Arial"/>
+                <w:b/>
+                <w:bCs/>
+                <w:sz w:val="24"/>
+                <w:szCs w:val="24"/>
               </w:rPr>
               <w:t>{mAl</w:t>
             </w:r>
@@ -3306,7 +3258,6 @@
                 <w:bCs/>
                 <w:sz w:val="24"/>
                 <w:szCs w:val="24"/>
-                <w:u w:val="single"/>
               </w:rPr>
               <w:t>4</w:t>
             </w:r>
@@ -3317,7 +3268,6 @@
                 <w:bCs/>
                 <w:sz w:val="24"/>
                 <w:szCs w:val="24"/>
-                <w:u w:val="single"/>
               </w:rPr>
               <w:t>}</w:t>
             </w:r>
@@ -3337,17 +3287,15 @@
                 <w:bCs/>
                 <w:sz w:val="24"/>
                 <w:szCs w:val="24"/>
-                <w:u w:val="single"/>
-              </w:rPr>
-            </w:pPr>
-            <w:r>
-              <w:rPr>
-                <w:rFonts w:ascii="Arial" w:hAnsi="Arial" w:cs="Arial"/>
-                <w:b/>
-                <w:bCs/>
-                <w:sz w:val="24"/>
-                <w:szCs w:val="24"/>
-                <w:u w:val="single"/>
+              </w:rPr>
+            </w:pPr>
+            <w:r>
+              <w:rPr>
+                <w:rFonts w:ascii="Arial" w:hAnsi="Arial" w:cs="Arial"/>
+                <w:b/>
+                <w:bCs/>
+                <w:sz w:val="24"/>
+                <w:szCs w:val="24"/>
               </w:rPr>
               <w:t>{mAl</w:t>
             </w:r>
@@ -3358,7 +3306,6 @@
                 <w:bCs/>
                 <w:sz w:val="24"/>
                 <w:szCs w:val="24"/>
-                <w:u w:val="single"/>
               </w:rPr>
               <w:t>5</w:t>
             </w:r>
@@ -3369,7 +3316,6 @@
                 <w:bCs/>
                 <w:sz w:val="24"/>
                 <w:szCs w:val="24"/>
-                <w:u w:val="single"/>
               </w:rPr>
               <w:t>}</w:t>
             </w:r>
@@ -3472,17 +3418,15 @@
                 <w:bCs/>
                 <w:sz w:val="24"/>
                 <w:szCs w:val="24"/>
-                <w:u w:val="single"/>
-              </w:rPr>
-            </w:pPr>
-            <w:r>
-              <w:rPr>
-                <w:rFonts w:ascii="Arial" w:hAnsi="Arial" w:cs="Arial"/>
-                <w:b/>
-                <w:bCs/>
-                <w:sz w:val="24"/>
-                <w:szCs w:val="24"/>
-                <w:u w:val="single"/>
+              </w:rPr>
+            </w:pPr>
+            <w:r>
+              <w:rPr>
+                <w:rFonts w:ascii="Arial" w:hAnsi="Arial" w:cs="Arial"/>
+                <w:b/>
+                <w:bCs/>
+                <w:sz w:val="24"/>
+                <w:szCs w:val="24"/>
               </w:rPr>
               <w:t>{cAl1}</w:t>
             </w:r>
@@ -3502,17 +3446,15 @@
                 <w:bCs/>
                 <w:sz w:val="24"/>
                 <w:szCs w:val="24"/>
-                <w:u w:val="single"/>
-              </w:rPr>
-            </w:pPr>
-            <w:r>
-              <w:rPr>
-                <w:rFonts w:ascii="Arial" w:hAnsi="Arial" w:cs="Arial"/>
-                <w:b/>
-                <w:bCs/>
-                <w:sz w:val="24"/>
-                <w:szCs w:val="24"/>
-                <w:u w:val="single"/>
+              </w:rPr>
+            </w:pPr>
+            <w:r>
+              <w:rPr>
+                <w:rFonts w:ascii="Arial" w:hAnsi="Arial" w:cs="Arial"/>
+                <w:b/>
+                <w:bCs/>
+                <w:sz w:val="24"/>
+                <w:szCs w:val="24"/>
               </w:rPr>
               <w:t>{cAl</w:t>
             </w:r>
@@ -3523,7 +3465,6 @@
                 <w:bCs/>
                 <w:sz w:val="24"/>
                 <w:szCs w:val="24"/>
-                <w:u w:val="single"/>
               </w:rPr>
               <w:t>2</w:t>
             </w:r>
@@ -3534,7 +3475,6 @@
                 <w:bCs/>
                 <w:sz w:val="24"/>
                 <w:szCs w:val="24"/>
-                <w:u w:val="single"/>
               </w:rPr>
               <w:t>}</w:t>
             </w:r>
@@ -3554,17 +3494,15 @@
                 <w:bCs/>
                 <w:sz w:val="24"/>
                 <w:szCs w:val="24"/>
-                <w:u w:val="single"/>
-              </w:rPr>
-            </w:pPr>
-            <w:r>
-              <w:rPr>
-                <w:rFonts w:ascii="Arial" w:hAnsi="Arial" w:cs="Arial"/>
-                <w:b/>
-                <w:bCs/>
-                <w:sz w:val="24"/>
-                <w:szCs w:val="24"/>
-                <w:u w:val="single"/>
+              </w:rPr>
+            </w:pPr>
+            <w:r>
+              <w:rPr>
+                <w:rFonts w:ascii="Arial" w:hAnsi="Arial" w:cs="Arial"/>
+                <w:b/>
+                <w:bCs/>
+                <w:sz w:val="24"/>
+                <w:szCs w:val="24"/>
               </w:rPr>
               <w:t>{cAl</w:t>
             </w:r>
@@ -3575,7 +3513,6 @@
                 <w:bCs/>
                 <w:sz w:val="24"/>
                 <w:szCs w:val="24"/>
-                <w:u w:val="single"/>
               </w:rPr>
               <w:t>3</w:t>
             </w:r>
@@ -3586,7 +3523,6 @@
                 <w:bCs/>
                 <w:sz w:val="24"/>
                 <w:szCs w:val="24"/>
-                <w:u w:val="single"/>
               </w:rPr>
               <w:t>}</w:t>
             </w:r>
@@ -3606,17 +3542,15 @@
                 <w:bCs/>
                 <w:sz w:val="24"/>
                 <w:szCs w:val="24"/>
-                <w:u w:val="single"/>
-              </w:rPr>
-            </w:pPr>
-            <w:r>
-              <w:rPr>
-                <w:rFonts w:ascii="Arial" w:hAnsi="Arial" w:cs="Arial"/>
-                <w:b/>
-                <w:bCs/>
-                <w:sz w:val="24"/>
-                <w:szCs w:val="24"/>
-                <w:u w:val="single"/>
+              </w:rPr>
+            </w:pPr>
+            <w:r>
+              <w:rPr>
+                <w:rFonts w:ascii="Arial" w:hAnsi="Arial" w:cs="Arial"/>
+                <w:b/>
+                <w:bCs/>
+                <w:sz w:val="24"/>
+                <w:szCs w:val="24"/>
               </w:rPr>
               <w:t>{cAl</w:t>
             </w:r>
@@ -3627,7 +3561,6 @@
                 <w:bCs/>
                 <w:sz w:val="24"/>
                 <w:szCs w:val="24"/>
-                <w:u w:val="single"/>
               </w:rPr>
               <w:t>4</w:t>
             </w:r>
@@ -3638,7 +3571,6 @@
                 <w:bCs/>
                 <w:sz w:val="24"/>
                 <w:szCs w:val="24"/>
-                <w:u w:val="single"/>
               </w:rPr>
               <w:t>}</w:t>
             </w:r>
@@ -3658,17 +3590,15 @@
                 <w:bCs/>
                 <w:sz w:val="24"/>
                 <w:szCs w:val="24"/>
-                <w:u w:val="single"/>
-              </w:rPr>
-            </w:pPr>
-            <w:r>
-              <w:rPr>
-                <w:rFonts w:ascii="Arial" w:hAnsi="Arial" w:cs="Arial"/>
-                <w:b/>
-                <w:bCs/>
-                <w:sz w:val="24"/>
-                <w:szCs w:val="24"/>
-                <w:u w:val="single"/>
+              </w:rPr>
+            </w:pPr>
+            <w:r>
+              <w:rPr>
+                <w:rFonts w:ascii="Arial" w:hAnsi="Arial" w:cs="Arial"/>
+                <w:b/>
+                <w:bCs/>
+                <w:sz w:val="24"/>
+                <w:szCs w:val="24"/>
               </w:rPr>
               <w:t>{cAl</w:t>
             </w:r>
@@ -3679,7 +3609,6 @@
                 <w:bCs/>
                 <w:sz w:val="24"/>
                 <w:szCs w:val="24"/>
-                <w:u w:val="single"/>
               </w:rPr>
               <w:t>5</w:t>
             </w:r>
@@ -3690,7 +3619,6 @@
                 <w:bCs/>
                 <w:sz w:val="24"/>
                 <w:szCs w:val="24"/>
-                <w:u w:val="single"/>
               </w:rPr>
               <w:t>}</w:t>
             </w:r>
@@ -3760,17 +3688,15 @@
                 <w:bCs/>
                 <w:sz w:val="24"/>
                 <w:szCs w:val="24"/>
-                <w:u w:val="single"/>
-              </w:rPr>
-            </w:pPr>
-            <w:r>
-              <w:rPr>
-                <w:rFonts w:ascii="Arial" w:hAnsi="Arial" w:cs="Arial"/>
-                <w:b/>
-                <w:bCs/>
-                <w:sz w:val="24"/>
-                <w:szCs w:val="24"/>
-                <w:u w:val="single"/>
+              </w:rPr>
+            </w:pPr>
+            <w:r>
+              <w:rPr>
+                <w:rFonts w:ascii="Arial" w:hAnsi="Arial" w:cs="Arial"/>
+                <w:b/>
+                <w:bCs/>
+                <w:sz w:val="24"/>
+                <w:szCs w:val="24"/>
               </w:rPr>
               <w:t>{bc1}</w:t>
             </w:r>
@@ -3790,17 +3716,15 @@
                 <w:bCs/>
                 <w:sz w:val="24"/>
                 <w:szCs w:val="24"/>
-                <w:u w:val="single"/>
-              </w:rPr>
-            </w:pPr>
-            <w:r>
-              <w:rPr>
-                <w:rFonts w:ascii="Arial" w:hAnsi="Arial" w:cs="Arial"/>
-                <w:b/>
-                <w:bCs/>
-                <w:sz w:val="24"/>
-                <w:szCs w:val="24"/>
-                <w:u w:val="single"/>
+              </w:rPr>
+            </w:pPr>
+            <w:r>
+              <w:rPr>
+                <w:rFonts w:ascii="Arial" w:hAnsi="Arial" w:cs="Arial"/>
+                <w:b/>
+                <w:bCs/>
+                <w:sz w:val="24"/>
+                <w:szCs w:val="24"/>
               </w:rPr>
               <w:t>{bc2}</w:t>
             </w:r>
@@ -3820,17 +3744,15 @@
                 <w:bCs/>
                 <w:sz w:val="24"/>
                 <w:szCs w:val="24"/>
-                <w:u w:val="single"/>
-              </w:rPr>
-            </w:pPr>
-            <w:r>
-              <w:rPr>
-                <w:rFonts w:ascii="Arial" w:hAnsi="Arial" w:cs="Arial"/>
-                <w:b/>
-                <w:bCs/>
-                <w:sz w:val="24"/>
-                <w:szCs w:val="24"/>
-                <w:u w:val="single"/>
+              </w:rPr>
+            </w:pPr>
+            <w:r>
+              <w:rPr>
+                <w:rFonts w:ascii="Arial" w:hAnsi="Arial" w:cs="Arial"/>
+                <w:b/>
+                <w:bCs/>
+                <w:sz w:val="24"/>
+                <w:szCs w:val="24"/>
               </w:rPr>
               <w:t>{bc3}</w:t>
             </w:r>
@@ -3850,17 +3772,15 @@
                 <w:bCs/>
                 <w:sz w:val="24"/>
                 <w:szCs w:val="24"/>
-                <w:u w:val="single"/>
-              </w:rPr>
-            </w:pPr>
-            <w:r>
-              <w:rPr>
-                <w:rFonts w:ascii="Arial" w:hAnsi="Arial" w:cs="Arial"/>
-                <w:b/>
-                <w:bCs/>
-                <w:sz w:val="24"/>
-                <w:szCs w:val="24"/>
-                <w:u w:val="single"/>
+              </w:rPr>
+            </w:pPr>
+            <w:r>
+              <w:rPr>
+                <w:rFonts w:ascii="Arial" w:hAnsi="Arial" w:cs="Arial"/>
+                <w:b/>
+                <w:bCs/>
+                <w:sz w:val="24"/>
+                <w:szCs w:val="24"/>
               </w:rPr>
               <w:t>{bc4}</w:t>
             </w:r>
@@ -3880,17 +3800,15 @@
                 <w:bCs/>
                 <w:sz w:val="24"/>
                 <w:szCs w:val="24"/>
-                <w:u w:val="single"/>
-              </w:rPr>
-            </w:pPr>
-            <w:r>
-              <w:rPr>
-                <w:rFonts w:ascii="Arial" w:hAnsi="Arial" w:cs="Arial"/>
-                <w:b/>
-                <w:bCs/>
-                <w:sz w:val="24"/>
-                <w:szCs w:val="24"/>
-                <w:u w:val="single"/>
+              </w:rPr>
+            </w:pPr>
+            <w:r>
+              <w:rPr>
+                <w:rFonts w:ascii="Arial" w:hAnsi="Arial" w:cs="Arial"/>
+                <w:b/>
+                <w:bCs/>
+                <w:sz w:val="24"/>
+                <w:szCs w:val="24"/>
               </w:rPr>
               <w:t>{bc5}</w:t>
             </w:r>
@@ -3999,17 +3917,15 @@
                 <w:bCs/>
                 <w:sz w:val="24"/>
                 <w:szCs w:val="24"/>
-                <w:u w:val="single"/>
-              </w:rPr>
-            </w:pPr>
-            <w:r>
-              <w:rPr>
-                <w:rFonts w:ascii="Arial" w:hAnsi="Arial" w:cs="Arial"/>
-                <w:b/>
-                <w:bCs/>
-                <w:sz w:val="24"/>
-                <w:szCs w:val="24"/>
-                <w:u w:val="single"/>
+              </w:rPr>
+            </w:pPr>
+            <w:r>
+              <w:rPr>
+                <w:rFonts w:ascii="Arial" w:hAnsi="Arial" w:cs="Arial"/>
+                <w:b/>
+                <w:bCs/>
+                <w:sz w:val="24"/>
+                <w:szCs w:val="24"/>
               </w:rPr>
               <w:t>{peA1}</w:t>
             </w:r>
@@ -4029,17 +3945,15 @@
                 <w:bCs/>
                 <w:sz w:val="24"/>
                 <w:szCs w:val="24"/>
-                <w:u w:val="single"/>
-              </w:rPr>
-            </w:pPr>
-            <w:r>
-              <w:rPr>
-                <w:rFonts w:ascii="Arial" w:hAnsi="Arial" w:cs="Arial"/>
-                <w:b/>
-                <w:bCs/>
-                <w:sz w:val="24"/>
-                <w:szCs w:val="24"/>
-                <w:u w:val="single"/>
+              </w:rPr>
+            </w:pPr>
+            <w:r>
+              <w:rPr>
+                <w:rFonts w:ascii="Arial" w:hAnsi="Arial" w:cs="Arial"/>
+                <w:b/>
+                <w:bCs/>
+                <w:sz w:val="24"/>
+                <w:szCs w:val="24"/>
               </w:rPr>
               <w:t>{peA</w:t>
             </w:r>
@@ -4050,7 +3964,6 @@
                 <w:bCs/>
                 <w:sz w:val="24"/>
                 <w:szCs w:val="24"/>
-                <w:u w:val="single"/>
               </w:rPr>
               <w:t>2</w:t>
             </w:r>
@@ -4061,7 +3974,6 @@
                 <w:bCs/>
                 <w:sz w:val="24"/>
                 <w:szCs w:val="24"/>
-                <w:u w:val="single"/>
               </w:rPr>
               <w:t>}</w:t>
             </w:r>
@@ -4081,17 +3993,15 @@
                 <w:bCs/>
                 <w:sz w:val="24"/>
                 <w:szCs w:val="24"/>
-                <w:u w:val="single"/>
-              </w:rPr>
-            </w:pPr>
-            <w:r>
-              <w:rPr>
-                <w:rFonts w:ascii="Arial" w:hAnsi="Arial" w:cs="Arial"/>
-                <w:b/>
-                <w:bCs/>
-                <w:sz w:val="24"/>
-                <w:szCs w:val="24"/>
-                <w:u w:val="single"/>
+              </w:rPr>
+            </w:pPr>
+            <w:r>
+              <w:rPr>
+                <w:rFonts w:ascii="Arial" w:hAnsi="Arial" w:cs="Arial"/>
+                <w:b/>
+                <w:bCs/>
+                <w:sz w:val="24"/>
+                <w:szCs w:val="24"/>
               </w:rPr>
               <w:t>{peA</w:t>
             </w:r>
@@ -4102,7 +4012,6 @@
                 <w:bCs/>
                 <w:sz w:val="24"/>
                 <w:szCs w:val="24"/>
-                <w:u w:val="single"/>
               </w:rPr>
               <w:t>3</w:t>
             </w:r>
@@ -4113,7 +4022,6 @@
                 <w:bCs/>
                 <w:sz w:val="24"/>
                 <w:szCs w:val="24"/>
-                <w:u w:val="single"/>
               </w:rPr>
               <w:t>}</w:t>
             </w:r>
@@ -4133,17 +4041,15 @@
                 <w:bCs/>
                 <w:sz w:val="24"/>
                 <w:szCs w:val="24"/>
-                <w:u w:val="single"/>
-              </w:rPr>
-            </w:pPr>
-            <w:r>
-              <w:rPr>
-                <w:rFonts w:ascii="Arial" w:hAnsi="Arial" w:cs="Arial"/>
-                <w:b/>
-                <w:bCs/>
-                <w:sz w:val="24"/>
-                <w:szCs w:val="24"/>
-                <w:u w:val="single"/>
+              </w:rPr>
+            </w:pPr>
+            <w:r>
+              <w:rPr>
+                <w:rFonts w:ascii="Arial" w:hAnsi="Arial" w:cs="Arial"/>
+                <w:b/>
+                <w:bCs/>
+                <w:sz w:val="24"/>
+                <w:szCs w:val="24"/>
               </w:rPr>
               <w:t>{peA</w:t>
             </w:r>
@@ -4154,7 +4060,6 @@
                 <w:bCs/>
                 <w:sz w:val="24"/>
                 <w:szCs w:val="24"/>
-                <w:u w:val="single"/>
               </w:rPr>
               <w:t>4</w:t>
             </w:r>
@@ -4165,7 +4070,6 @@
                 <w:bCs/>
                 <w:sz w:val="24"/>
                 <w:szCs w:val="24"/>
-                <w:u w:val="single"/>
               </w:rPr>
               <w:t>}</w:t>
             </w:r>
@@ -4185,17 +4089,15 @@
                 <w:bCs/>
                 <w:sz w:val="24"/>
                 <w:szCs w:val="24"/>
-                <w:u w:val="single"/>
-              </w:rPr>
-            </w:pPr>
-            <w:r>
-              <w:rPr>
-                <w:rFonts w:ascii="Arial" w:hAnsi="Arial" w:cs="Arial"/>
-                <w:b/>
-                <w:bCs/>
-                <w:sz w:val="24"/>
-                <w:szCs w:val="24"/>
-                <w:u w:val="single"/>
+              </w:rPr>
+            </w:pPr>
+            <w:r>
+              <w:rPr>
+                <w:rFonts w:ascii="Arial" w:hAnsi="Arial" w:cs="Arial"/>
+                <w:b/>
+                <w:bCs/>
+                <w:sz w:val="24"/>
+                <w:szCs w:val="24"/>
               </w:rPr>
               <w:t>{peA</w:t>
             </w:r>
@@ -4206,7 +4108,6 @@
                 <w:bCs/>
                 <w:sz w:val="24"/>
                 <w:szCs w:val="24"/>
-                <w:u w:val="single"/>
               </w:rPr>
               <w:t>5</w:t>
             </w:r>
@@ -4217,7 +4118,6 @@
                 <w:bCs/>
                 <w:sz w:val="24"/>
                 <w:szCs w:val="24"/>
-                <w:u w:val="single"/>
               </w:rPr>
               <w:t>}</w:t>
             </w:r>
@@ -4312,17 +4212,15 @@
                 <w:bCs/>
                 <w:sz w:val="24"/>
                 <w:szCs w:val="24"/>
-                <w:u w:val="single"/>
-              </w:rPr>
-            </w:pPr>
-            <w:r>
-              <w:rPr>
-                <w:rFonts w:ascii="Arial" w:hAnsi="Arial" w:cs="Arial"/>
-                <w:b/>
-                <w:bCs/>
-                <w:sz w:val="24"/>
-                <w:szCs w:val="24"/>
-                <w:u w:val="single"/>
+              </w:rPr>
+            </w:pPr>
+            <w:r>
+              <w:rPr>
+                <w:rFonts w:ascii="Arial" w:hAnsi="Arial" w:cs="Arial"/>
+                <w:b/>
+                <w:bCs/>
+                <w:sz w:val="24"/>
+                <w:szCs w:val="24"/>
               </w:rPr>
               <w:t>{pcA1}</w:t>
             </w:r>
@@ -4342,17 +4240,15 @@
                 <w:bCs/>
                 <w:sz w:val="24"/>
                 <w:szCs w:val="24"/>
-                <w:u w:val="single"/>
-              </w:rPr>
-            </w:pPr>
-            <w:r>
-              <w:rPr>
-                <w:rFonts w:ascii="Arial" w:hAnsi="Arial" w:cs="Arial"/>
-                <w:b/>
-                <w:bCs/>
-                <w:sz w:val="24"/>
-                <w:szCs w:val="24"/>
-                <w:u w:val="single"/>
+              </w:rPr>
+            </w:pPr>
+            <w:r>
+              <w:rPr>
+                <w:rFonts w:ascii="Arial" w:hAnsi="Arial" w:cs="Arial"/>
+                <w:b/>
+                <w:bCs/>
+                <w:sz w:val="24"/>
+                <w:szCs w:val="24"/>
               </w:rPr>
               <w:t>{pcA</w:t>
             </w:r>
@@ -4363,7 +4259,6 @@
                 <w:bCs/>
                 <w:sz w:val="24"/>
                 <w:szCs w:val="24"/>
-                <w:u w:val="single"/>
               </w:rPr>
               <w:t>2</w:t>
             </w:r>
@@ -4374,7 +4269,6 @@
                 <w:bCs/>
                 <w:sz w:val="24"/>
                 <w:szCs w:val="24"/>
-                <w:u w:val="single"/>
               </w:rPr>
               <w:t>}</w:t>
             </w:r>
@@ -4394,17 +4288,15 @@
                 <w:bCs/>
                 <w:sz w:val="24"/>
                 <w:szCs w:val="24"/>
-                <w:u w:val="single"/>
-              </w:rPr>
-            </w:pPr>
-            <w:r>
-              <w:rPr>
-                <w:rFonts w:ascii="Arial" w:hAnsi="Arial" w:cs="Arial"/>
-                <w:b/>
-                <w:bCs/>
-                <w:sz w:val="24"/>
-                <w:szCs w:val="24"/>
-                <w:u w:val="single"/>
+              </w:rPr>
+            </w:pPr>
+            <w:r>
+              <w:rPr>
+                <w:rFonts w:ascii="Arial" w:hAnsi="Arial" w:cs="Arial"/>
+                <w:b/>
+                <w:bCs/>
+                <w:sz w:val="24"/>
+                <w:szCs w:val="24"/>
               </w:rPr>
               <w:t>{pcA</w:t>
             </w:r>
@@ -4415,7 +4307,6 @@
                 <w:bCs/>
                 <w:sz w:val="24"/>
                 <w:szCs w:val="24"/>
-                <w:u w:val="single"/>
               </w:rPr>
               <w:t>3</w:t>
             </w:r>
@@ -4426,7 +4317,6 @@
                 <w:bCs/>
                 <w:sz w:val="24"/>
                 <w:szCs w:val="24"/>
-                <w:u w:val="single"/>
               </w:rPr>
               <w:t>}</w:t>
             </w:r>
@@ -4446,17 +4336,15 @@
                 <w:bCs/>
                 <w:sz w:val="24"/>
                 <w:szCs w:val="24"/>
-                <w:u w:val="single"/>
-              </w:rPr>
-            </w:pPr>
-            <w:r>
-              <w:rPr>
-                <w:rFonts w:ascii="Arial" w:hAnsi="Arial" w:cs="Arial"/>
-                <w:b/>
-                <w:bCs/>
-                <w:sz w:val="24"/>
-                <w:szCs w:val="24"/>
-                <w:u w:val="single"/>
+              </w:rPr>
+            </w:pPr>
+            <w:r>
+              <w:rPr>
+                <w:rFonts w:ascii="Arial" w:hAnsi="Arial" w:cs="Arial"/>
+                <w:b/>
+                <w:bCs/>
+                <w:sz w:val="24"/>
+                <w:szCs w:val="24"/>
               </w:rPr>
               <w:t>{pcA</w:t>
             </w:r>
@@ -4467,7 +4355,6 @@
                 <w:bCs/>
                 <w:sz w:val="24"/>
                 <w:szCs w:val="24"/>
-                <w:u w:val="single"/>
               </w:rPr>
               <w:t>4</w:t>
             </w:r>
@@ -4478,7 +4365,6 @@
                 <w:bCs/>
                 <w:sz w:val="24"/>
                 <w:szCs w:val="24"/>
-                <w:u w:val="single"/>
               </w:rPr>
               <w:t>}</w:t>
             </w:r>
@@ -4498,17 +4384,15 @@
                 <w:bCs/>
                 <w:sz w:val="24"/>
                 <w:szCs w:val="24"/>
-                <w:u w:val="single"/>
-              </w:rPr>
-            </w:pPr>
-            <w:r>
-              <w:rPr>
-                <w:rFonts w:ascii="Arial" w:hAnsi="Arial" w:cs="Arial"/>
-                <w:b/>
-                <w:bCs/>
-                <w:sz w:val="24"/>
-                <w:szCs w:val="24"/>
-                <w:u w:val="single"/>
+              </w:rPr>
+            </w:pPr>
+            <w:r>
+              <w:rPr>
+                <w:rFonts w:ascii="Arial" w:hAnsi="Arial" w:cs="Arial"/>
+                <w:b/>
+                <w:bCs/>
+                <w:sz w:val="24"/>
+                <w:szCs w:val="24"/>
               </w:rPr>
               <w:t>{pcA</w:t>
             </w:r>
@@ -4519,7 +4403,6 @@
                 <w:bCs/>
                 <w:sz w:val="24"/>
                 <w:szCs w:val="24"/>
-                <w:u w:val="single"/>
               </w:rPr>
               <w:t>5</w:t>
             </w:r>
@@ -4530,7 +4413,6 @@
                 <w:bCs/>
                 <w:sz w:val="24"/>
                 <w:szCs w:val="24"/>
-                <w:u w:val="single"/>
               </w:rPr>
               <w:t>}</w:t>
             </w:r>
@@ -4630,17 +4512,15 @@
                 <w:bCs/>
                 <w:sz w:val="24"/>
                 <w:szCs w:val="24"/>
-                <w:u w:val="single"/>
-              </w:rPr>
-            </w:pPr>
-            <w:r>
-              <w:rPr>
-                <w:rFonts w:ascii="Arial" w:hAnsi="Arial" w:cs="Arial"/>
-                <w:b/>
-                <w:bCs/>
-                <w:sz w:val="24"/>
-                <w:szCs w:val="24"/>
-                <w:u w:val="single"/>
+              </w:rPr>
+            </w:pPr>
+            <w:r>
+              <w:rPr>
+                <w:rFonts w:ascii="Arial" w:hAnsi="Arial" w:cs="Arial"/>
+                <w:b/>
+                <w:bCs/>
+                <w:sz w:val="24"/>
+                <w:szCs w:val="24"/>
               </w:rPr>
               <w:t>{ptA1}</w:t>
             </w:r>
@@ -4660,17 +4540,15 @@
                 <w:bCs/>
                 <w:sz w:val="24"/>
                 <w:szCs w:val="24"/>
-                <w:u w:val="single"/>
-              </w:rPr>
-            </w:pPr>
-            <w:r>
-              <w:rPr>
-                <w:rFonts w:ascii="Arial" w:hAnsi="Arial" w:cs="Arial"/>
-                <w:b/>
-                <w:bCs/>
-                <w:sz w:val="24"/>
-                <w:szCs w:val="24"/>
-                <w:u w:val="single"/>
+              </w:rPr>
+            </w:pPr>
+            <w:r>
+              <w:rPr>
+                <w:rFonts w:ascii="Arial" w:hAnsi="Arial" w:cs="Arial"/>
+                <w:b/>
+                <w:bCs/>
+                <w:sz w:val="24"/>
+                <w:szCs w:val="24"/>
               </w:rPr>
               <w:t>{ptA</w:t>
             </w:r>
@@ -4681,7 +4559,6 @@
                 <w:bCs/>
                 <w:sz w:val="24"/>
                 <w:szCs w:val="24"/>
-                <w:u w:val="single"/>
               </w:rPr>
               <w:t>2</w:t>
             </w:r>
@@ -4692,7 +4569,6 @@
                 <w:bCs/>
                 <w:sz w:val="24"/>
                 <w:szCs w:val="24"/>
-                <w:u w:val="single"/>
               </w:rPr>
               <w:t>}</w:t>
             </w:r>
@@ -4712,17 +4588,15 @@
                 <w:bCs/>
                 <w:sz w:val="24"/>
                 <w:szCs w:val="24"/>
-                <w:u w:val="single"/>
-              </w:rPr>
-            </w:pPr>
-            <w:r>
-              <w:rPr>
-                <w:rFonts w:ascii="Arial" w:hAnsi="Arial" w:cs="Arial"/>
-                <w:b/>
-                <w:bCs/>
-                <w:sz w:val="24"/>
-                <w:szCs w:val="24"/>
-                <w:u w:val="single"/>
+              </w:rPr>
+            </w:pPr>
+            <w:r>
+              <w:rPr>
+                <w:rFonts w:ascii="Arial" w:hAnsi="Arial" w:cs="Arial"/>
+                <w:b/>
+                <w:bCs/>
+                <w:sz w:val="24"/>
+                <w:szCs w:val="24"/>
               </w:rPr>
               <w:t>{ptA</w:t>
             </w:r>
@@ -4733,7 +4607,6 @@
                 <w:bCs/>
                 <w:sz w:val="24"/>
                 <w:szCs w:val="24"/>
-                <w:u w:val="single"/>
               </w:rPr>
               <w:t>3</w:t>
             </w:r>
@@ -4744,7 +4617,6 @@
                 <w:bCs/>
                 <w:sz w:val="24"/>
                 <w:szCs w:val="24"/>
-                <w:u w:val="single"/>
               </w:rPr>
               <w:t>}</w:t>
             </w:r>
@@ -4764,17 +4636,15 @@
                 <w:bCs/>
                 <w:sz w:val="24"/>
                 <w:szCs w:val="24"/>
-                <w:u w:val="single"/>
-              </w:rPr>
-            </w:pPr>
-            <w:r>
-              <w:rPr>
-                <w:rFonts w:ascii="Arial" w:hAnsi="Arial" w:cs="Arial"/>
-                <w:b/>
-                <w:bCs/>
-                <w:sz w:val="24"/>
-                <w:szCs w:val="24"/>
-                <w:u w:val="single"/>
+              </w:rPr>
+            </w:pPr>
+            <w:r>
+              <w:rPr>
+                <w:rFonts w:ascii="Arial" w:hAnsi="Arial" w:cs="Arial"/>
+                <w:b/>
+                <w:bCs/>
+                <w:sz w:val="24"/>
+                <w:szCs w:val="24"/>
               </w:rPr>
               <w:t>{ptA</w:t>
             </w:r>
@@ -4785,7 +4655,6 @@
                 <w:bCs/>
                 <w:sz w:val="24"/>
                 <w:szCs w:val="24"/>
-                <w:u w:val="single"/>
               </w:rPr>
               <w:t>4</w:t>
             </w:r>
@@ -4796,7 +4665,6 @@
                 <w:bCs/>
                 <w:sz w:val="24"/>
                 <w:szCs w:val="24"/>
-                <w:u w:val="single"/>
               </w:rPr>
               <w:t>}</w:t>
             </w:r>
@@ -4816,17 +4684,15 @@
                 <w:bCs/>
                 <w:sz w:val="24"/>
                 <w:szCs w:val="24"/>
-                <w:u w:val="single"/>
-              </w:rPr>
-            </w:pPr>
-            <w:r>
-              <w:rPr>
-                <w:rFonts w:ascii="Arial" w:hAnsi="Arial" w:cs="Arial"/>
-                <w:b/>
-                <w:bCs/>
-                <w:sz w:val="24"/>
-                <w:szCs w:val="24"/>
-                <w:u w:val="single"/>
+              </w:rPr>
+            </w:pPr>
+            <w:r>
+              <w:rPr>
+                <w:rFonts w:ascii="Arial" w:hAnsi="Arial" w:cs="Arial"/>
+                <w:b/>
+                <w:bCs/>
+                <w:sz w:val="24"/>
+                <w:szCs w:val="24"/>
               </w:rPr>
               <w:t>{ptA</w:t>
             </w:r>
@@ -4837,7 +4703,6 @@
                 <w:bCs/>
                 <w:sz w:val="24"/>
                 <w:szCs w:val="24"/>
-                <w:u w:val="single"/>
               </w:rPr>
               <w:t>5</w:t>
             </w:r>
@@ -4848,7 +4713,6 @@
                 <w:bCs/>
                 <w:sz w:val="24"/>
                 <w:szCs w:val="24"/>
-                <w:u w:val="single"/>
               </w:rPr>
               <w:t>}</w:t>
             </w:r>
@@ -4943,17 +4807,15 @@
                 <w:bCs/>
                 <w:sz w:val="24"/>
                 <w:szCs w:val="24"/>
-                <w:u w:val="single"/>
-              </w:rPr>
-            </w:pPr>
-            <w:r>
-              <w:rPr>
-                <w:rFonts w:ascii="Arial" w:hAnsi="Arial" w:cs="Arial"/>
-                <w:b/>
-                <w:bCs/>
-                <w:sz w:val="24"/>
-                <w:szCs w:val="24"/>
-                <w:u w:val="single"/>
+              </w:rPr>
+            </w:pPr>
+            <w:r>
+              <w:rPr>
+                <w:rFonts w:ascii="Arial" w:hAnsi="Arial" w:cs="Arial"/>
+                <w:b/>
+                <w:bCs/>
+                <w:sz w:val="24"/>
+                <w:szCs w:val="24"/>
               </w:rPr>
               <w:t>{oem1}</w:t>
             </w:r>
@@ -4973,17 +4835,15 @@
                 <w:bCs/>
                 <w:sz w:val="24"/>
                 <w:szCs w:val="24"/>
-                <w:u w:val="single"/>
-              </w:rPr>
-            </w:pPr>
-            <w:r>
-              <w:rPr>
-                <w:rFonts w:ascii="Arial" w:hAnsi="Arial" w:cs="Arial"/>
-                <w:b/>
-                <w:bCs/>
-                <w:sz w:val="24"/>
-                <w:szCs w:val="24"/>
-                <w:u w:val="single"/>
+              </w:rPr>
+            </w:pPr>
+            <w:r>
+              <w:rPr>
+                <w:rFonts w:ascii="Arial" w:hAnsi="Arial" w:cs="Arial"/>
+                <w:b/>
+                <w:bCs/>
+                <w:sz w:val="24"/>
+                <w:szCs w:val="24"/>
               </w:rPr>
               <w:t>{oem</w:t>
             </w:r>
@@ -4994,7 +4854,6 @@
                 <w:bCs/>
                 <w:sz w:val="24"/>
                 <w:szCs w:val="24"/>
-                <w:u w:val="single"/>
               </w:rPr>
               <w:t>2</w:t>
             </w:r>
@@ -5005,7 +4864,6 @@
                 <w:bCs/>
                 <w:sz w:val="24"/>
                 <w:szCs w:val="24"/>
-                <w:u w:val="single"/>
               </w:rPr>
               <w:t>}</w:t>
             </w:r>
@@ -5025,17 +4883,15 @@
                 <w:bCs/>
                 <w:sz w:val="24"/>
                 <w:szCs w:val="24"/>
-                <w:u w:val="single"/>
-              </w:rPr>
-            </w:pPr>
-            <w:r>
-              <w:rPr>
-                <w:rFonts w:ascii="Arial" w:hAnsi="Arial" w:cs="Arial"/>
-                <w:b/>
-                <w:bCs/>
-                <w:sz w:val="24"/>
-                <w:szCs w:val="24"/>
-                <w:u w:val="single"/>
+              </w:rPr>
+            </w:pPr>
+            <w:r>
+              <w:rPr>
+                <w:rFonts w:ascii="Arial" w:hAnsi="Arial" w:cs="Arial"/>
+                <w:b/>
+                <w:bCs/>
+                <w:sz w:val="24"/>
+                <w:szCs w:val="24"/>
               </w:rPr>
               <w:t>{oem</w:t>
             </w:r>
@@ -5046,7 +4902,6 @@
                 <w:bCs/>
                 <w:sz w:val="24"/>
                 <w:szCs w:val="24"/>
-                <w:u w:val="single"/>
               </w:rPr>
               <w:t>3</w:t>
             </w:r>
@@ -5057,7 +4912,6 @@
                 <w:bCs/>
                 <w:sz w:val="24"/>
                 <w:szCs w:val="24"/>
-                <w:u w:val="single"/>
               </w:rPr>
               <w:t>}</w:t>
             </w:r>
@@ -5077,17 +4931,15 @@
                 <w:bCs/>
                 <w:sz w:val="24"/>
                 <w:szCs w:val="24"/>
-                <w:u w:val="single"/>
-              </w:rPr>
-            </w:pPr>
-            <w:r>
-              <w:rPr>
-                <w:rFonts w:ascii="Arial" w:hAnsi="Arial" w:cs="Arial"/>
-                <w:b/>
-                <w:bCs/>
-                <w:sz w:val="24"/>
-                <w:szCs w:val="24"/>
-                <w:u w:val="single"/>
+              </w:rPr>
+            </w:pPr>
+            <w:r>
+              <w:rPr>
+                <w:rFonts w:ascii="Arial" w:hAnsi="Arial" w:cs="Arial"/>
+                <w:b/>
+                <w:bCs/>
+                <w:sz w:val="24"/>
+                <w:szCs w:val="24"/>
               </w:rPr>
               <w:t>{oem</w:t>
             </w:r>
@@ -5098,7 +4950,6 @@
                 <w:bCs/>
                 <w:sz w:val="24"/>
                 <w:szCs w:val="24"/>
-                <w:u w:val="single"/>
               </w:rPr>
               <w:t>4</w:t>
             </w:r>
@@ -5109,7 +4960,6 @@
                 <w:bCs/>
                 <w:sz w:val="24"/>
                 <w:szCs w:val="24"/>
-                <w:u w:val="single"/>
               </w:rPr>
               <w:t>}</w:t>
             </w:r>
@@ -5129,17 +4979,15 @@
                 <w:bCs/>
                 <w:sz w:val="24"/>
                 <w:szCs w:val="24"/>
-                <w:u w:val="single"/>
-              </w:rPr>
-            </w:pPr>
-            <w:r>
-              <w:rPr>
-                <w:rFonts w:ascii="Arial" w:hAnsi="Arial" w:cs="Arial"/>
-                <w:b/>
-                <w:bCs/>
-                <w:sz w:val="24"/>
-                <w:szCs w:val="24"/>
-                <w:u w:val="single"/>
+              </w:rPr>
+            </w:pPr>
+            <w:r>
+              <w:rPr>
+                <w:rFonts w:ascii="Arial" w:hAnsi="Arial" w:cs="Arial"/>
+                <w:b/>
+                <w:bCs/>
+                <w:sz w:val="24"/>
+                <w:szCs w:val="24"/>
               </w:rPr>
               <w:t>{oem</w:t>
             </w:r>
@@ -5150,7 +4998,6 @@
                 <w:bCs/>
                 <w:sz w:val="24"/>
                 <w:szCs w:val="24"/>
-                <w:u w:val="single"/>
               </w:rPr>
               <w:t>5</w:t>
             </w:r>
@@ -5161,7 +5008,6 @@
                 <w:bCs/>
                 <w:sz w:val="24"/>
                 <w:szCs w:val="24"/>
-                <w:u w:val="single"/>
               </w:rPr>
               <w:t>}</w:t>
             </w:r>
@@ -5256,17 +5102,15 @@
                 <w:bCs/>
                 <w:sz w:val="24"/>
                 <w:szCs w:val="24"/>
-                <w:u w:val="single"/>
-              </w:rPr>
-            </w:pPr>
-            <w:r>
-              <w:rPr>
-                <w:rFonts w:ascii="Arial" w:hAnsi="Arial" w:cs="Arial"/>
-                <w:b/>
-                <w:bCs/>
-                <w:sz w:val="24"/>
-                <w:szCs w:val="24"/>
-                <w:u w:val="single"/>
+              </w:rPr>
+            </w:pPr>
+            <w:r>
+              <w:rPr>
+                <w:rFonts w:ascii="Arial" w:hAnsi="Arial" w:cs="Arial"/>
+                <w:b/>
+                <w:bCs/>
+                <w:sz w:val="24"/>
+                <w:szCs w:val="24"/>
               </w:rPr>
               <w:t>{oe1}</w:t>
             </w:r>
@@ -5286,17 +5130,15 @@
                 <w:bCs/>
                 <w:sz w:val="24"/>
                 <w:szCs w:val="24"/>
-                <w:u w:val="single"/>
-              </w:rPr>
-            </w:pPr>
-            <w:r>
-              <w:rPr>
-                <w:rFonts w:ascii="Arial" w:hAnsi="Arial" w:cs="Arial"/>
-                <w:b/>
-                <w:bCs/>
-                <w:sz w:val="24"/>
-                <w:szCs w:val="24"/>
-                <w:u w:val="single"/>
+              </w:rPr>
+            </w:pPr>
+            <w:r>
+              <w:rPr>
+                <w:rFonts w:ascii="Arial" w:hAnsi="Arial" w:cs="Arial"/>
+                <w:b/>
+                <w:bCs/>
+                <w:sz w:val="24"/>
+                <w:szCs w:val="24"/>
               </w:rPr>
               <w:t>{oe</w:t>
             </w:r>
@@ -5307,7 +5149,6 @@
                 <w:bCs/>
                 <w:sz w:val="24"/>
                 <w:szCs w:val="24"/>
-                <w:u w:val="single"/>
               </w:rPr>
               <w:t>2</w:t>
             </w:r>
@@ -5318,7 +5159,6 @@
                 <w:bCs/>
                 <w:sz w:val="24"/>
                 <w:szCs w:val="24"/>
-                <w:u w:val="single"/>
               </w:rPr>
               <w:t>}</w:t>
             </w:r>
@@ -5338,17 +5178,15 @@
                 <w:bCs/>
                 <w:sz w:val="24"/>
                 <w:szCs w:val="24"/>
-                <w:u w:val="single"/>
-              </w:rPr>
-            </w:pPr>
-            <w:r>
-              <w:rPr>
-                <w:rFonts w:ascii="Arial" w:hAnsi="Arial" w:cs="Arial"/>
-                <w:b/>
-                <w:bCs/>
-                <w:sz w:val="24"/>
-                <w:szCs w:val="24"/>
-                <w:u w:val="single"/>
+              </w:rPr>
+            </w:pPr>
+            <w:r>
+              <w:rPr>
+                <w:rFonts w:ascii="Arial" w:hAnsi="Arial" w:cs="Arial"/>
+                <w:b/>
+                <w:bCs/>
+                <w:sz w:val="24"/>
+                <w:szCs w:val="24"/>
               </w:rPr>
               <w:t>{oe</w:t>
             </w:r>
@@ -5359,7 +5197,6 @@
                 <w:bCs/>
                 <w:sz w:val="24"/>
                 <w:szCs w:val="24"/>
-                <w:u w:val="single"/>
               </w:rPr>
               <w:t>3</w:t>
             </w:r>
@@ -5370,7 +5207,6 @@
                 <w:bCs/>
                 <w:sz w:val="24"/>
                 <w:szCs w:val="24"/>
-                <w:u w:val="single"/>
               </w:rPr>
               <w:t>}</w:t>
             </w:r>
@@ -5390,17 +5226,15 @@
                 <w:bCs/>
                 <w:sz w:val="24"/>
                 <w:szCs w:val="24"/>
-                <w:u w:val="single"/>
-              </w:rPr>
-            </w:pPr>
-            <w:r>
-              <w:rPr>
-                <w:rFonts w:ascii="Arial" w:hAnsi="Arial" w:cs="Arial"/>
-                <w:b/>
-                <w:bCs/>
-                <w:sz w:val="24"/>
-                <w:szCs w:val="24"/>
-                <w:u w:val="single"/>
+              </w:rPr>
+            </w:pPr>
+            <w:r>
+              <w:rPr>
+                <w:rFonts w:ascii="Arial" w:hAnsi="Arial" w:cs="Arial"/>
+                <w:b/>
+                <w:bCs/>
+                <w:sz w:val="24"/>
+                <w:szCs w:val="24"/>
               </w:rPr>
               <w:t>{oe</w:t>
             </w:r>
@@ -5411,7 +5245,6 @@
                 <w:bCs/>
                 <w:sz w:val="24"/>
                 <w:szCs w:val="24"/>
-                <w:u w:val="single"/>
               </w:rPr>
               <w:t>4</w:t>
             </w:r>
@@ -5422,7 +5255,6 @@
                 <w:bCs/>
                 <w:sz w:val="24"/>
                 <w:szCs w:val="24"/>
-                <w:u w:val="single"/>
               </w:rPr>
               <w:t>}</w:t>
             </w:r>
@@ -5442,17 +5274,15 @@
                 <w:bCs/>
                 <w:sz w:val="24"/>
                 <w:szCs w:val="24"/>
-                <w:u w:val="single"/>
-              </w:rPr>
-            </w:pPr>
-            <w:r>
-              <w:rPr>
-                <w:rFonts w:ascii="Arial" w:hAnsi="Arial" w:cs="Arial"/>
-                <w:b/>
-                <w:bCs/>
-                <w:sz w:val="24"/>
-                <w:szCs w:val="24"/>
-                <w:u w:val="single"/>
+              </w:rPr>
+            </w:pPr>
+            <w:r>
+              <w:rPr>
+                <w:rFonts w:ascii="Arial" w:hAnsi="Arial" w:cs="Arial"/>
+                <w:b/>
+                <w:bCs/>
+                <w:sz w:val="24"/>
+                <w:szCs w:val="24"/>
               </w:rPr>
               <w:t>{oe</w:t>
             </w:r>
@@ -5463,7 +5293,6 @@
                 <w:bCs/>
                 <w:sz w:val="24"/>
                 <w:szCs w:val="24"/>
-                <w:u w:val="single"/>
               </w:rPr>
               <w:t>5</w:t>
             </w:r>
@@ -5474,7 +5303,6 @@
                 <w:bCs/>
                 <w:sz w:val="24"/>
                 <w:szCs w:val="24"/>
-                <w:u w:val="single"/>
               </w:rPr>
               <w:t>}</w:t>
             </w:r>
@@ -5569,17 +5397,15 @@
                 <w:bCs/>
                 <w:sz w:val="24"/>
                 <w:szCs w:val="24"/>
-                <w:u w:val="single"/>
-              </w:rPr>
-            </w:pPr>
-            <w:r>
-              <w:rPr>
-                <w:rFonts w:ascii="Arial" w:hAnsi="Arial" w:cs="Arial"/>
-                <w:b/>
-                <w:bCs/>
-                <w:sz w:val="24"/>
-                <w:szCs w:val="24"/>
-                <w:u w:val="single"/>
+              </w:rPr>
+            </w:pPr>
+            <w:r>
+              <w:rPr>
+                <w:rFonts w:ascii="Arial" w:hAnsi="Arial" w:cs="Arial"/>
+                <w:b/>
+                <w:bCs/>
+                <w:sz w:val="24"/>
+                <w:szCs w:val="24"/>
               </w:rPr>
               <w:t>{liAl1}</w:t>
             </w:r>
@@ -5599,17 +5425,15 @@
                 <w:bCs/>
                 <w:sz w:val="24"/>
                 <w:szCs w:val="24"/>
-                <w:u w:val="single"/>
-              </w:rPr>
-            </w:pPr>
-            <w:r>
-              <w:rPr>
-                <w:rFonts w:ascii="Arial" w:hAnsi="Arial" w:cs="Arial"/>
-                <w:b/>
-                <w:bCs/>
-                <w:sz w:val="24"/>
-                <w:szCs w:val="24"/>
-                <w:u w:val="single"/>
+              </w:rPr>
+            </w:pPr>
+            <w:r>
+              <w:rPr>
+                <w:rFonts w:ascii="Arial" w:hAnsi="Arial" w:cs="Arial"/>
+                <w:b/>
+                <w:bCs/>
+                <w:sz w:val="24"/>
+                <w:szCs w:val="24"/>
               </w:rPr>
               <w:t>{liAl</w:t>
             </w:r>
@@ -5620,7 +5444,6 @@
                 <w:bCs/>
                 <w:sz w:val="24"/>
                 <w:szCs w:val="24"/>
-                <w:u w:val="single"/>
               </w:rPr>
               <w:t>2</w:t>
             </w:r>
@@ -5631,7 +5454,6 @@
                 <w:bCs/>
                 <w:sz w:val="24"/>
                 <w:szCs w:val="24"/>
-                <w:u w:val="single"/>
               </w:rPr>
               <w:t>}</w:t>
             </w:r>
@@ -5651,17 +5473,15 @@
                 <w:bCs/>
                 <w:sz w:val="24"/>
                 <w:szCs w:val="24"/>
-                <w:u w:val="single"/>
-              </w:rPr>
-            </w:pPr>
-            <w:r>
-              <w:rPr>
-                <w:rFonts w:ascii="Arial" w:hAnsi="Arial" w:cs="Arial"/>
-                <w:b/>
-                <w:bCs/>
-                <w:sz w:val="24"/>
-                <w:szCs w:val="24"/>
-                <w:u w:val="single"/>
+              </w:rPr>
+            </w:pPr>
+            <w:r>
+              <w:rPr>
+                <w:rFonts w:ascii="Arial" w:hAnsi="Arial" w:cs="Arial"/>
+                <w:b/>
+                <w:bCs/>
+                <w:sz w:val="24"/>
+                <w:szCs w:val="24"/>
               </w:rPr>
               <w:t>{liAl</w:t>
             </w:r>
@@ -5672,7 +5492,6 @@
                 <w:bCs/>
                 <w:sz w:val="24"/>
                 <w:szCs w:val="24"/>
-                <w:u w:val="single"/>
               </w:rPr>
               <w:t>3</w:t>
             </w:r>
@@ -5683,7 +5502,6 @@
                 <w:bCs/>
                 <w:sz w:val="24"/>
                 <w:szCs w:val="24"/>
-                <w:u w:val="single"/>
               </w:rPr>
               <w:t>}</w:t>
             </w:r>
@@ -5703,17 +5521,15 @@
                 <w:bCs/>
                 <w:sz w:val="24"/>
                 <w:szCs w:val="24"/>
-                <w:u w:val="single"/>
-              </w:rPr>
-            </w:pPr>
-            <w:r>
-              <w:rPr>
-                <w:rFonts w:ascii="Arial" w:hAnsi="Arial" w:cs="Arial"/>
-                <w:b/>
-                <w:bCs/>
-                <w:sz w:val="24"/>
-                <w:szCs w:val="24"/>
-                <w:u w:val="single"/>
+              </w:rPr>
+            </w:pPr>
+            <w:r>
+              <w:rPr>
+                <w:rFonts w:ascii="Arial" w:hAnsi="Arial" w:cs="Arial"/>
+                <w:b/>
+                <w:bCs/>
+                <w:sz w:val="24"/>
+                <w:szCs w:val="24"/>
               </w:rPr>
               <w:t>{liAl</w:t>
             </w:r>
@@ -5724,7 +5540,6 @@
                 <w:bCs/>
                 <w:sz w:val="24"/>
                 <w:szCs w:val="24"/>
-                <w:u w:val="single"/>
               </w:rPr>
               <w:t>4</w:t>
             </w:r>
@@ -5735,7 +5550,6 @@
                 <w:bCs/>
                 <w:sz w:val="24"/>
                 <w:szCs w:val="24"/>
-                <w:u w:val="single"/>
               </w:rPr>
               <w:t>}</w:t>
             </w:r>
@@ -5755,17 +5569,15 @@
                 <w:bCs/>
                 <w:sz w:val="24"/>
                 <w:szCs w:val="24"/>
-                <w:u w:val="single"/>
-              </w:rPr>
-            </w:pPr>
-            <w:r>
-              <w:rPr>
-                <w:rFonts w:ascii="Arial" w:hAnsi="Arial" w:cs="Arial"/>
-                <w:b/>
-                <w:bCs/>
-                <w:sz w:val="24"/>
-                <w:szCs w:val="24"/>
-                <w:u w:val="single"/>
+              </w:rPr>
+            </w:pPr>
+            <w:r>
+              <w:rPr>
+                <w:rFonts w:ascii="Arial" w:hAnsi="Arial" w:cs="Arial"/>
+                <w:b/>
+                <w:bCs/>
+                <w:sz w:val="24"/>
+                <w:szCs w:val="24"/>
               </w:rPr>
               <w:t>{liAl</w:t>
             </w:r>
@@ -5776,7 +5588,6 @@
                 <w:bCs/>
                 <w:sz w:val="24"/>
                 <w:szCs w:val="24"/>
-                <w:u w:val="single"/>
               </w:rPr>
               <w:t>5</w:t>
             </w:r>
@@ -5787,7 +5598,6 @@
                 <w:bCs/>
                 <w:sz w:val="24"/>
                 <w:szCs w:val="24"/>
-                <w:u w:val="single"/>
               </w:rPr>
               <w:t>}</w:t>
             </w:r>
@@ -5882,17 +5692,15 @@
                 <w:bCs/>
                 <w:sz w:val="24"/>
                 <w:szCs w:val="24"/>
-                <w:u w:val="single"/>
-              </w:rPr>
-            </w:pPr>
-            <w:r>
-              <w:rPr>
-                <w:rFonts w:ascii="Arial" w:hAnsi="Arial" w:cs="Arial"/>
-                <w:b/>
-                <w:bCs/>
-                <w:sz w:val="24"/>
-                <w:szCs w:val="24"/>
-                <w:u w:val="single"/>
+              </w:rPr>
+            </w:pPr>
+            <w:r>
+              <w:rPr>
+                <w:rFonts w:ascii="Arial" w:hAnsi="Arial" w:cs="Arial"/>
+                <w:b/>
+                <w:bCs/>
+                <w:sz w:val="24"/>
+                <w:szCs w:val="24"/>
               </w:rPr>
               <w:t>{laAl1}</w:t>
             </w:r>
@@ -5912,17 +5720,15 @@
                 <w:bCs/>
                 <w:sz w:val="24"/>
                 <w:szCs w:val="24"/>
-                <w:u w:val="single"/>
-              </w:rPr>
-            </w:pPr>
-            <w:r>
-              <w:rPr>
-                <w:rFonts w:ascii="Arial" w:hAnsi="Arial" w:cs="Arial"/>
-                <w:b/>
-                <w:bCs/>
-                <w:sz w:val="24"/>
-                <w:szCs w:val="24"/>
-                <w:u w:val="single"/>
+              </w:rPr>
+            </w:pPr>
+            <w:r>
+              <w:rPr>
+                <w:rFonts w:ascii="Arial" w:hAnsi="Arial" w:cs="Arial"/>
+                <w:b/>
+                <w:bCs/>
+                <w:sz w:val="24"/>
+                <w:szCs w:val="24"/>
               </w:rPr>
               <w:t>{laAl</w:t>
             </w:r>
@@ -5933,7 +5739,6 @@
                 <w:bCs/>
                 <w:sz w:val="24"/>
                 <w:szCs w:val="24"/>
-                <w:u w:val="single"/>
               </w:rPr>
               <w:t>2</w:t>
             </w:r>
@@ -5944,7 +5749,6 @@
                 <w:bCs/>
                 <w:sz w:val="24"/>
                 <w:szCs w:val="24"/>
-                <w:u w:val="single"/>
               </w:rPr>
               <w:t>}</w:t>
             </w:r>
@@ -5964,17 +5768,15 @@
                 <w:bCs/>
                 <w:sz w:val="24"/>
                 <w:szCs w:val="24"/>
-                <w:u w:val="single"/>
-              </w:rPr>
-            </w:pPr>
-            <w:r>
-              <w:rPr>
-                <w:rFonts w:ascii="Arial" w:hAnsi="Arial" w:cs="Arial"/>
-                <w:b/>
-                <w:bCs/>
-                <w:sz w:val="24"/>
-                <w:szCs w:val="24"/>
-                <w:u w:val="single"/>
+              </w:rPr>
+            </w:pPr>
+            <w:r>
+              <w:rPr>
+                <w:rFonts w:ascii="Arial" w:hAnsi="Arial" w:cs="Arial"/>
+                <w:b/>
+                <w:bCs/>
+                <w:sz w:val="24"/>
+                <w:szCs w:val="24"/>
               </w:rPr>
               <w:t>{laAl</w:t>
             </w:r>
@@ -5985,7 +5787,6 @@
                 <w:bCs/>
                 <w:sz w:val="24"/>
                 <w:szCs w:val="24"/>
-                <w:u w:val="single"/>
               </w:rPr>
               <w:t>3</w:t>
             </w:r>
@@ -5996,7 +5797,6 @@
                 <w:bCs/>
                 <w:sz w:val="24"/>
                 <w:szCs w:val="24"/>
-                <w:u w:val="single"/>
               </w:rPr>
               <w:t>}</w:t>
             </w:r>
@@ -6016,17 +5816,15 @@
                 <w:bCs/>
                 <w:sz w:val="24"/>
                 <w:szCs w:val="24"/>
-                <w:u w:val="single"/>
-              </w:rPr>
-            </w:pPr>
-            <w:r>
-              <w:rPr>
-                <w:rFonts w:ascii="Arial" w:hAnsi="Arial" w:cs="Arial"/>
-                <w:b/>
-                <w:bCs/>
-                <w:sz w:val="24"/>
-                <w:szCs w:val="24"/>
-                <w:u w:val="single"/>
+              </w:rPr>
+            </w:pPr>
+            <w:r>
+              <w:rPr>
+                <w:rFonts w:ascii="Arial" w:hAnsi="Arial" w:cs="Arial"/>
+                <w:b/>
+                <w:bCs/>
+                <w:sz w:val="24"/>
+                <w:szCs w:val="24"/>
               </w:rPr>
               <w:t>{laAl</w:t>
             </w:r>
@@ -6037,7 +5835,6 @@
                 <w:bCs/>
                 <w:sz w:val="24"/>
                 <w:szCs w:val="24"/>
-                <w:u w:val="single"/>
               </w:rPr>
               <w:t>4</w:t>
             </w:r>
@@ -6048,7 +5845,6 @@
                 <w:bCs/>
                 <w:sz w:val="24"/>
                 <w:szCs w:val="24"/>
-                <w:u w:val="single"/>
               </w:rPr>
               <w:t>}</w:t>
             </w:r>
@@ -6068,17 +5864,15 @@
                 <w:bCs/>
                 <w:sz w:val="24"/>
                 <w:szCs w:val="24"/>
-                <w:u w:val="single"/>
-              </w:rPr>
-            </w:pPr>
-            <w:r>
-              <w:rPr>
-                <w:rFonts w:ascii="Arial" w:hAnsi="Arial" w:cs="Arial"/>
-                <w:b/>
-                <w:bCs/>
-                <w:sz w:val="24"/>
-                <w:szCs w:val="24"/>
-                <w:u w:val="single"/>
+              </w:rPr>
+            </w:pPr>
+            <w:r>
+              <w:rPr>
+                <w:rFonts w:ascii="Arial" w:hAnsi="Arial" w:cs="Arial"/>
+                <w:b/>
+                <w:bCs/>
+                <w:sz w:val="24"/>
+                <w:szCs w:val="24"/>
               </w:rPr>
               <w:t>{laAl</w:t>
             </w:r>
@@ -6089,7 +5883,6 @@
                 <w:bCs/>
                 <w:sz w:val="24"/>
                 <w:szCs w:val="24"/>
-                <w:u w:val="single"/>
               </w:rPr>
               <w:t>5</w:t>
             </w:r>
@@ -6100,7 +5893,6 @@
                 <w:bCs/>
                 <w:sz w:val="24"/>
                 <w:szCs w:val="24"/>
-                <w:u w:val="single"/>
               </w:rPr>
               <w:t>}</w:t>
             </w:r>
@@ -6195,17 +5987,15 @@
                 <w:bCs/>
                 <w:sz w:val="24"/>
                 <w:szCs w:val="24"/>
-                <w:u w:val="single"/>
-              </w:rPr>
-            </w:pPr>
-            <w:r>
-              <w:rPr>
-                <w:rFonts w:ascii="Arial" w:hAnsi="Arial" w:cs="Arial"/>
-                <w:b/>
-                <w:bCs/>
-                <w:sz w:val="24"/>
-                <w:szCs w:val="24"/>
-                <w:u w:val="single"/>
+              </w:rPr>
+            </w:pPr>
+            <w:r>
+              <w:rPr>
+                <w:rFonts w:ascii="Arial" w:hAnsi="Arial" w:cs="Arial"/>
+                <w:b/>
+                <w:bCs/>
+                <w:sz w:val="24"/>
+                <w:szCs w:val="24"/>
               </w:rPr>
               <w:t>{cm1}</w:t>
             </w:r>
@@ -6225,17 +6015,15 @@
                 <w:bCs/>
                 <w:sz w:val="24"/>
                 <w:szCs w:val="24"/>
-                <w:u w:val="single"/>
-              </w:rPr>
-            </w:pPr>
-            <w:r>
-              <w:rPr>
-                <w:rFonts w:ascii="Arial" w:hAnsi="Arial" w:cs="Arial"/>
-                <w:b/>
-                <w:bCs/>
-                <w:sz w:val="24"/>
-                <w:szCs w:val="24"/>
-                <w:u w:val="single"/>
+              </w:rPr>
+            </w:pPr>
+            <w:r>
+              <w:rPr>
+                <w:rFonts w:ascii="Arial" w:hAnsi="Arial" w:cs="Arial"/>
+                <w:b/>
+                <w:bCs/>
+                <w:sz w:val="24"/>
+                <w:szCs w:val="24"/>
               </w:rPr>
               <w:t>{cm</w:t>
             </w:r>
@@ -6246,7 +6034,6 @@
                 <w:bCs/>
                 <w:sz w:val="24"/>
                 <w:szCs w:val="24"/>
-                <w:u w:val="single"/>
               </w:rPr>
               <w:t>2</w:t>
             </w:r>
@@ -6257,7 +6044,6 @@
                 <w:bCs/>
                 <w:sz w:val="24"/>
                 <w:szCs w:val="24"/>
-                <w:u w:val="single"/>
               </w:rPr>
               <w:t>}</w:t>
             </w:r>
@@ -6277,17 +6063,15 @@
                 <w:bCs/>
                 <w:sz w:val="24"/>
                 <w:szCs w:val="24"/>
-                <w:u w:val="single"/>
-              </w:rPr>
-            </w:pPr>
-            <w:r>
-              <w:rPr>
-                <w:rFonts w:ascii="Arial" w:hAnsi="Arial" w:cs="Arial"/>
-                <w:b/>
-                <w:bCs/>
-                <w:sz w:val="24"/>
-                <w:szCs w:val="24"/>
-                <w:u w:val="single"/>
+              </w:rPr>
+            </w:pPr>
+            <w:r>
+              <w:rPr>
+                <w:rFonts w:ascii="Arial" w:hAnsi="Arial" w:cs="Arial"/>
+                <w:b/>
+                <w:bCs/>
+                <w:sz w:val="24"/>
+                <w:szCs w:val="24"/>
               </w:rPr>
               <w:t>{cm</w:t>
             </w:r>
@@ -6298,7 +6082,6 @@
                 <w:bCs/>
                 <w:sz w:val="24"/>
                 <w:szCs w:val="24"/>
-                <w:u w:val="single"/>
               </w:rPr>
               <w:t>3</w:t>
             </w:r>
@@ -6309,7 +6092,6 @@
                 <w:bCs/>
                 <w:sz w:val="24"/>
                 <w:szCs w:val="24"/>
-                <w:u w:val="single"/>
               </w:rPr>
               <w:t>}</w:t>
             </w:r>
@@ -6329,17 +6111,15 @@
                 <w:bCs/>
                 <w:sz w:val="24"/>
                 <w:szCs w:val="24"/>
-                <w:u w:val="single"/>
-              </w:rPr>
-            </w:pPr>
-            <w:r>
-              <w:rPr>
-                <w:rFonts w:ascii="Arial" w:hAnsi="Arial" w:cs="Arial"/>
-                <w:b/>
-                <w:bCs/>
-                <w:sz w:val="24"/>
-                <w:szCs w:val="24"/>
-                <w:u w:val="single"/>
+              </w:rPr>
+            </w:pPr>
+            <w:r>
+              <w:rPr>
+                <w:rFonts w:ascii="Arial" w:hAnsi="Arial" w:cs="Arial"/>
+                <w:b/>
+                <w:bCs/>
+                <w:sz w:val="24"/>
+                <w:szCs w:val="24"/>
               </w:rPr>
               <w:t>{cm</w:t>
             </w:r>
@@ -6350,7 +6130,6 @@
                 <w:bCs/>
                 <w:sz w:val="24"/>
                 <w:szCs w:val="24"/>
-                <w:u w:val="single"/>
               </w:rPr>
               <w:t>4</w:t>
             </w:r>
@@ -6361,7 +6140,6 @@
                 <w:bCs/>
                 <w:sz w:val="24"/>
                 <w:szCs w:val="24"/>
-                <w:u w:val="single"/>
               </w:rPr>
               <w:t>}</w:t>
             </w:r>
@@ -6381,17 +6159,15 @@
                 <w:bCs/>
                 <w:sz w:val="24"/>
                 <w:szCs w:val="24"/>
-                <w:u w:val="single"/>
-              </w:rPr>
-            </w:pPr>
-            <w:r>
-              <w:rPr>
-                <w:rFonts w:ascii="Arial" w:hAnsi="Arial" w:cs="Arial"/>
-                <w:b/>
-                <w:bCs/>
-                <w:sz w:val="24"/>
-                <w:szCs w:val="24"/>
-                <w:u w:val="single"/>
+              </w:rPr>
+            </w:pPr>
+            <w:r>
+              <w:rPr>
+                <w:rFonts w:ascii="Arial" w:hAnsi="Arial" w:cs="Arial"/>
+                <w:b/>
+                <w:bCs/>
+                <w:sz w:val="24"/>
+                <w:szCs w:val="24"/>
               </w:rPr>
               <w:t>{cm</w:t>
             </w:r>
@@ -6402,7 +6178,6 @@
                 <w:bCs/>
                 <w:sz w:val="24"/>
                 <w:szCs w:val="24"/>
-                <w:u w:val="single"/>
               </w:rPr>
               <w:t>5</w:t>
             </w:r>
@@ -6413,7 +6188,6 @@
                 <w:bCs/>
                 <w:sz w:val="24"/>
                 <w:szCs w:val="24"/>
-                <w:u w:val="single"/>
               </w:rPr>
               <w:t>}</w:t>
             </w:r>
@@ -6508,17 +6282,15 @@
                 <w:bCs/>
                 <w:sz w:val="24"/>
                 <w:szCs w:val="24"/>
-                <w:u w:val="single"/>
-              </w:rPr>
-            </w:pPr>
-            <w:r>
-              <w:rPr>
-                <w:rFonts w:ascii="Arial" w:hAnsi="Arial" w:cs="Arial"/>
-                <w:b/>
-                <w:bCs/>
-                <w:sz w:val="24"/>
-                <w:szCs w:val="24"/>
-                <w:u w:val="single"/>
+              </w:rPr>
+            </w:pPr>
+            <w:r>
+              <w:rPr>
+                <w:rFonts w:ascii="Arial" w:hAnsi="Arial" w:cs="Arial"/>
+                <w:b/>
+                <w:bCs/>
+                <w:sz w:val="24"/>
+                <w:szCs w:val="24"/>
               </w:rPr>
               <w:t>{ass1}</w:t>
             </w:r>
@@ -6538,17 +6310,15 @@
                 <w:bCs/>
                 <w:sz w:val="24"/>
                 <w:szCs w:val="24"/>
-                <w:u w:val="single"/>
-              </w:rPr>
-            </w:pPr>
-            <w:r>
-              <w:rPr>
-                <w:rFonts w:ascii="Arial" w:hAnsi="Arial" w:cs="Arial"/>
-                <w:b/>
-                <w:bCs/>
-                <w:sz w:val="24"/>
-                <w:szCs w:val="24"/>
-                <w:u w:val="single"/>
+              </w:rPr>
+            </w:pPr>
+            <w:r>
+              <w:rPr>
+                <w:rFonts w:ascii="Arial" w:hAnsi="Arial" w:cs="Arial"/>
+                <w:b/>
+                <w:bCs/>
+                <w:sz w:val="24"/>
+                <w:szCs w:val="24"/>
               </w:rPr>
               <w:t>{ass2}</w:t>
             </w:r>
@@ -6568,17 +6338,15 @@
                 <w:bCs/>
                 <w:sz w:val="24"/>
                 <w:szCs w:val="24"/>
-                <w:u w:val="single"/>
-              </w:rPr>
-            </w:pPr>
-            <w:r>
-              <w:rPr>
-                <w:rFonts w:ascii="Arial" w:hAnsi="Arial" w:cs="Arial"/>
-                <w:b/>
-                <w:bCs/>
-                <w:sz w:val="24"/>
-                <w:szCs w:val="24"/>
-                <w:u w:val="single"/>
+              </w:rPr>
+            </w:pPr>
+            <w:r>
+              <w:rPr>
+                <w:rFonts w:ascii="Arial" w:hAnsi="Arial" w:cs="Arial"/>
+                <w:b/>
+                <w:bCs/>
+                <w:sz w:val="24"/>
+                <w:szCs w:val="24"/>
               </w:rPr>
               <w:t>{ass3}</w:t>
             </w:r>
@@ -6598,17 +6366,15 @@
                 <w:bCs/>
                 <w:sz w:val="24"/>
                 <w:szCs w:val="24"/>
-                <w:u w:val="single"/>
-              </w:rPr>
-            </w:pPr>
-            <w:r>
-              <w:rPr>
-                <w:rFonts w:ascii="Arial" w:hAnsi="Arial" w:cs="Arial"/>
-                <w:b/>
-                <w:bCs/>
-                <w:sz w:val="24"/>
-                <w:szCs w:val="24"/>
-                <w:u w:val="single"/>
+              </w:rPr>
+            </w:pPr>
+            <w:r>
+              <w:rPr>
+                <w:rFonts w:ascii="Arial" w:hAnsi="Arial" w:cs="Arial"/>
+                <w:b/>
+                <w:bCs/>
+                <w:sz w:val="24"/>
+                <w:szCs w:val="24"/>
               </w:rPr>
               <w:t>{ass4}</w:t>
             </w:r>
@@ -6628,17 +6394,15 @@
                 <w:bCs/>
                 <w:sz w:val="24"/>
                 <w:szCs w:val="24"/>
-                <w:u w:val="single"/>
-              </w:rPr>
-            </w:pPr>
-            <w:r>
-              <w:rPr>
-                <w:rFonts w:ascii="Arial" w:hAnsi="Arial" w:cs="Arial"/>
-                <w:b/>
-                <w:bCs/>
-                <w:sz w:val="24"/>
-                <w:szCs w:val="24"/>
-                <w:u w:val="single"/>
+              </w:rPr>
+            </w:pPr>
+            <w:r>
+              <w:rPr>
+                <w:rFonts w:ascii="Arial" w:hAnsi="Arial" w:cs="Arial"/>
+                <w:b/>
+                <w:bCs/>
+                <w:sz w:val="24"/>
+                <w:szCs w:val="24"/>
               </w:rPr>
               <w:t>{ass5}</w:t>
             </w:r>
@@ -6733,17 +6497,15 @@
                 <w:bCs/>
                 <w:sz w:val="24"/>
                 <w:szCs w:val="24"/>
-                <w:u w:val="single"/>
-              </w:rPr>
-            </w:pPr>
-            <w:r>
-              <w:rPr>
-                <w:rFonts w:ascii="Arial" w:hAnsi="Arial" w:cs="Arial"/>
-                <w:b/>
-                <w:bCs/>
-                <w:sz w:val="24"/>
-                <w:szCs w:val="24"/>
-                <w:u w:val="single"/>
+              </w:rPr>
+            </w:pPr>
+            <w:r>
+              <w:rPr>
+                <w:rFonts w:ascii="Arial" w:hAnsi="Arial" w:cs="Arial"/>
+                <w:b/>
+                <w:bCs/>
+                <w:sz w:val="24"/>
+                <w:szCs w:val="24"/>
               </w:rPr>
               <w:t>{ti1}</w:t>
             </w:r>
@@ -6763,17 +6525,15 @@
                 <w:bCs/>
                 <w:sz w:val="24"/>
                 <w:szCs w:val="24"/>
-                <w:u w:val="single"/>
-              </w:rPr>
-            </w:pPr>
-            <w:r>
-              <w:rPr>
-                <w:rFonts w:ascii="Arial" w:hAnsi="Arial" w:cs="Arial"/>
-                <w:b/>
-                <w:bCs/>
-                <w:sz w:val="24"/>
-                <w:szCs w:val="24"/>
-                <w:u w:val="single"/>
+              </w:rPr>
+            </w:pPr>
+            <w:r>
+              <w:rPr>
+                <w:rFonts w:ascii="Arial" w:hAnsi="Arial" w:cs="Arial"/>
+                <w:b/>
+                <w:bCs/>
+                <w:sz w:val="24"/>
+                <w:szCs w:val="24"/>
               </w:rPr>
               <w:t>{ti2}</w:t>
             </w:r>
@@ -6793,17 +6553,15 @@
                 <w:bCs/>
                 <w:sz w:val="24"/>
                 <w:szCs w:val="24"/>
-                <w:u w:val="single"/>
-              </w:rPr>
-            </w:pPr>
-            <w:r>
-              <w:rPr>
-                <w:rFonts w:ascii="Arial" w:hAnsi="Arial" w:cs="Arial"/>
-                <w:b/>
-                <w:bCs/>
-                <w:sz w:val="24"/>
-                <w:szCs w:val="24"/>
-                <w:u w:val="single"/>
+              </w:rPr>
+            </w:pPr>
+            <w:r>
+              <w:rPr>
+                <w:rFonts w:ascii="Arial" w:hAnsi="Arial" w:cs="Arial"/>
+                <w:b/>
+                <w:bCs/>
+                <w:sz w:val="24"/>
+                <w:szCs w:val="24"/>
               </w:rPr>
               <w:t>{ti3}</w:t>
             </w:r>
@@ -6823,17 +6581,15 @@
                 <w:bCs/>
                 <w:sz w:val="24"/>
                 <w:szCs w:val="24"/>
-                <w:u w:val="single"/>
-              </w:rPr>
-            </w:pPr>
-            <w:r>
-              <w:rPr>
-                <w:rFonts w:ascii="Arial" w:hAnsi="Arial" w:cs="Arial"/>
-                <w:b/>
-                <w:bCs/>
-                <w:sz w:val="24"/>
-                <w:szCs w:val="24"/>
-                <w:u w:val="single"/>
+              </w:rPr>
+            </w:pPr>
+            <w:r>
+              <w:rPr>
+                <w:rFonts w:ascii="Arial" w:hAnsi="Arial" w:cs="Arial"/>
+                <w:b/>
+                <w:bCs/>
+                <w:sz w:val="24"/>
+                <w:szCs w:val="24"/>
               </w:rPr>
               <w:t>{ti4}</w:t>
             </w:r>
@@ -6853,17 +6609,15 @@
                 <w:bCs/>
                 <w:sz w:val="24"/>
                 <w:szCs w:val="24"/>
-                <w:u w:val="single"/>
-              </w:rPr>
-            </w:pPr>
-            <w:r>
-              <w:rPr>
-                <w:rFonts w:ascii="Arial" w:hAnsi="Arial" w:cs="Arial"/>
-                <w:b/>
-                <w:bCs/>
-                <w:sz w:val="24"/>
-                <w:szCs w:val="24"/>
-                <w:u w:val="single"/>
+              </w:rPr>
+            </w:pPr>
+            <w:r>
+              <w:rPr>
+                <w:rFonts w:ascii="Arial" w:hAnsi="Arial" w:cs="Arial"/>
+                <w:b/>
+                <w:bCs/>
+                <w:sz w:val="24"/>
+                <w:szCs w:val="24"/>
               </w:rPr>
               <w:t>{ti5}</w:t>
             </w:r>
@@ -6963,17 +6717,15 @@
                 <w:bCs/>
                 <w:sz w:val="24"/>
                 <w:szCs w:val="24"/>
-                <w:u w:val="single"/>
-              </w:rPr>
-            </w:pPr>
-            <w:r>
-              <w:rPr>
-                <w:rFonts w:ascii="Arial" w:hAnsi="Arial" w:cs="Arial"/>
-                <w:b/>
-                <w:bCs/>
-                <w:sz w:val="24"/>
-                <w:szCs w:val="24"/>
-                <w:u w:val="single"/>
+              </w:rPr>
+            </w:pPr>
+            <w:r>
+              <w:rPr>
+                <w:rFonts w:ascii="Arial" w:hAnsi="Arial" w:cs="Arial"/>
+                <w:b/>
+                <w:bCs/>
+                <w:sz w:val="24"/>
+                <w:szCs w:val="24"/>
               </w:rPr>
               <w:t>{es1}</w:t>
             </w:r>
@@ -6993,17 +6745,15 @@
                 <w:bCs/>
                 <w:sz w:val="24"/>
                 <w:szCs w:val="24"/>
-                <w:u w:val="single"/>
-              </w:rPr>
-            </w:pPr>
-            <w:r>
-              <w:rPr>
-                <w:rFonts w:ascii="Arial" w:hAnsi="Arial" w:cs="Arial"/>
-                <w:b/>
-                <w:bCs/>
-                <w:sz w:val="24"/>
-                <w:szCs w:val="24"/>
-                <w:u w:val="single"/>
+              </w:rPr>
+            </w:pPr>
+            <w:r>
+              <w:rPr>
+                <w:rFonts w:ascii="Arial" w:hAnsi="Arial" w:cs="Arial"/>
+                <w:b/>
+                <w:bCs/>
+                <w:sz w:val="24"/>
+                <w:szCs w:val="24"/>
               </w:rPr>
               <w:t>{es2}</w:t>
             </w:r>
@@ -7023,17 +6773,15 @@
                 <w:bCs/>
                 <w:sz w:val="24"/>
                 <w:szCs w:val="24"/>
-                <w:u w:val="single"/>
-              </w:rPr>
-            </w:pPr>
-            <w:r>
-              <w:rPr>
-                <w:rFonts w:ascii="Arial" w:hAnsi="Arial" w:cs="Arial"/>
-                <w:b/>
-                <w:bCs/>
-                <w:sz w:val="24"/>
-                <w:szCs w:val="24"/>
-                <w:u w:val="single"/>
+              </w:rPr>
+            </w:pPr>
+            <w:r>
+              <w:rPr>
+                <w:rFonts w:ascii="Arial" w:hAnsi="Arial" w:cs="Arial"/>
+                <w:b/>
+                <w:bCs/>
+                <w:sz w:val="24"/>
+                <w:szCs w:val="24"/>
               </w:rPr>
               <w:t>{es3}</w:t>
             </w:r>
@@ -7053,17 +6801,15 @@
                 <w:bCs/>
                 <w:sz w:val="24"/>
                 <w:szCs w:val="24"/>
-                <w:u w:val="single"/>
-              </w:rPr>
-            </w:pPr>
-            <w:r>
-              <w:rPr>
-                <w:rFonts w:ascii="Arial" w:hAnsi="Arial" w:cs="Arial"/>
-                <w:b/>
-                <w:bCs/>
-                <w:sz w:val="24"/>
-                <w:szCs w:val="24"/>
-                <w:u w:val="single"/>
+              </w:rPr>
+            </w:pPr>
+            <w:r>
+              <w:rPr>
+                <w:rFonts w:ascii="Arial" w:hAnsi="Arial" w:cs="Arial"/>
+                <w:b/>
+                <w:bCs/>
+                <w:sz w:val="24"/>
+                <w:szCs w:val="24"/>
               </w:rPr>
               <w:t>{es4}</w:t>
             </w:r>
@@ -7083,17 +6829,15 @@
                 <w:bCs/>
                 <w:sz w:val="24"/>
                 <w:szCs w:val="24"/>
-                <w:u w:val="single"/>
-              </w:rPr>
-            </w:pPr>
-            <w:r>
-              <w:rPr>
-                <w:rFonts w:ascii="Arial" w:hAnsi="Arial" w:cs="Arial"/>
-                <w:b/>
-                <w:bCs/>
-                <w:sz w:val="24"/>
-                <w:szCs w:val="24"/>
-                <w:u w:val="single"/>
+              </w:rPr>
+            </w:pPr>
+            <w:r>
+              <w:rPr>
+                <w:rFonts w:ascii="Arial" w:hAnsi="Arial" w:cs="Arial"/>
+                <w:b/>
+                <w:bCs/>
+                <w:sz w:val="24"/>
+                <w:szCs w:val="24"/>
               </w:rPr>
               <w:t>{es5}</w:t>
             </w:r>
@@ -7188,17 +6932,15 @@
                 <w:bCs/>
                 <w:sz w:val="24"/>
                 <w:szCs w:val="24"/>
-                <w:u w:val="single"/>
-              </w:rPr>
-            </w:pPr>
-            <w:r>
-              <w:rPr>
-                <w:rFonts w:ascii="Arial" w:hAnsi="Arial" w:cs="Arial"/>
-                <w:b/>
-                <w:bCs/>
-                <w:sz w:val="24"/>
-                <w:szCs w:val="24"/>
-                <w:u w:val="single"/>
+              </w:rPr>
+            </w:pPr>
+            <w:r>
+              <w:rPr>
+                <w:rFonts w:ascii="Arial" w:hAnsi="Arial" w:cs="Arial"/>
+                <w:b/>
+                <w:bCs/>
+                <w:sz w:val="24"/>
+                <w:szCs w:val="24"/>
               </w:rPr>
               <w:t>{em1}</w:t>
             </w:r>
@@ -7218,17 +6960,15 @@
                 <w:bCs/>
                 <w:sz w:val="24"/>
                 <w:szCs w:val="24"/>
-                <w:u w:val="single"/>
-              </w:rPr>
-            </w:pPr>
-            <w:r>
-              <w:rPr>
-                <w:rFonts w:ascii="Arial" w:hAnsi="Arial" w:cs="Arial"/>
-                <w:b/>
-                <w:bCs/>
-                <w:sz w:val="24"/>
-                <w:szCs w:val="24"/>
-                <w:u w:val="single"/>
+              </w:rPr>
+            </w:pPr>
+            <w:r>
+              <w:rPr>
+                <w:rFonts w:ascii="Arial" w:hAnsi="Arial" w:cs="Arial"/>
+                <w:b/>
+                <w:bCs/>
+                <w:sz w:val="24"/>
+                <w:szCs w:val="24"/>
               </w:rPr>
               <w:t>{em2}</w:t>
             </w:r>
@@ -7248,17 +6988,15 @@
                 <w:bCs/>
                 <w:sz w:val="24"/>
                 <w:szCs w:val="24"/>
-                <w:u w:val="single"/>
-              </w:rPr>
-            </w:pPr>
-            <w:r>
-              <w:rPr>
-                <w:rFonts w:ascii="Arial" w:hAnsi="Arial" w:cs="Arial"/>
-                <w:b/>
-                <w:bCs/>
-                <w:sz w:val="24"/>
-                <w:szCs w:val="24"/>
-                <w:u w:val="single"/>
+              </w:rPr>
+            </w:pPr>
+            <w:r>
+              <w:rPr>
+                <w:rFonts w:ascii="Arial" w:hAnsi="Arial" w:cs="Arial"/>
+                <w:b/>
+                <w:bCs/>
+                <w:sz w:val="24"/>
+                <w:szCs w:val="24"/>
               </w:rPr>
               <w:t>{em3}</w:t>
             </w:r>
@@ -7278,17 +7016,15 @@
                 <w:bCs/>
                 <w:sz w:val="24"/>
                 <w:szCs w:val="24"/>
-                <w:u w:val="single"/>
-              </w:rPr>
-            </w:pPr>
-            <w:r>
-              <w:rPr>
-                <w:rFonts w:ascii="Arial" w:hAnsi="Arial" w:cs="Arial"/>
-                <w:b/>
-                <w:bCs/>
-                <w:sz w:val="24"/>
-                <w:szCs w:val="24"/>
-                <w:u w:val="single"/>
+              </w:rPr>
+            </w:pPr>
+            <w:r>
+              <w:rPr>
+                <w:rFonts w:ascii="Arial" w:hAnsi="Arial" w:cs="Arial"/>
+                <w:b/>
+                <w:bCs/>
+                <w:sz w:val="24"/>
+                <w:szCs w:val="24"/>
               </w:rPr>
               <w:t>{em4}</w:t>
             </w:r>
@@ -7308,17 +7044,15 @@
                 <w:bCs/>
                 <w:sz w:val="24"/>
                 <w:szCs w:val="24"/>
-                <w:u w:val="single"/>
-              </w:rPr>
-            </w:pPr>
-            <w:r>
-              <w:rPr>
-                <w:rFonts w:ascii="Arial" w:hAnsi="Arial" w:cs="Arial"/>
-                <w:b/>
-                <w:bCs/>
-                <w:sz w:val="24"/>
-                <w:szCs w:val="24"/>
-                <w:u w:val="single"/>
+              </w:rPr>
+            </w:pPr>
+            <w:r>
+              <w:rPr>
+                <w:rFonts w:ascii="Arial" w:hAnsi="Arial" w:cs="Arial"/>
+                <w:b/>
+                <w:bCs/>
+                <w:sz w:val="24"/>
+                <w:szCs w:val="24"/>
               </w:rPr>
               <w:t>{em5}</w:t>
             </w:r>
@@ -7387,17 +7121,15 @@
                 <w:bCs/>
                 <w:sz w:val="24"/>
                 <w:szCs w:val="24"/>
-                <w:u w:val="single"/>
-              </w:rPr>
-            </w:pPr>
-            <w:r>
-              <w:rPr>
-                <w:rFonts w:ascii="Arial" w:hAnsi="Arial" w:cs="Arial"/>
-                <w:b/>
-                <w:bCs/>
-                <w:sz w:val="24"/>
-                <w:szCs w:val="24"/>
-                <w:u w:val="single"/>
+              </w:rPr>
+            </w:pPr>
+            <w:r>
+              <w:rPr>
+                <w:rFonts w:ascii="Arial" w:hAnsi="Arial" w:cs="Arial"/>
+                <w:b/>
+                <w:bCs/>
+                <w:sz w:val="24"/>
+                <w:szCs w:val="24"/>
               </w:rPr>
               <w:t>{dv1}</w:t>
             </w:r>
@@ -7417,17 +7149,15 @@
                 <w:bCs/>
                 <w:sz w:val="24"/>
                 <w:szCs w:val="24"/>
-                <w:u w:val="single"/>
-              </w:rPr>
-            </w:pPr>
-            <w:r>
-              <w:rPr>
-                <w:rFonts w:ascii="Arial" w:hAnsi="Arial" w:cs="Arial"/>
-                <w:b/>
-                <w:bCs/>
-                <w:sz w:val="24"/>
-                <w:szCs w:val="24"/>
-                <w:u w:val="single"/>
+              </w:rPr>
+            </w:pPr>
+            <w:r>
+              <w:rPr>
+                <w:rFonts w:ascii="Arial" w:hAnsi="Arial" w:cs="Arial"/>
+                <w:b/>
+                <w:bCs/>
+                <w:sz w:val="24"/>
+                <w:szCs w:val="24"/>
               </w:rPr>
               <w:t>{dv2}</w:t>
             </w:r>
@@ -7447,17 +7177,15 @@
                 <w:bCs/>
                 <w:sz w:val="24"/>
                 <w:szCs w:val="24"/>
-                <w:u w:val="single"/>
-              </w:rPr>
-            </w:pPr>
-            <w:r>
-              <w:rPr>
-                <w:rFonts w:ascii="Arial" w:hAnsi="Arial" w:cs="Arial"/>
-                <w:b/>
-                <w:bCs/>
-                <w:sz w:val="24"/>
-                <w:szCs w:val="24"/>
-                <w:u w:val="single"/>
+              </w:rPr>
+            </w:pPr>
+            <w:r>
+              <w:rPr>
+                <w:rFonts w:ascii="Arial" w:hAnsi="Arial" w:cs="Arial"/>
+                <w:b/>
+                <w:bCs/>
+                <w:sz w:val="24"/>
+                <w:szCs w:val="24"/>
               </w:rPr>
               <w:t>{dv3}</w:t>
             </w:r>
@@ -7477,17 +7205,15 @@
                 <w:bCs/>
                 <w:sz w:val="24"/>
                 <w:szCs w:val="24"/>
-                <w:u w:val="single"/>
-              </w:rPr>
-            </w:pPr>
-            <w:r>
-              <w:rPr>
-                <w:rFonts w:ascii="Arial" w:hAnsi="Arial" w:cs="Arial"/>
-                <w:b/>
-                <w:bCs/>
-                <w:sz w:val="24"/>
-                <w:szCs w:val="24"/>
-                <w:u w:val="single"/>
+              </w:rPr>
+            </w:pPr>
+            <w:r>
+              <w:rPr>
+                <w:rFonts w:ascii="Arial" w:hAnsi="Arial" w:cs="Arial"/>
+                <w:b/>
+                <w:bCs/>
+                <w:sz w:val="24"/>
+                <w:szCs w:val="24"/>
               </w:rPr>
               <w:t>{dv4}</w:t>
             </w:r>
@@ -7507,17 +7233,15 @@
                 <w:bCs/>
                 <w:sz w:val="24"/>
                 <w:szCs w:val="24"/>
-                <w:u w:val="single"/>
-              </w:rPr>
-            </w:pPr>
-            <w:r>
-              <w:rPr>
-                <w:rFonts w:ascii="Arial" w:hAnsi="Arial" w:cs="Arial"/>
-                <w:b/>
-                <w:bCs/>
-                <w:sz w:val="24"/>
-                <w:szCs w:val="24"/>
-                <w:u w:val="single"/>
+              </w:rPr>
+            </w:pPr>
+            <w:r>
+              <w:rPr>
+                <w:rFonts w:ascii="Arial" w:hAnsi="Arial" w:cs="Arial"/>
+                <w:b/>
+                <w:bCs/>
+                <w:sz w:val="24"/>
+                <w:szCs w:val="24"/>
               </w:rPr>
               <w:t>{dv5}</w:t>
             </w:r>
@@ -7586,17 +7310,15 @@
                 <w:bCs/>
                 <w:sz w:val="24"/>
                 <w:szCs w:val="24"/>
-                <w:u w:val="single"/>
-              </w:rPr>
-            </w:pPr>
-            <w:r>
-              <w:rPr>
-                <w:rFonts w:ascii="Arial" w:hAnsi="Arial" w:cs="Arial"/>
-                <w:b/>
-                <w:bCs/>
-                <w:sz w:val="24"/>
-                <w:szCs w:val="24"/>
-                <w:u w:val="single"/>
+              </w:rPr>
+            </w:pPr>
+            <w:r>
+              <w:rPr>
+                <w:rFonts w:ascii="Arial" w:hAnsi="Arial" w:cs="Arial"/>
+                <w:b/>
+                <w:bCs/>
+                <w:sz w:val="24"/>
+                <w:szCs w:val="24"/>
               </w:rPr>
               <w:t>{as1}</w:t>
             </w:r>
@@ -7616,17 +7338,15 @@
                 <w:bCs/>
                 <w:sz w:val="24"/>
                 <w:szCs w:val="24"/>
-                <w:u w:val="single"/>
-              </w:rPr>
-            </w:pPr>
-            <w:r>
-              <w:rPr>
-                <w:rFonts w:ascii="Arial" w:hAnsi="Arial" w:cs="Arial"/>
-                <w:b/>
-                <w:bCs/>
-                <w:sz w:val="24"/>
-                <w:szCs w:val="24"/>
-                <w:u w:val="single"/>
+              </w:rPr>
+            </w:pPr>
+            <w:r>
+              <w:rPr>
+                <w:rFonts w:ascii="Arial" w:hAnsi="Arial" w:cs="Arial"/>
+                <w:b/>
+                <w:bCs/>
+                <w:sz w:val="24"/>
+                <w:szCs w:val="24"/>
               </w:rPr>
               <w:t>{as2}</w:t>
             </w:r>
@@ -7646,17 +7366,15 @@
                 <w:bCs/>
                 <w:sz w:val="24"/>
                 <w:szCs w:val="24"/>
-                <w:u w:val="single"/>
-              </w:rPr>
-            </w:pPr>
-            <w:r>
-              <w:rPr>
-                <w:rFonts w:ascii="Arial" w:hAnsi="Arial" w:cs="Arial"/>
-                <w:b/>
-                <w:bCs/>
-                <w:sz w:val="24"/>
-                <w:szCs w:val="24"/>
-                <w:u w:val="single"/>
+              </w:rPr>
+            </w:pPr>
+            <w:r>
+              <w:rPr>
+                <w:rFonts w:ascii="Arial" w:hAnsi="Arial" w:cs="Arial"/>
+                <w:b/>
+                <w:bCs/>
+                <w:sz w:val="24"/>
+                <w:szCs w:val="24"/>
               </w:rPr>
               <w:t>{as3}</w:t>
             </w:r>
@@ -7676,17 +7394,15 @@
                 <w:bCs/>
                 <w:sz w:val="24"/>
                 <w:szCs w:val="24"/>
-                <w:u w:val="single"/>
-              </w:rPr>
-            </w:pPr>
-            <w:r>
-              <w:rPr>
-                <w:rFonts w:ascii="Arial" w:hAnsi="Arial" w:cs="Arial"/>
-                <w:b/>
-                <w:bCs/>
-                <w:sz w:val="24"/>
-                <w:szCs w:val="24"/>
-                <w:u w:val="single"/>
+              </w:rPr>
+            </w:pPr>
+            <w:r>
+              <w:rPr>
+                <w:rFonts w:ascii="Arial" w:hAnsi="Arial" w:cs="Arial"/>
+                <w:b/>
+                <w:bCs/>
+                <w:sz w:val="24"/>
+                <w:szCs w:val="24"/>
               </w:rPr>
               <w:t>{as4}</w:t>
             </w:r>
@@ -7706,17 +7422,15 @@
                 <w:bCs/>
                 <w:sz w:val="24"/>
                 <w:szCs w:val="24"/>
-                <w:u w:val="single"/>
-              </w:rPr>
-            </w:pPr>
-            <w:r>
-              <w:rPr>
-                <w:rFonts w:ascii="Arial" w:hAnsi="Arial" w:cs="Arial"/>
-                <w:b/>
-                <w:bCs/>
-                <w:sz w:val="24"/>
-                <w:szCs w:val="24"/>
-                <w:u w:val="single"/>
+              </w:rPr>
+            </w:pPr>
+            <w:r>
+              <w:rPr>
+                <w:rFonts w:ascii="Arial" w:hAnsi="Arial" w:cs="Arial"/>
+                <w:b/>
+                <w:bCs/>
+                <w:sz w:val="24"/>
+                <w:szCs w:val="24"/>
               </w:rPr>
               <w:t>{as5}</w:t>
             </w:r>
@@ -7785,17 +7499,15 @@
                 <w:bCs/>
                 <w:sz w:val="24"/>
                 <w:szCs w:val="24"/>
-                <w:u w:val="single"/>
-              </w:rPr>
-            </w:pPr>
-            <w:r>
-              <w:rPr>
-                <w:rFonts w:ascii="Arial" w:hAnsi="Arial" w:cs="Arial"/>
-                <w:b/>
-                <w:bCs/>
-                <w:sz w:val="24"/>
-                <w:szCs w:val="24"/>
-                <w:u w:val="single"/>
+              </w:rPr>
+            </w:pPr>
+            <w:r>
+              <w:rPr>
+                <w:rFonts w:ascii="Arial" w:hAnsi="Arial" w:cs="Arial"/>
+                <w:b/>
+                <w:bCs/>
+                <w:sz w:val="24"/>
+                <w:szCs w:val="24"/>
               </w:rPr>
               <w:t>{an1}</w:t>
             </w:r>
@@ -7815,17 +7527,15 @@
                 <w:bCs/>
                 <w:sz w:val="24"/>
                 <w:szCs w:val="24"/>
-                <w:u w:val="single"/>
-              </w:rPr>
-            </w:pPr>
-            <w:r>
-              <w:rPr>
-                <w:rFonts w:ascii="Arial" w:hAnsi="Arial" w:cs="Arial"/>
-                <w:b/>
-                <w:bCs/>
-                <w:sz w:val="24"/>
-                <w:szCs w:val="24"/>
-                <w:u w:val="single"/>
+              </w:rPr>
+            </w:pPr>
+            <w:r>
+              <w:rPr>
+                <w:rFonts w:ascii="Arial" w:hAnsi="Arial" w:cs="Arial"/>
+                <w:b/>
+                <w:bCs/>
+                <w:sz w:val="24"/>
+                <w:szCs w:val="24"/>
               </w:rPr>
               <w:t>{an</w:t>
             </w:r>
@@ -7836,7 +7546,6 @@
                 <w:bCs/>
                 <w:sz w:val="24"/>
                 <w:szCs w:val="24"/>
-                <w:u w:val="single"/>
               </w:rPr>
               <w:t>2</w:t>
             </w:r>
@@ -7847,7 +7556,6 @@
                 <w:bCs/>
                 <w:sz w:val="24"/>
                 <w:szCs w:val="24"/>
-                <w:u w:val="single"/>
               </w:rPr>
               <w:t>}</w:t>
             </w:r>
@@ -7867,17 +7575,15 @@
                 <w:bCs/>
                 <w:sz w:val="24"/>
                 <w:szCs w:val="24"/>
-                <w:u w:val="single"/>
-              </w:rPr>
-            </w:pPr>
-            <w:r>
-              <w:rPr>
-                <w:rFonts w:ascii="Arial" w:hAnsi="Arial" w:cs="Arial"/>
-                <w:b/>
-                <w:bCs/>
-                <w:sz w:val="24"/>
-                <w:szCs w:val="24"/>
-                <w:u w:val="single"/>
+              </w:rPr>
+            </w:pPr>
+            <w:r>
+              <w:rPr>
+                <w:rFonts w:ascii="Arial" w:hAnsi="Arial" w:cs="Arial"/>
+                <w:b/>
+                <w:bCs/>
+                <w:sz w:val="24"/>
+                <w:szCs w:val="24"/>
               </w:rPr>
               <w:t>{an</w:t>
             </w:r>
@@ -7888,7 +7594,6 @@
                 <w:bCs/>
                 <w:sz w:val="24"/>
                 <w:szCs w:val="24"/>
-                <w:u w:val="single"/>
               </w:rPr>
               <w:t>3</w:t>
             </w:r>
@@ -7899,7 +7604,6 @@
                 <w:bCs/>
                 <w:sz w:val="24"/>
                 <w:szCs w:val="24"/>
-                <w:u w:val="single"/>
               </w:rPr>
               <w:t>}</w:t>
             </w:r>
@@ -7919,17 +7623,15 @@
                 <w:bCs/>
                 <w:sz w:val="24"/>
                 <w:szCs w:val="24"/>
-                <w:u w:val="single"/>
-              </w:rPr>
-            </w:pPr>
-            <w:r>
-              <w:rPr>
-                <w:rFonts w:ascii="Arial" w:hAnsi="Arial" w:cs="Arial"/>
-                <w:b/>
-                <w:bCs/>
-                <w:sz w:val="24"/>
-                <w:szCs w:val="24"/>
-                <w:u w:val="single"/>
+              </w:rPr>
+            </w:pPr>
+            <w:r>
+              <w:rPr>
+                <w:rFonts w:ascii="Arial" w:hAnsi="Arial" w:cs="Arial"/>
+                <w:b/>
+                <w:bCs/>
+                <w:sz w:val="24"/>
+                <w:szCs w:val="24"/>
               </w:rPr>
               <w:t>{an</w:t>
             </w:r>
@@ -7940,7 +7642,6 @@
                 <w:bCs/>
                 <w:sz w:val="24"/>
                 <w:szCs w:val="24"/>
-                <w:u w:val="single"/>
               </w:rPr>
               <w:t>4</w:t>
             </w:r>
@@ -7951,7 +7652,6 @@
                 <w:bCs/>
                 <w:sz w:val="24"/>
                 <w:szCs w:val="24"/>
-                <w:u w:val="single"/>
               </w:rPr>
               <w:t>}</w:t>
             </w:r>
@@ -7971,17 +7671,15 @@
                 <w:bCs/>
                 <w:sz w:val="24"/>
                 <w:szCs w:val="24"/>
-                <w:u w:val="single"/>
-              </w:rPr>
-            </w:pPr>
-            <w:r>
-              <w:rPr>
-                <w:rFonts w:ascii="Arial" w:hAnsi="Arial" w:cs="Arial"/>
-                <w:b/>
-                <w:bCs/>
-                <w:sz w:val="24"/>
-                <w:szCs w:val="24"/>
-                <w:u w:val="single"/>
+              </w:rPr>
+            </w:pPr>
+            <w:r>
+              <w:rPr>
+                <w:rFonts w:ascii="Arial" w:hAnsi="Arial" w:cs="Arial"/>
+                <w:b/>
+                <w:bCs/>
+                <w:sz w:val="24"/>
+                <w:szCs w:val="24"/>
               </w:rPr>
               <w:t>{an</w:t>
             </w:r>
@@ -7992,7 +7690,6 @@
                 <w:bCs/>
                 <w:sz w:val="24"/>
                 <w:szCs w:val="24"/>
-                <w:u w:val="single"/>
               </w:rPr>
               <w:t>5</w:t>
             </w:r>
@@ -8003,7 +7700,6 @@
                 <w:bCs/>
                 <w:sz w:val="24"/>
                 <w:szCs w:val="24"/>
-                <w:u w:val="single"/>
               </w:rPr>
               <w:t>}</w:t>
             </w:r>
@@ -8072,17 +7768,15 @@
                 <w:bCs/>
                 <w:sz w:val="24"/>
                 <w:szCs w:val="24"/>
-                <w:u w:val="single"/>
-              </w:rPr>
-            </w:pPr>
-            <w:r>
-              <w:rPr>
-                <w:rFonts w:ascii="Arial" w:hAnsi="Arial" w:cs="Arial"/>
-                <w:b/>
-                <w:bCs/>
-                <w:sz w:val="24"/>
-                <w:szCs w:val="24"/>
-                <w:u w:val="single"/>
+              </w:rPr>
+            </w:pPr>
+            <w:r>
+              <w:rPr>
+                <w:rFonts w:ascii="Arial" w:hAnsi="Arial" w:cs="Arial"/>
+                <w:b/>
+                <w:bCs/>
+                <w:sz w:val="24"/>
+                <w:szCs w:val="24"/>
               </w:rPr>
               <w:t>{ha1}</w:t>
             </w:r>
@@ -8102,17 +7796,15 @@
                 <w:bCs/>
                 <w:sz w:val="24"/>
                 <w:szCs w:val="24"/>
-                <w:u w:val="single"/>
-              </w:rPr>
-            </w:pPr>
-            <w:r>
-              <w:rPr>
-                <w:rFonts w:ascii="Arial" w:hAnsi="Arial" w:cs="Arial"/>
-                <w:b/>
-                <w:bCs/>
-                <w:sz w:val="24"/>
-                <w:szCs w:val="24"/>
-                <w:u w:val="single"/>
+              </w:rPr>
+            </w:pPr>
+            <w:r>
+              <w:rPr>
+                <w:rFonts w:ascii="Arial" w:hAnsi="Arial" w:cs="Arial"/>
+                <w:b/>
+                <w:bCs/>
+                <w:sz w:val="24"/>
+                <w:szCs w:val="24"/>
               </w:rPr>
               <w:t>{ha</w:t>
             </w:r>
@@ -8123,7 +7815,6 @@
                 <w:bCs/>
                 <w:sz w:val="24"/>
                 <w:szCs w:val="24"/>
-                <w:u w:val="single"/>
               </w:rPr>
               <w:t>2</w:t>
             </w:r>
@@ -8134,7 +7825,6 @@
                 <w:bCs/>
                 <w:sz w:val="24"/>
                 <w:szCs w:val="24"/>
-                <w:u w:val="single"/>
               </w:rPr>
               <w:t>}</w:t>
             </w:r>
@@ -8154,17 +7844,15 @@
                 <w:bCs/>
                 <w:sz w:val="24"/>
                 <w:szCs w:val="24"/>
-                <w:u w:val="single"/>
-              </w:rPr>
-            </w:pPr>
-            <w:r>
-              <w:rPr>
-                <w:rFonts w:ascii="Arial" w:hAnsi="Arial" w:cs="Arial"/>
-                <w:b/>
-                <w:bCs/>
-                <w:sz w:val="24"/>
-                <w:szCs w:val="24"/>
-                <w:u w:val="single"/>
+              </w:rPr>
+            </w:pPr>
+            <w:r>
+              <w:rPr>
+                <w:rFonts w:ascii="Arial" w:hAnsi="Arial" w:cs="Arial"/>
+                <w:b/>
+                <w:bCs/>
+                <w:sz w:val="24"/>
+                <w:szCs w:val="24"/>
               </w:rPr>
               <w:t>{ha</w:t>
             </w:r>
@@ -8175,7 +7863,6 @@
                 <w:bCs/>
                 <w:sz w:val="24"/>
                 <w:szCs w:val="24"/>
-                <w:u w:val="single"/>
               </w:rPr>
               <w:t>3</w:t>
             </w:r>
@@ -8186,7 +7873,6 @@
                 <w:bCs/>
                 <w:sz w:val="24"/>
                 <w:szCs w:val="24"/>
-                <w:u w:val="single"/>
               </w:rPr>
               <w:t>}</w:t>
             </w:r>
@@ -8206,17 +7892,15 @@
                 <w:bCs/>
                 <w:sz w:val="24"/>
                 <w:szCs w:val="24"/>
-                <w:u w:val="single"/>
-              </w:rPr>
-            </w:pPr>
-            <w:r>
-              <w:rPr>
-                <w:rFonts w:ascii="Arial" w:hAnsi="Arial" w:cs="Arial"/>
-                <w:b/>
-                <w:bCs/>
-                <w:sz w:val="24"/>
-                <w:szCs w:val="24"/>
-                <w:u w:val="single"/>
+              </w:rPr>
+            </w:pPr>
+            <w:r>
+              <w:rPr>
+                <w:rFonts w:ascii="Arial" w:hAnsi="Arial" w:cs="Arial"/>
+                <w:b/>
+                <w:bCs/>
+                <w:sz w:val="24"/>
+                <w:szCs w:val="24"/>
               </w:rPr>
               <w:t>{ha</w:t>
             </w:r>
@@ -8227,7 +7911,6 @@
                 <w:bCs/>
                 <w:sz w:val="24"/>
                 <w:szCs w:val="24"/>
-                <w:u w:val="single"/>
               </w:rPr>
               <w:t>4</w:t>
             </w:r>
@@ -8238,7 +7921,6 @@
                 <w:bCs/>
                 <w:sz w:val="24"/>
                 <w:szCs w:val="24"/>
-                <w:u w:val="single"/>
               </w:rPr>
               <w:t>}</w:t>
             </w:r>
@@ -8258,17 +7940,15 @@
                 <w:bCs/>
                 <w:sz w:val="24"/>
                 <w:szCs w:val="24"/>
-                <w:u w:val="single"/>
-              </w:rPr>
-            </w:pPr>
-            <w:r>
-              <w:rPr>
-                <w:rFonts w:ascii="Arial" w:hAnsi="Arial" w:cs="Arial"/>
-                <w:b/>
-                <w:bCs/>
-                <w:sz w:val="24"/>
-                <w:szCs w:val="24"/>
-                <w:u w:val="single"/>
+              </w:rPr>
+            </w:pPr>
+            <w:r>
+              <w:rPr>
+                <w:rFonts w:ascii="Arial" w:hAnsi="Arial" w:cs="Arial"/>
+                <w:b/>
+                <w:bCs/>
+                <w:sz w:val="24"/>
+                <w:szCs w:val="24"/>
               </w:rPr>
               <w:t>{ha</w:t>
             </w:r>
@@ -8279,7 +7959,6 @@
                 <w:bCs/>
                 <w:sz w:val="24"/>
                 <w:szCs w:val="24"/>
-                <w:u w:val="single"/>
               </w:rPr>
               <w:t>5</w:t>
             </w:r>
@@ -8290,7 +7969,6 @@
                 <w:bCs/>
                 <w:sz w:val="24"/>
                 <w:szCs w:val="24"/>
-                <w:u w:val="single"/>
               </w:rPr>
               <w:t>}</w:t>
             </w:r>
@@ -9364,7 +9042,27 @@
                 <w:sz w:val="24"/>
                 <w:szCs w:val="24"/>
               </w:rPr>
-              <w:t>{dataAtual}</w:t>
+              <w:t>{</w:t>
+            </w:r>
+            <w:proofErr w:type="spellStart"/>
+            <w:r>
+              <w:rPr>
+                <w:rFonts w:ascii="Arial" w:hAnsi="Arial" w:cs="Arial"/>
+                <w:color w:val="000000" w:themeColor="text1"/>
+                <w:sz w:val="24"/>
+                <w:szCs w:val="24"/>
+              </w:rPr>
+              <w:t>dataAtual</w:t>
+            </w:r>
+            <w:proofErr w:type="spellEnd"/>
+            <w:r>
+              <w:rPr>
+                <w:rFonts w:ascii="Arial" w:hAnsi="Arial" w:cs="Arial"/>
+                <w:color w:val="000000" w:themeColor="text1"/>
+                <w:sz w:val="24"/>
+                <w:szCs w:val="24"/>
+              </w:rPr>
+              <w:t>}</w:t>
             </w:r>
           </w:p>
           <w:p>
@@ -9446,7 +9144,27 @@
                 <w:sz w:val="18"/>
                 <w:szCs w:val="18"/>
               </w:rPr>
-              <w:t>Nome: Marlei de Lima Nanya Felipe</w:t>
+              <w:t xml:space="preserve">Nome: Marlei de Lima </w:t>
+            </w:r>
+            <w:proofErr w:type="spellStart"/>
+            <w:r>
+              <w:rPr>
+                <w:rFonts w:ascii="Arial" w:hAnsi="Arial" w:cs="Arial"/>
+                <w:color w:val="000000" w:themeColor="text1"/>
+                <w:sz w:val="18"/>
+                <w:szCs w:val="18"/>
+              </w:rPr>
+              <w:t>Nanya</w:t>
+            </w:r>
+            <w:proofErr w:type="spellEnd"/>
+            <w:r>
+              <w:rPr>
+                <w:rFonts w:ascii="Arial" w:hAnsi="Arial" w:cs="Arial"/>
+                <w:color w:val="000000" w:themeColor="text1"/>
+                <w:sz w:val="18"/>
+                <w:szCs w:val="18"/>
+              </w:rPr>
+              <w:t xml:space="preserve"> Felipe</w:t>
             </w:r>
           </w:p>
           <w:p>

</xml_diff>